<commit_message>
Figure Building, and results section 8-8-2025
</commit_message>
<xml_diff>
--- a/ms/BoomBust_ms_v2nb.docx
+++ b/ms/BoomBust_ms_v2nb.docx
@@ -2490,71 +2490,15 @@
           <w:sz w:val="24"/>
           <w:szCs w:val="24"/>
         </w:rPr>
-        <w:t xml:space="preserve"> </w:t>
-      </w:r>
-      <w:commentRangeStart w:id="3"/>
-      <w:r>
-        <w:rPr>
-          <w:rFonts w:ascii="Times New Roman" w:eastAsia="Times New Roman" w:hAnsi="Times New Roman" w:cs="Times New Roman"/>
-          <w:sz w:val="24"/>
-          <w:szCs w:val="24"/>
-        </w:rPr>
-        <w:t xml:space="preserve">72 </w:t>
-      </w:r>
-      <w:r>
-        <w:rPr>
-          <w:rFonts w:ascii="Times New Roman" w:eastAsia="Times New Roman" w:hAnsi="Times New Roman" w:cs="Times New Roman"/>
-          <w:sz w:val="24"/>
-          <w:szCs w:val="24"/>
-        </w:rPr>
-        <w:t xml:space="preserve">relevant studies </w:t>
-      </w:r>
-      <w:commentRangeEnd w:id="3"/>
-      <w:r>
-        <w:rPr>
-          <w:rStyle w:val="CommentReference"/>
-        </w:rPr>
-        <w:commentReference w:id="3"/>
-      </w:r>
-      <w:r>
-        <w:rPr>
-          <w:rFonts w:ascii="Times New Roman" w:eastAsia="Times New Roman" w:hAnsi="Times New Roman" w:cs="Times New Roman"/>
-          <w:sz w:val="24"/>
-          <w:szCs w:val="24"/>
-        </w:rPr>
-        <w:t xml:space="preserve">were </w:t>
-      </w:r>
-      <w:r>
-        <w:rPr>
-          <w:rFonts w:ascii="Times New Roman" w:eastAsia="Times New Roman" w:hAnsi="Times New Roman" w:cs="Times New Roman"/>
-          <w:sz w:val="24"/>
-          <w:szCs w:val="24"/>
-        </w:rPr>
-        <w:t>scanned</w:t>
-      </w:r>
-      <w:r>
-        <w:rPr>
-          <w:rFonts w:ascii="Times New Roman" w:eastAsia="Times New Roman" w:hAnsi="Times New Roman" w:cs="Times New Roman"/>
-          <w:sz w:val="24"/>
-          <w:szCs w:val="24"/>
-        </w:rPr>
-        <w:t xml:space="preserve">, and 448 </w:t>
-      </w:r>
-      <w:r>
-        <w:rPr>
-          <w:rFonts w:ascii="Times New Roman" w:eastAsia="Times New Roman" w:hAnsi="Times New Roman" w:cs="Times New Roman"/>
-          <w:sz w:val="24"/>
-          <w:szCs w:val="24"/>
-        </w:rPr>
-        <w:t>time series were fou</w:t>
-      </w:r>
-      <w:r>
-        <w:rPr>
-          <w:rFonts w:ascii="Times New Roman" w:eastAsia="Times New Roman" w:hAnsi="Times New Roman" w:cs="Times New Roman"/>
-          <w:sz w:val="24"/>
-          <w:szCs w:val="24"/>
-        </w:rPr>
-        <w:t>nd. A time series was defined as any population metric sampled for at least 3 years. The</w:t>
+        <w:t xml:space="preserve"> were scanned to find time series</w:t>
+      </w:r>
+      <w:r>
+        <w:rPr>
+          <w:rFonts w:ascii="Times New Roman" w:eastAsia="Times New Roman" w:hAnsi="Times New Roman" w:cs="Times New Roman"/>
+          <w:sz w:val="24"/>
+          <w:szCs w:val="24"/>
+        </w:rPr>
+        <w:t>. A time series was defined as any population metric sampled for at least 3 years. The</w:t>
       </w:r>
       <w:r>
         <w:rPr>
@@ -2776,7 +2720,7 @@
           <w:sz w:val="24"/>
           <w:szCs w:val="24"/>
         </w:rPr>
-        <w:t xml:space="preserve">the survey frequence (i.e., yearly, monthly, twice a year, every two years, three times a year, weekly, every </w:t>
+        <w:t xml:space="preserve">the survey frequence (i.e., yearly, monthly, twice a year, every two years, three times a year, weekly, every two months), the </w:t>
       </w:r>
       <w:r>
         <w:rPr>
@@ -2785,7 +2729,7 @@
           <w:szCs w:val="24"/>
         </w:rPr>
         <w:lastRenderedPageBreak/>
-        <w:t>two months), the population metric (i.e., Annual Maximum Density, Biomass, Biovolume, Captures, CPUE, Density, Harvest, abundance, Percent Cover, Trap Success),</w:t>
+        <w:t>population metric (i.e., Annual Maximum Density, Biomass, Biovolume, Captures, CPUE, Density, Harvest, abundance, Percent Cover, Trap Success),</w:t>
       </w:r>
       <w:r>
         <w:rPr>
@@ -3147,7 +3091,7 @@
         </w:rPr>
         <w:t xml:space="preserve">), but when they were not found a literature search using the species name as one key word and “longevity” or “lifespan” as the other key word.  Longevity of a few taxa (e.g., species name, species name) have never been recorded, in these instances we used the life span of the nearest taxonomic relative as a proxy. A compiled list of the references used in obtaining longevity can be found in </w:t>
       </w:r>
-      <w:commentRangeStart w:id="4"/>
+      <w:commentRangeStart w:id="3"/>
       <w:r>
         <w:rPr>
           <w:rFonts w:ascii="Times New Roman" w:eastAsia="Times New Roman" w:hAnsi="Times New Roman" w:cs="Times New Roman"/>
@@ -3156,12 +3100,12 @@
         </w:rPr>
         <w:t>appendix ##</w:t>
       </w:r>
-      <w:commentRangeEnd w:id="4"/>
+      <w:commentRangeEnd w:id="3"/>
       <w:r>
         <w:rPr>
           <w:rStyle w:val="CommentReference"/>
         </w:rPr>
-        <w:commentReference w:id="4"/>
+        <w:commentReference w:id="3"/>
       </w:r>
       <w:r>
         <w:rPr>
@@ -4825,7 +4769,7 @@
         </w:rPr>
         <w:t xml:space="preserve">as described in </w:t>
       </w:r>
-      <w:commentRangeStart w:id="5"/>
+      <w:commentRangeStart w:id="4"/>
       <w:r>
         <w:rPr>
           <w:rFonts w:ascii="Times New Roman" w:eastAsia="Times New Roman" w:hAnsi="Times New Roman" w:cs="Times New Roman"/>
@@ -4842,12 +4786,12 @@
         </w:rPr>
         <w:t>Box 1</w:t>
       </w:r>
-      <w:commentRangeEnd w:id="5"/>
+      <w:commentRangeEnd w:id="4"/>
       <w:r>
         <w:rPr>
           <w:rStyle w:val="CommentReference"/>
         </w:rPr>
-        <w:commentReference w:id="5"/>
+        <w:commentReference w:id="4"/>
       </w:r>
       <w:r>
         <w:rPr>
@@ -5917,7 +5861,7 @@
         </w:rPr>
         <w:t xml:space="preserve">described in more detail in </w:t>
       </w:r>
-      <w:commentRangeStart w:id="6"/>
+      <w:commentRangeStart w:id="5"/>
       <w:r>
         <w:rPr>
           <w:rFonts w:ascii="Times New Roman" w:eastAsia="Times New Roman" w:hAnsi="Times New Roman" w:cs="Times New Roman"/>
@@ -5926,12 +5870,12 @@
         </w:rPr>
         <w:t>appendix X</w:t>
       </w:r>
-      <w:commentRangeEnd w:id="6"/>
+      <w:commentRangeEnd w:id="5"/>
       <w:r>
         <w:rPr>
           <w:rStyle w:val="CommentReference"/>
         </w:rPr>
-        <w:commentReference w:id="6"/>
+        <w:commentReference w:id="5"/>
       </w:r>
       <w:r>
         <w:rPr>
@@ -6051,7 +5995,7 @@
           <w:sz w:val="24"/>
           <w:szCs w:val="24"/>
         </w:rPr>
-        <w:t>Identification</w:t>
+        <w:t>Time Series Classification</w:t>
       </w:r>
     </w:p>
     <w:p>
@@ -6064,361 +6008,352 @@
           <w:szCs w:val="24"/>
         </w:rPr>
       </w:pPr>
-      <w:r>
-        <w:rPr>
-          <w:rFonts w:ascii="Times New Roman" w:eastAsia="Times New Roman" w:hAnsi="Times New Roman" w:cs="Times New Roman"/>
-          <w:sz w:val="24"/>
-          <w:szCs w:val="24"/>
-        </w:rPr>
-        <w:t xml:space="preserve">When identifying boom-busts cycles from my literature search, many of the time series I identified did not document the lag/growth phase (Creed &amp; Sheldon 1995; Newman &amp; Biesboer 2000; Strayer &amp; Malcom 2006; Caskey </w:t>
-      </w:r>
-      <w:r>
+      <w:commentRangeStart w:id="6"/>
+      <w:r>
+        <w:rPr>
+          <w:rFonts w:ascii="Times New Roman" w:eastAsia="Times New Roman" w:hAnsi="Times New Roman" w:cs="Times New Roman"/>
+          <w:sz w:val="24"/>
+          <w:szCs w:val="24"/>
+        </w:rPr>
+        <w:t xml:space="preserve">72 relevant studies </w:t>
+      </w:r>
+      <w:commentRangeEnd w:id="6"/>
+      <w:r>
+        <w:rPr>
+          <w:rStyle w:val="CommentReference"/>
+        </w:rPr>
+        <w:commentReference w:id="6"/>
+      </w:r>
+      <w:r>
+        <w:rPr>
+          <w:rFonts w:ascii="Times New Roman" w:eastAsia="Times New Roman" w:hAnsi="Times New Roman" w:cs="Times New Roman"/>
+          <w:sz w:val="24"/>
+          <w:szCs w:val="24"/>
+        </w:rPr>
+        <w:t xml:space="preserve">were scanned, and 448 </w:t>
+      </w:r>
+      <w:r>
+        <w:rPr>
+          <w:rFonts w:ascii="Times New Roman" w:eastAsia="Times New Roman" w:hAnsi="Times New Roman" w:cs="Times New Roman"/>
+          <w:sz w:val="24"/>
+          <w:szCs w:val="24"/>
+        </w:rPr>
+        <w:t>timeseries</w:t>
+      </w:r>
+      <w:r>
+        <w:rPr>
+          <w:rFonts w:ascii="Times New Roman" w:eastAsia="Times New Roman" w:hAnsi="Times New Roman" w:cs="Times New Roman"/>
+          <w:sz w:val="24"/>
+          <w:szCs w:val="24"/>
+        </w:rPr>
+        <w:t xml:space="preserve"> were found</w:t>
+      </w:r>
+      <w:r>
+        <w:rPr>
+          <w:rFonts w:ascii="Times New Roman" w:eastAsia="Times New Roman" w:hAnsi="Times New Roman" w:cs="Times New Roman"/>
+          <w:sz w:val="24"/>
+          <w:szCs w:val="24"/>
+        </w:rPr>
+        <w:t xml:space="preserve"> (Figure 2)</w:t>
+      </w:r>
+      <w:r>
+        <w:rPr>
+          <w:rFonts w:ascii="Times New Roman" w:eastAsia="Times New Roman" w:hAnsi="Times New Roman" w:cs="Times New Roman"/>
+          <w:sz w:val="24"/>
+          <w:szCs w:val="24"/>
+        </w:rPr>
+        <w:t>. A</w:t>
+      </w:r>
+      <w:r>
+        <w:rPr>
+          <w:rFonts w:ascii="Times New Roman" w:eastAsia="Times New Roman" w:hAnsi="Times New Roman" w:cs="Times New Roman"/>
+          <w:sz w:val="24"/>
+          <w:szCs w:val="24"/>
+        </w:rPr>
+        <w:t xml:space="preserve"> full list of these studies and </w:t>
+      </w:r>
+      <w:r>
+        <w:rPr>
+          <w:rFonts w:ascii="Times New Roman" w:eastAsia="Times New Roman" w:hAnsi="Times New Roman" w:cs="Times New Roman"/>
+          <w:sz w:val="24"/>
+          <w:szCs w:val="24"/>
+        </w:rPr>
+        <w:t>plots for the</w:t>
+      </w:r>
+      <w:r>
+        <w:rPr>
+          <w:rFonts w:ascii="Times New Roman" w:eastAsia="Times New Roman" w:hAnsi="Times New Roman" w:cs="Times New Roman"/>
+          <w:sz w:val="24"/>
+          <w:szCs w:val="24"/>
+        </w:rPr>
+        <w:t xml:space="preserve"> time series are included in the </w:t>
+      </w:r>
+      <w:commentRangeStart w:id="7"/>
+      <w:r>
+        <w:rPr>
+          <w:rFonts w:ascii="Times New Roman" w:eastAsia="Times New Roman" w:hAnsi="Times New Roman" w:cs="Times New Roman"/>
+          <w:sz w:val="24"/>
+          <w:szCs w:val="24"/>
+        </w:rPr>
+        <w:t>Appendix XXX</w:t>
+      </w:r>
+      <w:commentRangeEnd w:id="7"/>
+      <w:r>
+        <w:rPr>
+          <w:rStyle w:val="CommentReference"/>
+        </w:rPr>
+        <w:commentReference w:id="7"/>
+      </w:r>
+      <w:r>
+        <w:rPr>
+          <w:rFonts w:ascii="Times New Roman" w:eastAsia="Times New Roman" w:hAnsi="Times New Roman" w:cs="Times New Roman"/>
+          <w:sz w:val="24"/>
+          <w:szCs w:val="24"/>
+        </w:rPr>
+        <w:t xml:space="preserve">.  </w:t>
+      </w:r>
+      <w:r>
+        <w:rPr>
+          <w:rFonts w:ascii="Times New Roman" w:eastAsia="Times New Roman" w:hAnsi="Times New Roman" w:cs="Times New Roman"/>
+          <w:sz w:val="24"/>
+          <w:szCs w:val="24"/>
+        </w:rPr>
+        <w:t>256 of these 448 timeseries were excluded because they were too short, were incomplete, or data</w:t>
+      </w:r>
+      <w:r>
+        <w:rPr>
+          <w:rFonts w:ascii="Times New Roman" w:eastAsia="Times New Roman" w:hAnsi="Times New Roman" w:cs="Times New Roman"/>
+          <w:sz w:val="24"/>
+          <w:szCs w:val="24"/>
+        </w:rPr>
+        <w:t xml:space="preserve"> were</w:t>
+      </w:r>
+      <w:r>
+        <w:rPr>
+          <w:rFonts w:ascii="Times New Roman" w:eastAsia="Times New Roman" w:hAnsi="Times New Roman" w:cs="Times New Roman"/>
+          <w:sz w:val="24"/>
+          <w:szCs w:val="24"/>
+        </w:rPr>
+        <w:t xml:space="preserve"> obtained through harvest</w:t>
+      </w:r>
+      <w:r>
+        <w:rPr>
+          <w:rFonts w:ascii="Times New Roman" w:eastAsia="Times New Roman" w:hAnsi="Times New Roman" w:cs="Times New Roman"/>
+          <w:sz w:val="24"/>
+          <w:szCs w:val="24"/>
+        </w:rPr>
+        <w:t xml:space="preserve"> (Figure 2)</w:t>
+      </w:r>
+      <w:r>
+        <w:rPr>
+          <w:rFonts w:ascii="Times New Roman" w:eastAsia="Times New Roman" w:hAnsi="Times New Roman" w:cs="Times New Roman"/>
+          <w:sz w:val="24"/>
+          <w:szCs w:val="24"/>
+        </w:rPr>
+        <w:t xml:space="preserve">.  </w:t>
+      </w:r>
+      <w:r>
+        <w:rPr>
+          <w:rFonts w:ascii="Times New Roman" w:eastAsia="Times New Roman" w:hAnsi="Times New Roman" w:cs="Times New Roman"/>
+          <w:sz w:val="24"/>
+          <w:szCs w:val="24"/>
+        </w:rPr>
+        <w:t>Of</w:t>
+      </w:r>
+      <w:r>
+        <w:rPr>
+          <w:rFonts w:ascii="Times New Roman" w:eastAsia="Times New Roman" w:hAnsi="Times New Roman" w:cs="Times New Roman"/>
+          <w:sz w:val="24"/>
+          <w:szCs w:val="24"/>
+        </w:rPr>
+        <w:t xml:space="preserve"> the </w:t>
+      </w:r>
+      <w:r>
+        <w:rPr>
+          <w:rFonts w:ascii="Times New Roman" w:eastAsia="Times New Roman" w:hAnsi="Times New Roman" w:cs="Times New Roman"/>
+          <w:sz w:val="24"/>
+          <w:szCs w:val="24"/>
+        </w:rPr>
+        <w:t>192-time</w:t>
+      </w:r>
+      <w:r>
+        <w:rPr>
+          <w:rFonts w:ascii="Times New Roman" w:eastAsia="Times New Roman" w:hAnsi="Times New Roman" w:cs="Times New Roman"/>
+          <w:sz w:val="24"/>
+          <w:szCs w:val="24"/>
+        </w:rPr>
+        <w:t xml:space="preserve"> series that met the </w:t>
+      </w:r>
+      <w:r>
+        <w:rPr>
+          <w:rFonts w:ascii="Times New Roman" w:eastAsia="Times New Roman" w:hAnsi="Times New Roman" w:cs="Times New Roman"/>
+          <w:sz w:val="24"/>
+          <w:szCs w:val="24"/>
+        </w:rPr>
+        <w:t xml:space="preserve">inclusion criteria, regime shifts were not detected in 30 of the time series (Figure 2). </w:t>
+      </w:r>
+      <w:r>
+        <w:rPr>
+          <w:rFonts w:ascii="Times New Roman" w:eastAsia="Times New Roman" w:hAnsi="Times New Roman" w:cs="Times New Roman"/>
+          <w:sz w:val="24"/>
+          <w:szCs w:val="24"/>
+        </w:rPr>
+        <w:t xml:space="preserve">From the 162 regime shifts that remained, 102 has some evidence of a boom-bust, 35 were classified as overshoot dynamics, and 25 of the </w:t>
+      </w:r>
+      <w:r>
+        <w:rPr>
+          <w:rFonts w:ascii="Times New Roman" w:eastAsia="Times New Roman" w:hAnsi="Times New Roman" w:cs="Times New Roman"/>
+          <w:sz w:val="24"/>
+          <w:szCs w:val="24"/>
+        </w:rPr>
+        <w:lastRenderedPageBreak/>
+        <w:t xml:space="preserve">time series were of </w:t>
+      </w:r>
+      <w:r>
+        <w:rPr>
+          <w:rFonts w:ascii="Times New Roman" w:eastAsia="Times New Roman" w:hAnsi="Times New Roman" w:cs="Times New Roman"/>
+          <w:sz w:val="24"/>
+          <w:szCs w:val="24"/>
+        </w:rPr>
+        <w:t>considered established populations</w:t>
+      </w:r>
+      <w:r>
+        <w:rPr>
+          <w:rFonts w:ascii="Times New Roman" w:eastAsia="Times New Roman" w:hAnsi="Times New Roman" w:cs="Times New Roman"/>
+          <w:sz w:val="24"/>
+          <w:szCs w:val="24"/>
+        </w:rPr>
+        <w:t xml:space="preserve">.  </w:t>
+      </w:r>
+      <w:r>
+        <w:rPr>
+          <w:rFonts w:ascii="Times New Roman" w:eastAsia="Times New Roman" w:hAnsi="Times New Roman" w:cs="Times New Roman"/>
+          <w:sz w:val="24"/>
+          <w:szCs w:val="24"/>
+        </w:rPr>
+        <w:t>Of the 102-time series that had some evidence for a boom-bust, 37 met the full definition of a boom-bust</w:t>
+      </w:r>
+      <w:r>
+        <w:rPr>
+          <w:rFonts w:ascii="Times New Roman" w:eastAsia="Times New Roman" w:hAnsi="Times New Roman" w:cs="Times New Roman"/>
+          <w:sz w:val="24"/>
+          <w:szCs w:val="24"/>
+        </w:rPr>
+        <w:t xml:space="preserve"> (i.e., the best evidence), 28 </w:t>
+      </w:r>
+      <w:r>
+        <w:rPr>
+          <w:rFonts w:ascii="Times New Roman" w:eastAsia="Times New Roman" w:hAnsi="Times New Roman" w:cs="Times New Roman"/>
+          <w:sz w:val="24"/>
+          <w:szCs w:val="24"/>
+        </w:rPr>
+        <w:t>met the full definition but did</w:t>
+      </w:r>
+      <w:r>
+        <w:rPr>
+          <w:rFonts w:ascii="Times New Roman" w:eastAsia="Times New Roman" w:hAnsi="Times New Roman" w:cs="Times New Roman"/>
+          <w:sz w:val="24"/>
+          <w:szCs w:val="24"/>
+        </w:rPr>
+        <w:t xml:space="preserve"> not</w:t>
+      </w:r>
+      <w:r>
+        <w:rPr>
+          <w:rFonts w:ascii="Times New Roman" w:eastAsia="Times New Roman" w:hAnsi="Times New Roman" w:cs="Times New Roman"/>
+          <w:sz w:val="24"/>
+          <w:szCs w:val="24"/>
+        </w:rPr>
+        <w:t xml:space="preserve"> include enough survey</w:t>
+      </w:r>
+      <w:r>
+        <w:rPr>
+          <w:rFonts w:ascii="Times New Roman" w:eastAsia="Times New Roman" w:hAnsi="Times New Roman" w:cs="Times New Roman"/>
+          <w:sz w:val="24"/>
+          <w:szCs w:val="24"/>
+        </w:rPr>
+        <w:t>s</w:t>
+      </w:r>
+      <w:r>
+        <w:rPr>
+          <w:rFonts w:ascii="Times New Roman" w:eastAsia="Times New Roman" w:hAnsi="Times New Roman" w:cs="Times New Roman"/>
+          <w:sz w:val="24"/>
+          <w:szCs w:val="24"/>
+        </w:rPr>
+        <w:t xml:space="preserve"> to determine if declines were sustained for ≥ 3 years, 35 met the definition of</w:t>
+      </w:r>
+      <w:r>
+        <w:rPr>
+          <w:rFonts w:ascii="Times New Roman" w:eastAsia="Times New Roman" w:hAnsi="Times New Roman" w:cs="Times New Roman"/>
+          <w:sz w:val="24"/>
+          <w:szCs w:val="24"/>
+        </w:rPr>
+        <w:t xml:space="preserve"> </w:t>
+      </w:r>
+      <w:r>
+        <w:rPr>
+          <w:rFonts w:ascii="Times New Roman" w:eastAsia="Times New Roman" w:hAnsi="Times New Roman" w:cs="Times New Roman"/>
+          <w:sz w:val="24"/>
+          <w:szCs w:val="24"/>
+        </w:rPr>
+        <w:t xml:space="preserve">bust but did not present data documenting the rate of population increase, and 2 </w:t>
+      </w:r>
+      <w:r>
+        <w:rPr>
+          <w:rFonts w:ascii="Times New Roman" w:eastAsia="Times New Roman" w:hAnsi="Times New Roman" w:cs="Times New Roman"/>
+          <w:sz w:val="24"/>
+          <w:szCs w:val="24"/>
+        </w:rPr>
+        <w:t>had declines ≥ 90% but did not have data documenting whether the sustained nor did they have data documenting the rate of population increase</w:t>
+      </w:r>
+      <w:r>
+        <w:rPr>
+          <w:rFonts w:ascii="Times New Roman" w:eastAsia="Times New Roman" w:hAnsi="Times New Roman" w:cs="Times New Roman"/>
+          <w:sz w:val="24"/>
+          <w:szCs w:val="24"/>
+        </w:rPr>
+        <w:t xml:space="preserve"> (Figure 2).</w:t>
+      </w:r>
+    </w:p>
+    <w:p>
+      <w:pPr>
+        <w:spacing w:line="480" w:lineRule="auto"/>
         <w:rPr>
           <w:rFonts w:ascii="Times New Roman" w:eastAsia="Times New Roman" w:hAnsi="Times New Roman" w:cs="Times New Roman"/>
           <w:i/>
-          <w:sz w:val="24"/>
-          <w:szCs w:val="24"/>
-        </w:rPr>
-        <w:t>et al.</w:t>
-      </w:r>
-      <w:r>
-        <w:rPr>
-          <w:rFonts w:ascii="Times New Roman" w:eastAsia="Times New Roman" w:hAnsi="Times New Roman" w:cs="Times New Roman"/>
-          <w:sz w:val="24"/>
-          <w:szCs w:val="24"/>
-        </w:rPr>
-        <w:t xml:space="preserve"> 2007; Carbayo </w:t>
-      </w:r>
+          <w:iCs/>
+          <w:sz w:val="24"/>
+          <w:szCs w:val="24"/>
+        </w:rPr>
+      </w:pPr>
       <w:r>
         <w:rPr>
           <w:rFonts w:ascii="Times New Roman" w:eastAsia="Times New Roman" w:hAnsi="Times New Roman" w:cs="Times New Roman"/>
           <w:i/>
-          <w:sz w:val="24"/>
-          <w:szCs w:val="24"/>
-        </w:rPr>
-        <w:t>et al.</w:t>
-      </w:r>
-      <w:r>
-        <w:rPr>
-          <w:rFonts w:ascii="Times New Roman" w:eastAsia="Times New Roman" w:hAnsi="Times New Roman" w:cs="Times New Roman"/>
-          <w:sz w:val="24"/>
-          <w:szCs w:val="24"/>
-        </w:rPr>
-        <w:t xml:space="preserve"> 2008; Kurihara </w:t>
+          <w:iCs/>
+          <w:sz w:val="24"/>
+          <w:szCs w:val="24"/>
+        </w:rPr>
+        <w:t>Geographic and Taxonomic</w:t>
       </w:r>
       <w:r>
         <w:rPr>
           <w:rFonts w:ascii="Times New Roman" w:eastAsia="Times New Roman" w:hAnsi="Times New Roman" w:cs="Times New Roman"/>
           <w:i/>
-          <w:sz w:val="24"/>
-          <w:szCs w:val="24"/>
-        </w:rPr>
-        <w:t>et al.</w:t>
-      </w:r>
-      <w:r>
-        <w:rPr>
-          <w:rFonts w:ascii="Times New Roman" w:eastAsia="Times New Roman" w:hAnsi="Times New Roman" w:cs="Times New Roman"/>
-          <w:sz w:val="24"/>
-          <w:szCs w:val="24"/>
-        </w:rPr>
-        <w:t xml:space="preserve"> 2010; Dunlop &amp; Riley 2013; McCallum </w:t>
+          <w:iCs/>
+          <w:sz w:val="24"/>
+          <w:szCs w:val="24"/>
+        </w:rPr>
+        <w:t xml:space="preserve"> Characteristics of Boom-Bust</w:t>
       </w:r>
       <w:r>
         <w:rPr>
           <w:rFonts w:ascii="Times New Roman" w:eastAsia="Times New Roman" w:hAnsi="Times New Roman" w:cs="Times New Roman"/>
           <w:i/>
-          <w:sz w:val="24"/>
-          <w:szCs w:val="24"/>
-        </w:rPr>
-        <w:t>et al.</w:t>
-      </w:r>
-      <w:r>
-        <w:rPr>
-          <w:rFonts w:ascii="Times New Roman" w:eastAsia="Times New Roman" w:hAnsi="Times New Roman" w:cs="Times New Roman"/>
-          <w:sz w:val="24"/>
-          <w:szCs w:val="24"/>
-        </w:rPr>
-        <w:t xml:space="preserve"> 2014; Cooling &amp; Hoffmann 2015; Dexter </w:t>
-      </w:r>
-      <w:r>
-        <w:rPr>
-          <w:rFonts w:ascii="Times New Roman" w:eastAsia="Times New Roman" w:hAnsi="Times New Roman" w:cs="Times New Roman"/>
-          <w:i/>
-          <w:sz w:val="24"/>
-          <w:szCs w:val="24"/>
-        </w:rPr>
-        <w:t>et al.</w:t>
-      </w:r>
-      <w:r>
-        <w:rPr>
-          <w:rFonts w:ascii="Times New Roman" w:eastAsia="Times New Roman" w:hAnsi="Times New Roman" w:cs="Times New Roman"/>
-          <w:sz w:val="24"/>
-          <w:szCs w:val="24"/>
-        </w:rPr>
-        <w:t xml:space="preserve"> 2015; Gibson-Reinemer </w:t>
-      </w:r>
-      <w:r>
-        <w:rPr>
-          <w:rFonts w:ascii="Times New Roman" w:eastAsia="Times New Roman" w:hAnsi="Times New Roman" w:cs="Times New Roman"/>
-          <w:i/>
-          <w:sz w:val="24"/>
-          <w:szCs w:val="24"/>
-        </w:rPr>
-        <w:t>et al.</w:t>
-      </w:r>
-      <w:r>
-        <w:rPr>
-          <w:rFonts w:ascii="Times New Roman" w:eastAsia="Times New Roman" w:hAnsi="Times New Roman" w:cs="Times New Roman"/>
-          <w:sz w:val="24"/>
-          <w:szCs w:val="24"/>
-        </w:rPr>
-        <w:t xml:space="preserve"> 2017; Lester </w:t>
-      </w:r>
-      <w:r>
-        <w:rPr>
-          <w:rFonts w:ascii="Times New Roman" w:eastAsia="Times New Roman" w:hAnsi="Times New Roman" w:cs="Times New Roman"/>
-          <w:i/>
-          <w:sz w:val="24"/>
-          <w:szCs w:val="24"/>
-        </w:rPr>
-        <w:t>et al.</w:t>
-      </w:r>
-      <w:r>
-        <w:rPr>
-          <w:rFonts w:ascii="Times New Roman" w:eastAsia="Times New Roman" w:hAnsi="Times New Roman" w:cs="Times New Roman"/>
-          <w:sz w:val="24"/>
-          <w:szCs w:val="24"/>
-        </w:rPr>
-        <w:t xml:space="preserve"> 2017; Castañeda </w:t>
-      </w:r>
-      <w:r>
-        <w:rPr>
-          <w:rFonts w:ascii="Times New Roman" w:eastAsia="Times New Roman" w:hAnsi="Times New Roman" w:cs="Times New Roman"/>
-          <w:i/>
-          <w:sz w:val="24"/>
-          <w:szCs w:val="24"/>
-        </w:rPr>
-        <w:t>et al.</w:t>
-      </w:r>
-      <w:r>
-        <w:rPr>
-          <w:rFonts w:ascii="Times New Roman" w:eastAsia="Times New Roman" w:hAnsi="Times New Roman" w:cs="Times New Roman"/>
-          <w:sz w:val="24"/>
-          <w:szCs w:val="24"/>
-        </w:rPr>
-        <w:t xml:space="preserve"> 2018; Jaćimović </w:t>
-      </w:r>
-      <w:r>
-        <w:rPr>
-          <w:rFonts w:ascii="Times New Roman" w:eastAsia="Times New Roman" w:hAnsi="Times New Roman" w:cs="Times New Roman"/>
-          <w:i/>
-          <w:sz w:val="24"/>
-          <w:szCs w:val="24"/>
-        </w:rPr>
-        <w:t>et al.</w:t>
-      </w:r>
-      <w:r>
-        <w:rPr>
-          <w:rFonts w:ascii="Times New Roman" w:eastAsia="Times New Roman" w:hAnsi="Times New Roman" w:cs="Times New Roman"/>
-          <w:sz w:val="24"/>
-          <w:szCs w:val="24"/>
-        </w:rPr>
-        <w:t xml:space="preserve"> 2019; Wegner </w:t>
-      </w:r>
-      <w:r>
-        <w:rPr>
-          <w:rFonts w:ascii="Times New Roman" w:eastAsia="Times New Roman" w:hAnsi="Times New Roman" w:cs="Times New Roman"/>
-          <w:i/>
-          <w:sz w:val="24"/>
-          <w:szCs w:val="24"/>
-        </w:rPr>
-        <w:t>et al.</w:t>
-      </w:r>
-      <w:r>
-        <w:rPr>
-          <w:rFonts w:ascii="Times New Roman" w:eastAsia="Times New Roman" w:hAnsi="Times New Roman" w:cs="Times New Roman"/>
-          <w:sz w:val="24"/>
-          <w:szCs w:val="24"/>
-        </w:rPr>
-        <w:t xml:space="preserve"> 2019; Wasson </w:t>
-      </w:r>
-      <w:r>
-        <w:rPr>
-          <w:rFonts w:ascii="Times New Roman" w:eastAsia="Times New Roman" w:hAnsi="Times New Roman" w:cs="Times New Roman"/>
-          <w:i/>
-          <w:sz w:val="24"/>
-          <w:szCs w:val="24"/>
-        </w:rPr>
-        <w:t>et al.</w:t>
-      </w:r>
-      <w:r>
-        <w:rPr>
-          <w:rFonts w:ascii="Times New Roman" w:eastAsia="Times New Roman" w:hAnsi="Times New Roman" w:cs="Times New Roman"/>
-          <w:sz w:val="24"/>
-          <w:szCs w:val="24"/>
-        </w:rPr>
-        <w:t xml:space="preserve"> 2020), so these studies cannot be classified as boom-bust </w:t>
-      </w:r>
-      <w:r>
-        <w:rPr>
-          <w:rFonts w:ascii="Times New Roman" w:eastAsia="Times New Roman" w:hAnsi="Times New Roman" w:cs="Times New Roman"/>
-          <w:sz w:val="24"/>
-          <w:szCs w:val="24"/>
-        </w:rPr>
-        <w:lastRenderedPageBreak/>
-        <w:t xml:space="preserve">cycles.  Interestingly, in a few of these studies, population abundances fluctuated similar to cyclic populations which could mean that cyclic populations are possible in established population of non-natives (Strayer &amp; Malcom 2006; Lester </w:t>
-      </w:r>
-      <w:r>
-        <w:rPr>
-          <w:rFonts w:ascii="Times New Roman" w:eastAsia="Times New Roman" w:hAnsi="Times New Roman" w:cs="Times New Roman"/>
-          <w:i/>
-          <w:sz w:val="24"/>
-          <w:szCs w:val="24"/>
-        </w:rPr>
-        <w:t>et al.</w:t>
-      </w:r>
-      <w:r>
-        <w:rPr>
-          <w:rFonts w:ascii="Times New Roman" w:eastAsia="Times New Roman" w:hAnsi="Times New Roman" w:cs="Times New Roman"/>
-          <w:sz w:val="24"/>
-          <w:szCs w:val="24"/>
-        </w:rPr>
-        <w:t xml:space="preserve"> 2017).  Many of the other</w:t>
-      </w:r>
-      <w:r>
-        <w:rPr>
-          <w:rFonts w:ascii="Times New Roman" w:eastAsia="Gungsuh" w:hAnsi="Times New Roman" w:cs="Times New Roman"/>
-          <w:sz w:val="24"/>
-          <w:szCs w:val="24"/>
-        </w:rPr>
-        <w:t xml:space="preserve"> studies with no documentation of the lag/growth phase reported severe (≥ 90%) declines </w:t>
-      </w:r>
-      <w:r>
-        <w:rPr>
-          <w:rFonts w:ascii="Times New Roman" w:eastAsia="Times New Roman" w:hAnsi="Times New Roman" w:cs="Times New Roman"/>
-          <w:sz w:val="24"/>
-          <w:szCs w:val="24"/>
-        </w:rPr>
-        <w:t xml:space="preserve">(Creed &amp; Sheldon 1995; Newman &amp; Biesboer 2000; Caskey </w:t>
-      </w:r>
-      <w:r>
-        <w:rPr>
-          <w:rFonts w:ascii="Times New Roman" w:eastAsia="Times New Roman" w:hAnsi="Times New Roman" w:cs="Times New Roman"/>
-          <w:i/>
-          <w:sz w:val="24"/>
-          <w:szCs w:val="24"/>
-        </w:rPr>
-        <w:t>et al.</w:t>
-      </w:r>
-      <w:r>
-        <w:rPr>
-          <w:rFonts w:ascii="Times New Roman" w:eastAsia="Times New Roman" w:hAnsi="Times New Roman" w:cs="Times New Roman"/>
-          <w:sz w:val="24"/>
-          <w:szCs w:val="24"/>
-        </w:rPr>
-        <w:t xml:space="preserve"> 2007; Carbayo </w:t>
-      </w:r>
-      <w:r>
-        <w:rPr>
-          <w:rFonts w:ascii="Times New Roman" w:eastAsia="Times New Roman" w:hAnsi="Times New Roman" w:cs="Times New Roman"/>
-          <w:i/>
-          <w:sz w:val="24"/>
-          <w:szCs w:val="24"/>
-        </w:rPr>
-        <w:t>et al.</w:t>
-      </w:r>
-      <w:r>
-        <w:rPr>
-          <w:rFonts w:ascii="Times New Roman" w:eastAsia="Times New Roman" w:hAnsi="Times New Roman" w:cs="Times New Roman"/>
-          <w:sz w:val="24"/>
-          <w:szCs w:val="24"/>
-        </w:rPr>
-        <w:t xml:space="preserve"> 2008; Cooling &amp; Hoffmann 2015; Gibson-Reinemer </w:t>
-      </w:r>
-      <w:r>
-        <w:rPr>
-          <w:rFonts w:ascii="Times New Roman" w:eastAsia="Times New Roman" w:hAnsi="Times New Roman" w:cs="Times New Roman"/>
-          <w:i/>
-          <w:sz w:val="24"/>
-          <w:szCs w:val="24"/>
-        </w:rPr>
-        <w:t>et al.</w:t>
-      </w:r>
-      <w:r>
-        <w:rPr>
-          <w:rFonts w:ascii="Times New Roman" w:eastAsia="Times New Roman" w:hAnsi="Times New Roman" w:cs="Times New Roman"/>
-          <w:sz w:val="24"/>
-          <w:szCs w:val="24"/>
-        </w:rPr>
-        <w:t xml:space="preserve"> 2017; Castañeda </w:t>
-      </w:r>
-      <w:r>
-        <w:rPr>
-          <w:rFonts w:ascii="Times New Roman" w:eastAsia="Times New Roman" w:hAnsi="Times New Roman" w:cs="Times New Roman"/>
-          <w:i/>
-          <w:sz w:val="24"/>
-          <w:szCs w:val="24"/>
-        </w:rPr>
-        <w:t>et al.</w:t>
-      </w:r>
-      <w:r>
-        <w:rPr>
-          <w:rFonts w:ascii="Times New Roman" w:eastAsia="Times New Roman" w:hAnsi="Times New Roman" w:cs="Times New Roman"/>
-          <w:sz w:val="24"/>
-          <w:szCs w:val="24"/>
-        </w:rPr>
-        <w:t xml:space="preserve"> 2018).  This suggests that declines after reaching high abundances is relatively common in invasive species.  Studies that had no documentation of the lag/growth phase also tended to have shorter time series (&lt;10 years) and often would include only one survey was documenting declines (except; Carbayo </w:t>
-      </w:r>
-      <w:r>
-        <w:rPr>
-          <w:rFonts w:ascii="Times New Roman" w:eastAsia="Times New Roman" w:hAnsi="Times New Roman" w:cs="Times New Roman"/>
-          <w:i/>
-          <w:sz w:val="24"/>
-          <w:szCs w:val="24"/>
-        </w:rPr>
-        <w:t>et al.</w:t>
-      </w:r>
-      <w:r>
-        <w:rPr>
-          <w:rFonts w:ascii="Times New Roman" w:eastAsia="Times New Roman" w:hAnsi="Times New Roman" w:cs="Times New Roman"/>
-          <w:sz w:val="24"/>
-          <w:szCs w:val="24"/>
-        </w:rPr>
-        <w:t xml:space="preserve"> 2008; Dunlop &amp; Riley 2013; Dexter </w:t>
-      </w:r>
-      <w:r>
-        <w:rPr>
-          <w:rFonts w:ascii="Times New Roman" w:eastAsia="Times New Roman" w:hAnsi="Times New Roman" w:cs="Times New Roman"/>
-          <w:i/>
-          <w:sz w:val="24"/>
-          <w:szCs w:val="24"/>
-        </w:rPr>
-        <w:t>et al.</w:t>
-      </w:r>
-      <w:r>
-        <w:rPr>
-          <w:rFonts w:ascii="Times New Roman" w:eastAsia="Times New Roman" w:hAnsi="Times New Roman" w:cs="Times New Roman"/>
-          <w:sz w:val="24"/>
-          <w:szCs w:val="24"/>
-        </w:rPr>
-        <w:t xml:space="preserve"> 2015; Gibson-Reinemer </w:t>
-      </w:r>
-      <w:r>
-        <w:rPr>
-          <w:rFonts w:ascii="Times New Roman" w:eastAsia="Times New Roman" w:hAnsi="Times New Roman" w:cs="Times New Roman"/>
-          <w:i/>
-          <w:sz w:val="24"/>
-          <w:szCs w:val="24"/>
-        </w:rPr>
-        <w:t>et al.</w:t>
-      </w:r>
-      <w:r>
-        <w:rPr>
-          <w:rFonts w:ascii="Times New Roman" w:eastAsia="Times New Roman" w:hAnsi="Times New Roman" w:cs="Times New Roman"/>
-          <w:sz w:val="24"/>
-          <w:szCs w:val="24"/>
-        </w:rPr>
-        <w:t xml:space="preserve"> 2017). Shorter time series with fewer studies in the bust phase may overestimate bust like declines. </w:t>
+          <w:iCs/>
+          <w:sz w:val="24"/>
+          <w:szCs w:val="24"/>
+        </w:rPr>
+        <w:t>s</w:t>
       </w:r>
     </w:p>
     <w:p>
@@ -6437,253 +6372,1052 @@
           <w:sz w:val="24"/>
           <w:szCs w:val="24"/>
         </w:rPr>
-        <w:t xml:space="preserve">In contrast to these studies, a substantial number of studies that had documented the lag/growth phase did not exhibit sustained declines (Diederich </w:t>
+        <w:t xml:space="preserve">The number of times series with some evidence of </w:t>
+      </w:r>
+      <w:r>
+        <w:rPr>
+          <w:rFonts w:ascii="Times New Roman" w:eastAsia="Times New Roman" w:hAnsi="Times New Roman" w:cs="Times New Roman"/>
+          <w:sz w:val="24"/>
+          <w:szCs w:val="24"/>
+        </w:rPr>
+        <w:t>boom-b</w:t>
+      </w:r>
+      <w:r>
+        <w:rPr>
+          <w:rFonts w:ascii="Times New Roman" w:eastAsia="Times New Roman" w:hAnsi="Times New Roman" w:cs="Times New Roman"/>
+          <w:sz w:val="24"/>
+          <w:szCs w:val="24"/>
+        </w:rPr>
+        <w:t>ust</w:t>
+      </w:r>
+      <w:r>
+        <w:rPr>
+          <w:rFonts w:ascii="Times New Roman" w:eastAsia="Times New Roman" w:hAnsi="Times New Roman" w:cs="Times New Roman"/>
+          <w:sz w:val="24"/>
+          <w:szCs w:val="24"/>
+        </w:rPr>
+        <w:t>s varied across continents</w:t>
+      </w:r>
+      <w:r>
+        <w:rPr>
+          <w:rFonts w:ascii="Times New Roman" w:eastAsia="Times New Roman" w:hAnsi="Times New Roman" w:cs="Times New Roman"/>
+          <w:sz w:val="24"/>
+          <w:szCs w:val="24"/>
+        </w:rPr>
+        <w:t>, taxonomic groups</w:t>
+      </w:r>
+      <w:r>
+        <w:rPr>
+          <w:rFonts w:ascii="Times New Roman" w:eastAsia="Times New Roman" w:hAnsi="Times New Roman" w:cs="Times New Roman"/>
+          <w:sz w:val="24"/>
+          <w:szCs w:val="24"/>
+        </w:rPr>
+        <w:t xml:space="preserve">, </w:t>
+      </w:r>
+      <w:r>
+        <w:rPr>
+          <w:rFonts w:ascii="Times New Roman" w:eastAsia="Times New Roman" w:hAnsi="Times New Roman" w:cs="Times New Roman"/>
+          <w:sz w:val="24"/>
+          <w:szCs w:val="24"/>
+        </w:rPr>
+        <w:t>systems</w:t>
+      </w:r>
+      <w:r>
+        <w:rPr>
+          <w:rFonts w:ascii="Times New Roman" w:eastAsia="Times New Roman" w:hAnsi="Times New Roman" w:cs="Times New Roman"/>
+          <w:sz w:val="24"/>
+          <w:szCs w:val="24"/>
+        </w:rPr>
+        <w:t xml:space="preserve"> and longevity</w:t>
+      </w:r>
+      <w:r>
+        <w:rPr>
+          <w:rFonts w:ascii="Times New Roman" w:eastAsia="Times New Roman" w:hAnsi="Times New Roman" w:cs="Times New Roman"/>
+          <w:sz w:val="24"/>
+          <w:szCs w:val="24"/>
+        </w:rPr>
+        <w:t xml:space="preserve">. </w:t>
+      </w:r>
+      <w:r>
+        <w:rPr>
+          <w:rFonts w:ascii="Times New Roman" w:eastAsia="Times New Roman" w:hAnsi="Times New Roman" w:cs="Times New Roman"/>
+          <w:sz w:val="24"/>
+          <w:szCs w:val="24"/>
+        </w:rPr>
+        <w:t xml:space="preserve">Europe and North America tied for the most </w:t>
+      </w:r>
+      <w:r>
+        <w:rPr>
+          <w:rFonts w:ascii="Times New Roman" w:eastAsia="Times New Roman" w:hAnsi="Times New Roman" w:cs="Times New Roman"/>
+          <w:sz w:val="24"/>
+          <w:szCs w:val="24"/>
+        </w:rPr>
+        <w:t>time series</w:t>
+      </w:r>
+      <w:r>
+        <w:rPr>
+          <w:rFonts w:ascii="Times New Roman" w:eastAsia="Times New Roman" w:hAnsi="Times New Roman" w:cs="Times New Roman"/>
+          <w:sz w:val="24"/>
+          <w:szCs w:val="24"/>
+        </w:rPr>
+        <w:t xml:space="preserve"> documenting boom-busts</w:t>
+      </w:r>
+      <w:r>
+        <w:rPr>
+          <w:rFonts w:ascii="Times New Roman" w:eastAsia="Times New Roman" w:hAnsi="Times New Roman" w:cs="Times New Roman"/>
+          <w:sz w:val="24"/>
+          <w:szCs w:val="24"/>
+        </w:rPr>
+        <w:t>, i</w:t>
+      </w:r>
+      <w:r>
+        <w:rPr>
+          <w:rFonts w:ascii="Times New Roman" w:eastAsia="Times New Roman" w:hAnsi="Times New Roman" w:cs="Times New Roman"/>
+          <w:sz w:val="24"/>
+          <w:szCs w:val="24"/>
+        </w:rPr>
+        <w:t xml:space="preserve">slands (i.e., Oceania) </w:t>
+      </w:r>
+      <w:r>
+        <w:rPr>
+          <w:rFonts w:ascii="Times New Roman" w:eastAsia="Times New Roman" w:hAnsi="Times New Roman" w:cs="Times New Roman"/>
+          <w:sz w:val="24"/>
+          <w:szCs w:val="24"/>
+        </w:rPr>
+        <w:t>had</w:t>
+      </w:r>
+      <w:r>
+        <w:rPr>
+          <w:rFonts w:ascii="Times New Roman" w:eastAsia="Times New Roman" w:hAnsi="Times New Roman" w:cs="Times New Roman"/>
+          <w:sz w:val="24"/>
+          <w:szCs w:val="24"/>
+        </w:rPr>
+        <w:t xml:space="preserve"> intermediate</w:t>
+      </w:r>
+      <w:r>
+        <w:rPr>
+          <w:rFonts w:ascii="Times New Roman" w:eastAsia="Times New Roman" w:hAnsi="Times New Roman" w:cs="Times New Roman"/>
+          <w:sz w:val="24"/>
+          <w:szCs w:val="24"/>
+        </w:rPr>
+        <w:t xml:space="preserve"> numbers of time series documenting boom-bust</w:t>
+      </w:r>
+      <w:r>
+        <w:rPr>
+          <w:rFonts w:ascii="Times New Roman" w:eastAsia="Times New Roman" w:hAnsi="Times New Roman" w:cs="Times New Roman"/>
+          <w:sz w:val="24"/>
+          <w:szCs w:val="24"/>
+        </w:rPr>
+        <w:t xml:space="preserve">, and Asia </w:t>
+      </w:r>
+      <w:r>
+        <w:rPr>
+          <w:rFonts w:ascii="Times New Roman" w:eastAsia="Times New Roman" w:hAnsi="Times New Roman" w:cs="Times New Roman"/>
+          <w:sz w:val="24"/>
+          <w:szCs w:val="24"/>
+        </w:rPr>
+        <w:t>and</w:t>
+      </w:r>
+      <w:r>
+        <w:rPr>
+          <w:rFonts w:ascii="Times New Roman" w:eastAsia="Times New Roman" w:hAnsi="Times New Roman" w:cs="Times New Roman"/>
+          <w:sz w:val="24"/>
+          <w:szCs w:val="24"/>
+        </w:rPr>
+        <w:t xml:space="preserve"> Australia</w:t>
+      </w:r>
+      <w:r>
+        <w:rPr>
+          <w:rFonts w:ascii="Times New Roman" w:eastAsia="Times New Roman" w:hAnsi="Times New Roman" w:cs="Times New Roman"/>
+          <w:sz w:val="24"/>
+          <w:szCs w:val="24"/>
+        </w:rPr>
+        <w:t xml:space="preserve"> tied </w:t>
+      </w:r>
+      <w:r>
+        <w:rPr>
+          <w:rFonts w:ascii="Times New Roman" w:eastAsia="Times New Roman" w:hAnsi="Times New Roman" w:cs="Times New Roman"/>
+          <w:sz w:val="24"/>
+          <w:szCs w:val="24"/>
+        </w:rPr>
+        <w:t>for</w:t>
+      </w:r>
+      <w:r>
+        <w:rPr>
+          <w:rFonts w:ascii="Times New Roman" w:eastAsia="Times New Roman" w:hAnsi="Times New Roman" w:cs="Times New Roman"/>
+          <w:sz w:val="24"/>
+          <w:szCs w:val="24"/>
+        </w:rPr>
+        <w:t xml:space="preserve"> the fewest documented boom-bust</w:t>
+      </w:r>
+      <w:r>
+        <w:rPr>
+          <w:rFonts w:ascii="Times New Roman" w:eastAsia="Times New Roman" w:hAnsi="Times New Roman" w:cs="Times New Roman"/>
+          <w:sz w:val="24"/>
+          <w:szCs w:val="24"/>
+        </w:rPr>
+        <w:t>s</w:t>
+      </w:r>
+      <w:r>
+        <w:rPr>
+          <w:rFonts w:ascii="Times New Roman" w:eastAsia="Times New Roman" w:hAnsi="Times New Roman" w:cs="Times New Roman"/>
+          <w:sz w:val="24"/>
+          <w:szCs w:val="24"/>
+        </w:rPr>
+        <w:t xml:space="preserve"> (Fig. 3A).  </w:t>
+      </w:r>
+      <w:r>
+        <w:rPr>
+          <w:rFonts w:ascii="Times New Roman" w:eastAsia="Times New Roman" w:hAnsi="Times New Roman" w:cs="Times New Roman"/>
+          <w:sz w:val="24"/>
+          <w:szCs w:val="24"/>
+        </w:rPr>
+        <w:t>South America, Africa, and Antarctica had no time series</w:t>
+      </w:r>
+      <w:r>
+        <w:rPr>
+          <w:rFonts w:ascii="Times New Roman" w:eastAsia="Times New Roman" w:hAnsi="Times New Roman" w:cs="Times New Roman"/>
+          <w:sz w:val="24"/>
+          <w:szCs w:val="24"/>
+        </w:rPr>
+        <w:t xml:space="preserve"> that</w:t>
+      </w:r>
+      <w:r>
+        <w:rPr>
+          <w:rFonts w:ascii="Times New Roman" w:eastAsia="Times New Roman" w:hAnsi="Times New Roman" w:cs="Times New Roman"/>
+          <w:sz w:val="24"/>
+          <w:szCs w:val="24"/>
+        </w:rPr>
+        <w:t xml:space="preserve"> documented boom-busts</w:t>
+      </w:r>
+      <w:r>
+        <w:rPr>
+          <w:rFonts w:ascii="Times New Roman" w:eastAsia="Times New Roman" w:hAnsi="Times New Roman" w:cs="Times New Roman"/>
+          <w:sz w:val="24"/>
+          <w:szCs w:val="24"/>
+        </w:rPr>
+        <w:t xml:space="preserve"> (Figure 3A)</w:t>
+      </w:r>
+      <w:r>
+        <w:rPr>
+          <w:rFonts w:ascii="Times New Roman" w:eastAsia="Times New Roman" w:hAnsi="Times New Roman" w:cs="Times New Roman"/>
+          <w:sz w:val="24"/>
+          <w:szCs w:val="24"/>
+        </w:rPr>
+        <w:t>.</w:t>
+      </w:r>
+      <w:r>
+        <w:rPr>
+          <w:rFonts w:ascii="Times New Roman" w:eastAsia="Times New Roman" w:hAnsi="Times New Roman" w:cs="Times New Roman"/>
+          <w:sz w:val="24"/>
+          <w:szCs w:val="24"/>
+        </w:rPr>
+        <w:t xml:space="preserve">  The New Zealand </w:t>
+      </w:r>
+      <w:r>
+        <w:rPr>
+          <w:rFonts w:ascii="Times New Roman" w:eastAsia="Times New Roman" w:hAnsi="Times New Roman" w:cs="Times New Roman"/>
+          <w:sz w:val="24"/>
+          <w:szCs w:val="24"/>
+        </w:rPr>
+        <w:t>Mud Snail</w:t>
+      </w:r>
+      <w:r>
+        <w:rPr>
+          <w:rFonts w:ascii="Times New Roman" w:eastAsia="Times New Roman" w:hAnsi="Times New Roman" w:cs="Times New Roman"/>
+          <w:sz w:val="24"/>
+          <w:szCs w:val="24"/>
+        </w:rPr>
+        <w:t xml:space="preserve"> (</w:t>
       </w:r>
       <w:r>
         <w:rPr>
           <w:rFonts w:ascii="Times New Roman" w:eastAsia="Times New Roman" w:hAnsi="Times New Roman" w:cs="Times New Roman"/>
           <w:i/>
-          <w:sz w:val="24"/>
-          <w:szCs w:val="24"/>
-        </w:rPr>
-        <w:t>et al.</w:t>
-      </w:r>
-      <w:r>
-        <w:rPr>
-          <w:rFonts w:ascii="Times New Roman" w:eastAsia="Times New Roman" w:hAnsi="Times New Roman" w:cs="Times New Roman"/>
-          <w:sz w:val="24"/>
-          <w:szCs w:val="24"/>
-        </w:rPr>
-        <w:t xml:space="preserve"> 2005; Ferreira </w:t>
+          <w:iCs/>
+          <w:sz w:val="24"/>
+          <w:szCs w:val="24"/>
+        </w:rPr>
+        <w:t>Potamopyrgus antipodarum</w:t>
+      </w:r>
+      <w:r>
+        <w:rPr>
+          <w:rFonts w:ascii="Times New Roman" w:eastAsia="Times New Roman" w:hAnsi="Times New Roman" w:cs="Times New Roman"/>
+          <w:sz w:val="24"/>
+          <w:szCs w:val="24"/>
+        </w:rPr>
+        <w:t xml:space="preserve">) was </w:t>
+      </w:r>
+      <w:r>
+        <w:rPr>
+          <w:rFonts w:ascii="Times New Roman" w:eastAsia="Times New Roman" w:hAnsi="Times New Roman" w:cs="Times New Roman"/>
+          <w:sz w:val="24"/>
+          <w:szCs w:val="24"/>
+        </w:rPr>
+        <w:t xml:space="preserve">the </w:t>
+      </w:r>
+      <w:r>
+        <w:rPr>
+          <w:rFonts w:ascii="Times New Roman" w:eastAsia="Times New Roman" w:hAnsi="Times New Roman" w:cs="Times New Roman"/>
+          <w:sz w:val="24"/>
+          <w:szCs w:val="24"/>
+        </w:rPr>
+        <w:t>species</w:t>
+      </w:r>
+      <w:r>
+        <w:rPr>
+          <w:rFonts w:ascii="Times New Roman" w:eastAsia="Times New Roman" w:hAnsi="Times New Roman" w:cs="Times New Roman"/>
+          <w:sz w:val="24"/>
+          <w:szCs w:val="24"/>
+        </w:rPr>
+        <w:t xml:space="preserve"> that had the most documented boom-busts</w:t>
+      </w:r>
+      <w:r>
+        <w:rPr>
+          <w:rFonts w:ascii="Times New Roman" w:eastAsia="Times New Roman" w:hAnsi="Times New Roman" w:cs="Times New Roman"/>
+          <w:sz w:val="24"/>
+          <w:szCs w:val="24"/>
+        </w:rPr>
+        <w:t xml:space="preserve"> (Fig. 3B).</w:t>
+      </w:r>
+      <w:r>
+        <w:rPr>
+          <w:rFonts w:ascii="Times New Roman" w:eastAsia="Times New Roman" w:hAnsi="Times New Roman" w:cs="Times New Roman"/>
+          <w:sz w:val="24"/>
+          <w:szCs w:val="24"/>
+        </w:rPr>
+        <w:t xml:space="preserve"> </w:t>
+      </w:r>
+      <w:r>
+        <w:rPr>
+          <w:rFonts w:ascii="Times New Roman" w:eastAsia="Times New Roman" w:hAnsi="Times New Roman" w:cs="Times New Roman"/>
+          <w:sz w:val="24"/>
+          <w:szCs w:val="24"/>
+        </w:rPr>
+        <w:t>O</w:t>
+      </w:r>
+      <w:r>
+        <w:rPr>
+          <w:rFonts w:ascii="Times New Roman" w:eastAsia="Times New Roman" w:hAnsi="Times New Roman" w:cs="Times New Roman"/>
+          <w:sz w:val="24"/>
+          <w:szCs w:val="24"/>
+        </w:rPr>
+        <w:t xml:space="preserve">ther </w:t>
+      </w:r>
+      <w:r>
+        <w:rPr>
+          <w:rFonts w:ascii="Times New Roman" w:eastAsia="Times New Roman" w:hAnsi="Times New Roman" w:cs="Times New Roman"/>
+          <w:sz w:val="24"/>
+          <w:szCs w:val="24"/>
+        </w:rPr>
+        <w:t>species</w:t>
+      </w:r>
+      <w:r>
+        <w:rPr>
+          <w:rFonts w:ascii="Times New Roman" w:eastAsia="Times New Roman" w:hAnsi="Times New Roman" w:cs="Times New Roman"/>
+          <w:sz w:val="24"/>
+          <w:szCs w:val="24"/>
+        </w:rPr>
+        <w:t xml:space="preserve"> that </w:t>
+      </w:r>
+      <w:r>
+        <w:rPr>
+          <w:rFonts w:ascii="Times New Roman" w:eastAsia="Times New Roman" w:hAnsi="Times New Roman" w:cs="Times New Roman"/>
+          <w:sz w:val="24"/>
+          <w:szCs w:val="24"/>
+        </w:rPr>
+        <w:t xml:space="preserve">had multiple time series </w:t>
+      </w:r>
+      <w:r>
+        <w:rPr>
+          <w:rFonts w:ascii="Times New Roman" w:eastAsia="Times New Roman" w:hAnsi="Times New Roman" w:cs="Times New Roman"/>
+          <w:sz w:val="24"/>
+          <w:szCs w:val="24"/>
+        </w:rPr>
+        <w:t xml:space="preserve">with some evidence of a </w:t>
+      </w:r>
+      <w:r>
+        <w:rPr>
+          <w:rFonts w:ascii="Times New Roman" w:eastAsia="Times New Roman" w:hAnsi="Times New Roman" w:cs="Times New Roman"/>
+          <w:sz w:val="24"/>
+          <w:szCs w:val="24"/>
+        </w:rPr>
+        <w:t xml:space="preserve">boom-busts include </w:t>
+      </w:r>
+      <w:r>
+        <w:rPr>
+          <w:rFonts w:ascii="Times New Roman" w:eastAsia="Times New Roman" w:hAnsi="Times New Roman" w:cs="Times New Roman"/>
+          <w:sz w:val="24"/>
+          <w:szCs w:val="24"/>
+        </w:rPr>
+        <w:t xml:space="preserve">round goby </w:t>
+      </w:r>
+      <w:r>
+        <w:rPr>
+          <w:rFonts w:ascii="Times New Roman" w:eastAsia="Times New Roman" w:hAnsi="Times New Roman" w:cs="Times New Roman"/>
+          <w:sz w:val="24"/>
+          <w:szCs w:val="24"/>
+        </w:rPr>
+        <w:t>(</w:t>
       </w:r>
       <w:r>
         <w:rPr>
           <w:rFonts w:ascii="Times New Roman" w:eastAsia="Times New Roman" w:hAnsi="Times New Roman" w:cs="Times New Roman"/>
           <w:i/>
-          <w:sz w:val="24"/>
-          <w:szCs w:val="24"/>
-        </w:rPr>
-        <w:t>et al.</w:t>
-      </w:r>
-      <w:r>
-        <w:rPr>
-          <w:rFonts w:ascii="Times New Roman" w:eastAsia="Times New Roman" w:hAnsi="Times New Roman" w:cs="Times New Roman"/>
-          <w:sz w:val="24"/>
-          <w:szCs w:val="24"/>
-        </w:rPr>
-        <w:t xml:space="preserve"> 2006; Mergeay </w:t>
+          <w:iCs/>
+          <w:sz w:val="24"/>
+          <w:szCs w:val="24"/>
+        </w:rPr>
+        <w:t>Neogobius melanostomus</w:t>
+      </w:r>
+      <w:r>
+        <w:rPr>
+          <w:rFonts w:ascii="Times New Roman" w:eastAsia="Times New Roman" w:hAnsi="Times New Roman" w:cs="Times New Roman"/>
+          <w:sz w:val="24"/>
+          <w:szCs w:val="24"/>
+        </w:rPr>
+        <w:t>)</w:t>
+      </w:r>
+      <w:r>
+        <w:rPr>
+          <w:rFonts w:ascii="Times New Roman" w:eastAsia="Times New Roman" w:hAnsi="Times New Roman" w:cs="Times New Roman"/>
+          <w:sz w:val="24"/>
+          <w:szCs w:val="24"/>
+        </w:rPr>
+        <w:t xml:space="preserve">, </w:t>
+      </w:r>
+      <w:r>
+        <w:rPr>
+          <w:rFonts w:ascii="Times New Roman" w:eastAsia="Times New Roman" w:hAnsi="Times New Roman" w:cs="Times New Roman"/>
+          <w:sz w:val="24"/>
+          <w:szCs w:val="24"/>
+        </w:rPr>
+        <w:t>(</w:t>
       </w:r>
       <w:r>
         <w:rPr>
           <w:rFonts w:ascii="Times New Roman" w:eastAsia="Times New Roman" w:hAnsi="Times New Roman" w:cs="Times New Roman"/>
           <w:i/>
-          <w:sz w:val="24"/>
-          <w:szCs w:val="24"/>
-        </w:rPr>
-        <w:t>et al.</w:t>
-      </w:r>
-      <w:r>
-        <w:rPr>
-          <w:rFonts w:ascii="Times New Roman" w:eastAsia="Times New Roman" w:hAnsi="Times New Roman" w:cs="Times New Roman"/>
-          <w:sz w:val="24"/>
-          <w:szCs w:val="24"/>
-        </w:rPr>
-        <w:t xml:space="preserve"> 2006; Kaeuffer </w:t>
+          <w:iCs/>
+          <w:sz w:val="24"/>
+          <w:szCs w:val="24"/>
+        </w:rPr>
+        <w:t>Mnemiopsis leidyi</w:t>
+      </w:r>
+      <w:r>
+        <w:rPr>
+          <w:rFonts w:ascii="Times New Roman" w:eastAsia="Times New Roman" w:hAnsi="Times New Roman" w:cs="Times New Roman"/>
+          <w:sz w:val="24"/>
+          <w:szCs w:val="24"/>
+        </w:rPr>
+        <w:t>)</w:t>
+      </w:r>
+      <w:r>
+        <w:rPr>
+          <w:rFonts w:ascii="Times New Roman" w:eastAsia="Times New Roman" w:hAnsi="Times New Roman" w:cs="Times New Roman"/>
+          <w:sz w:val="24"/>
+          <w:szCs w:val="24"/>
+        </w:rPr>
+        <w:t xml:space="preserve">, </w:t>
+      </w:r>
+      <w:r>
+        <w:rPr>
+          <w:rFonts w:ascii="Times New Roman" w:eastAsia="Times New Roman" w:hAnsi="Times New Roman" w:cs="Times New Roman"/>
+          <w:sz w:val="24"/>
+          <w:szCs w:val="24"/>
+        </w:rPr>
+        <w:t>rusty crayfish (</w:t>
       </w:r>
       <w:r>
         <w:rPr>
           <w:rFonts w:ascii="Times New Roman" w:eastAsia="Times New Roman" w:hAnsi="Times New Roman" w:cs="Times New Roman"/>
           <w:i/>
-          <w:sz w:val="24"/>
-          <w:szCs w:val="24"/>
-        </w:rPr>
-        <w:t>et al.</w:t>
-      </w:r>
-      <w:r>
-        <w:rPr>
-          <w:rFonts w:ascii="Times New Roman" w:eastAsia="Times New Roman" w:hAnsi="Times New Roman" w:cs="Times New Roman"/>
-          <w:sz w:val="24"/>
-          <w:szCs w:val="24"/>
-        </w:rPr>
-        <w:t xml:space="preserve"> 2009; Angeler </w:t>
+          <w:iCs/>
+          <w:sz w:val="24"/>
+          <w:szCs w:val="24"/>
+        </w:rPr>
+        <w:t>Faxonius rusticus</w:t>
+      </w:r>
+      <w:r>
+        <w:rPr>
+          <w:rFonts w:ascii="Times New Roman" w:eastAsia="Times New Roman" w:hAnsi="Times New Roman" w:cs="Times New Roman"/>
+          <w:sz w:val="24"/>
+          <w:szCs w:val="24"/>
+        </w:rPr>
+        <w:t>)</w:t>
+      </w:r>
+      <w:r>
+        <w:rPr>
+          <w:rFonts w:ascii="Times New Roman" w:eastAsia="Times New Roman" w:hAnsi="Times New Roman" w:cs="Times New Roman"/>
+          <w:sz w:val="24"/>
+          <w:szCs w:val="24"/>
+        </w:rPr>
+        <w:t xml:space="preserve">, </w:t>
+      </w:r>
+      <w:r>
+        <w:rPr>
+          <w:rFonts w:ascii="Times New Roman" w:eastAsia="Times New Roman" w:hAnsi="Times New Roman" w:cs="Times New Roman"/>
+          <w:sz w:val="24"/>
+          <w:szCs w:val="24"/>
+        </w:rPr>
+        <w:t>m</w:t>
+      </w:r>
+      <w:r>
+        <w:rPr>
+          <w:rFonts w:ascii="Times New Roman" w:eastAsia="Times New Roman" w:hAnsi="Times New Roman" w:cs="Times New Roman"/>
+          <w:sz w:val="24"/>
+          <w:szCs w:val="24"/>
+        </w:rPr>
+        <w:t xml:space="preserve">ayan </w:t>
+      </w:r>
+      <w:r>
+        <w:rPr>
+          <w:rFonts w:ascii="Times New Roman" w:eastAsia="Times New Roman" w:hAnsi="Times New Roman" w:cs="Times New Roman"/>
+          <w:sz w:val="24"/>
+          <w:szCs w:val="24"/>
+        </w:rPr>
+        <w:t>c</w:t>
+      </w:r>
+      <w:r>
+        <w:rPr>
+          <w:rFonts w:ascii="Times New Roman" w:eastAsia="Times New Roman" w:hAnsi="Times New Roman" w:cs="Times New Roman"/>
+          <w:sz w:val="24"/>
+          <w:szCs w:val="24"/>
+        </w:rPr>
+        <w:t>ichlids (</w:t>
       </w:r>
       <w:r>
         <w:rPr>
           <w:rFonts w:ascii="Times New Roman" w:eastAsia="Times New Roman" w:hAnsi="Times New Roman" w:cs="Times New Roman"/>
           <w:i/>
-          <w:sz w:val="24"/>
-          <w:szCs w:val="24"/>
-        </w:rPr>
-        <w:t>et al.</w:t>
-      </w:r>
-      <w:r>
-        <w:rPr>
-          <w:rFonts w:ascii="Times New Roman" w:eastAsia="Times New Roman" w:hAnsi="Times New Roman" w:cs="Times New Roman"/>
-          <w:sz w:val="24"/>
-          <w:szCs w:val="24"/>
-        </w:rPr>
-        <w:t xml:space="preserve"> 2010; Witte </w:t>
+          <w:iCs/>
+          <w:sz w:val="24"/>
+          <w:szCs w:val="24"/>
+        </w:rPr>
+        <w:t>Mayaheros urophthalmus</w:t>
+      </w:r>
+      <w:r>
+        <w:rPr>
+          <w:rFonts w:ascii="Times New Roman" w:eastAsia="Times New Roman" w:hAnsi="Times New Roman" w:cs="Times New Roman"/>
+          <w:sz w:val="24"/>
+          <w:szCs w:val="24"/>
+        </w:rPr>
+        <w:t>),</w:t>
+      </w:r>
+      <w:r>
+        <w:rPr>
+          <w:rFonts w:ascii="Times New Roman" w:eastAsia="Times New Roman" w:hAnsi="Times New Roman" w:cs="Times New Roman"/>
+          <w:sz w:val="24"/>
+          <w:szCs w:val="24"/>
+        </w:rPr>
+        <w:t xml:space="preserve"> </w:t>
+      </w:r>
+      <w:r>
+        <w:rPr>
+          <w:rFonts w:ascii="Times New Roman" w:eastAsia="Times New Roman" w:hAnsi="Times New Roman" w:cs="Times New Roman"/>
+          <w:sz w:val="24"/>
+          <w:szCs w:val="24"/>
+        </w:rPr>
+        <w:t>caribou</w:t>
+      </w:r>
+      <w:r>
+        <w:rPr>
+          <w:rFonts w:ascii="Times New Roman" w:eastAsia="Times New Roman" w:hAnsi="Times New Roman" w:cs="Times New Roman"/>
+          <w:sz w:val="24"/>
+          <w:szCs w:val="24"/>
+        </w:rPr>
+        <w:t xml:space="preserve"> </w:t>
+      </w:r>
+      <w:r>
+        <w:rPr>
+          <w:rFonts w:ascii="Times New Roman" w:eastAsia="Times New Roman" w:hAnsi="Times New Roman" w:cs="Times New Roman"/>
+          <w:sz w:val="24"/>
+          <w:szCs w:val="24"/>
+        </w:rPr>
+        <w:t>(</w:t>
       </w:r>
       <w:r>
         <w:rPr>
           <w:rFonts w:ascii="Times New Roman" w:eastAsia="Times New Roman" w:hAnsi="Times New Roman" w:cs="Times New Roman"/>
           <w:i/>
-          <w:sz w:val="24"/>
-          <w:szCs w:val="24"/>
-        </w:rPr>
-        <w:t>et al.</w:t>
-      </w:r>
-      <w:r>
-        <w:rPr>
-          <w:rFonts w:ascii="Times New Roman" w:eastAsia="Times New Roman" w:hAnsi="Times New Roman" w:cs="Times New Roman"/>
-          <w:sz w:val="24"/>
-          <w:szCs w:val="24"/>
-        </w:rPr>
-        <w:t xml:space="preserve"> 2010; Morris </w:t>
+          <w:iCs/>
+          <w:sz w:val="24"/>
+          <w:szCs w:val="24"/>
+        </w:rPr>
+        <w:t>Ran</w:t>
       </w:r>
       <w:r>
         <w:rPr>
           <w:rFonts w:ascii="Times New Roman" w:eastAsia="Times New Roman" w:hAnsi="Times New Roman" w:cs="Times New Roman"/>
           <w:i/>
-          <w:sz w:val="24"/>
-          <w:szCs w:val="24"/>
-        </w:rPr>
-        <w:t>et al.</w:t>
-      </w:r>
-      <w:r>
-        <w:rPr>
-          <w:rFonts w:ascii="Times New Roman" w:eastAsia="Times New Roman" w:hAnsi="Times New Roman" w:cs="Times New Roman"/>
-          <w:sz w:val="24"/>
-          <w:szCs w:val="24"/>
-        </w:rPr>
-        <w:t xml:space="preserve"> 2013; Sandström </w:t>
+          <w:iCs/>
+          <w:sz w:val="24"/>
+          <w:szCs w:val="24"/>
+        </w:rPr>
+        <w:t>g</w:t>
       </w:r>
       <w:r>
         <w:rPr>
           <w:rFonts w:ascii="Times New Roman" w:eastAsia="Times New Roman" w:hAnsi="Times New Roman" w:cs="Times New Roman"/>
           <w:i/>
-          <w:sz w:val="24"/>
-          <w:szCs w:val="24"/>
-        </w:rPr>
-        <w:t>et al.</w:t>
-      </w:r>
-      <w:r>
-        <w:rPr>
-          <w:rFonts w:ascii="Times New Roman" w:eastAsia="Times New Roman" w:hAnsi="Times New Roman" w:cs="Times New Roman"/>
-          <w:sz w:val="24"/>
-          <w:szCs w:val="24"/>
-        </w:rPr>
-        <w:t xml:space="preserve"> 2014; Cecere </w:t>
+          <w:iCs/>
+          <w:sz w:val="24"/>
+          <w:szCs w:val="24"/>
+        </w:rPr>
+        <w:t xml:space="preserve">ifer </w:t>
       </w:r>
       <w:r>
         <w:rPr>
           <w:rFonts w:ascii="Times New Roman" w:eastAsia="Times New Roman" w:hAnsi="Times New Roman" w:cs="Times New Roman"/>
           <w:i/>
-          <w:sz w:val="24"/>
-          <w:szCs w:val="24"/>
-        </w:rPr>
-        <w:t>et al.</w:t>
-      </w:r>
-      <w:r>
-        <w:rPr>
-          <w:rFonts w:ascii="Times New Roman" w:eastAsia="Times New Roman" w:hAnsi="Times New Roman" w:cs="Times New Roman"/>
-          <w:sz w:val="24"/>
-          <w:szCs w:val="24"/>
-        </w:rPr>
-        <w:t xml:space="preserve"> 2016; Wegner </w:t>
+          <w:iCs/>
+          <w:sz w:val="24"/>
+          <w:szCs w:val="24"/>
+        </w:rPr>
+        <w:t>t</w:t>
       </w:r>
       <w:r>
         <w:rPr>
           <w:rFonts w:ascii="Times New Roman" w:eastAsia="Times New Roman" w:hAnsi="Times New Roman" w:cs="Times New Roman"/>
           <w:i/>
-          <w:sz w:val="24"/>
-          <w:szCs w:val="24"/>
-        </w:rPr>
-        <w:t>et al.</w:t>
-      </w:r>
-      <w:r>
-        <w:rPr>
-          <w:rFonts w:ascii="Times New Roman" w:eastAsia="Times New Roman" w:hAnsi="Times New Roman" w:cs="Times New Roman"/>
-          <w:sz w:val="24"/>
-          <w:szCs w:val="24"/>
-        </w:rPr>
-        <w:t xml:space="preserve"> 2019).  The primary focus of many of these studies was to document rapid population growth (Ferreira </w:t>
+          <w:iCs/>
+          <w:sz w:val="24"/>
+          <w:szCs w:val="24"/>
+        </w:rPr>
+        <w:t>arandus</w:t>
+      </w:r>
+      <w:r>
+        <w:rPr>
+          <w:rFonts w:ascii="Times New Roman" w:eastAsia="Times New Roman" w:hAnsi="Times New Roman" w:cs="Times New Roman"/>
+          <w:sz w:val="24"/>
+          <w:szCs w:val="24"/>
+        </w:rPr>
+        <w:t>)</w:t>
+      </w:r>
+      <w:r>
+        <w:rPr>
+          <w:rFonts w:ascii="Times New Roman" w:eastAsia="Times New Roman" w:hAnsi="Times New Roman" w:cs="Times New Roman"/>
+          <w:sz w:val="24"/>
+          <w:szCs w:val="24"/>
+        </w:rPr>
+        <w:t xml:space="preserve">, </w:t>
+      </w:r>
+      <w:r>
+        <w:rPr>
+          <w:rFonts w:ascii="Times New Roman" w:eastAsia="Times New Roman" w:hAnsi="Times New Roman" w:cs="Times New Roman"/>
+          <w:sz w:val="24"/>
+          <w:szCs w:val="24"/>
+        </w:rPr>
+        <w:t xml:space="preserve">signal crayfish </w:t>
+      </w:r>
+      <w:r>
+        <w:rPr>
+          <w:rFonts w:ascii="Times New Roman" w:eastAsia="Times New Roman" w:hAnsi="Times New Roman" w:cs="Times New Roman"/>
+          <w:sz w:val="24"/>
+          <w:szCs w:val="24"/>
+        </w:rPr>
+        <w:t>(</w:t>
       </w:r>
       <w:r>
         <w:rPr>
           <w:rFonts w:ascii="Times New Roman" w:eastAsia="Times New Roman" w:hAnsi="Times New Roman" w:cs="Times New Roman"/>
           <w:i/>
-          <w:sz w:val="24"/>
-          <w:szCs w:val="24"/>
-        </w:rPr>
-        <w:t>et al.</w:t>
-      </w:r>
-      <w:r>
-        <w:rPr>
-          <w:rFonts w:ascii="Times New Roman" w:eastAsia="Times New Roman" w:hAnsi="Times New Roman" w:cs="Times New Roman"/>
-          <w:sz w:val="24"/>
-          <w:szCs w:val="24"/>
-        </w:rPr>
-        <w:t xml:space="preserve"> 2006; Witte </w:t>
+          <w:iCs/>
+          <w:sz w:val="24"/>
+          <w:szCs w:val="24"/>
+          <w:lang w:val="en-US"/>
+        </w:rPr>
+        <w:t>Pacifastacus leniusculus</w:t>
+      </w:r>
+      <w:r>
+        <w:rPr>
+          <w:rFonts w:ascii="Times New Roman" w:eastAsia="Times New Roman" w:hAnsi="Times New Roman" w:cs="Times New Roman"/>
+          <w:sz w:val="24"/>
+          <w:szCs w:val="24"/>
+        </w:rPr>
+        <w:t>)</w:t>
+      </w:r>
+      <w:r>
+        <w:rPr>
+          <w:rFonts w:ascii="Times New Roman" w:eastAsia="Times New Roman" w:hAnsi="Times New Roman" w:cs="Times New Roman"/>
+          <w:sz w:val="24"/>
+          <w:szCs w:val="24"/>
+        </w:rPr>
+        <w:t xml:space="preserve">, </w:t>
+      </w:r>
+      <w:r>
+        <w:rPr>
+          <w:rFonts w:ascii="Times New Roman" w:eastAsia="Times New Roman" w:hAnsi="Times New Roman" w:cs="Times New Roman"/>
+          <w:sz w:val="24"/>
+          <w:szCs w:val="24"/>
+        </w:rPr>
+        <w:t xml:space="preserve">rainbow smelt </w:t>
+      </w:r>
+      <w:r>
+        <w:rPr>
+          <w:rFonts w:ascii="Times New Roman" w:eastAsia="Times New Roman" w:hAnsi="Times New Roman" w:cs="Times New Roman"/>
+          <w:sz w:val="24"/>
+          <w:szCs w:val="24"/>
+        </w:rPr>
+        <w:t>(</w:t>
       </w:r>
       <w:r>
         <w:rPr>
           <w:rFonts w:ascii="Times New Roman" w:eastAsia="Times New Roman" w:hAnsi="Times New Roman" w:cs="Times New Roman"/>
           <w:i/>
-          <w:sz w:val="24"/>
-          <w:szCs w:val="24"/>
-        </w:rPr>
-        <w:t>et al.</w:t>
-      </w:r>
-      <w:r>
-        <w:rPr>
-          <w:rFonts w:ascii="Times New Roman" w:eastAsia="Times New Roman" w:hAnsi="Times New Roman" w:cs="Times New Roman"/>
-          <w:sz w:val="24"/>
-          <w:szCs w:val="24"/>
-        </w:rPr>
-        <w:t xml:space="preserve"> 2010; Wegner </w:t>
+          <w:iCs/>
+          <w:sz w:val="24"/>
+          <w:szCs w:val="24"/>
+        </w:rPr>
+        <w:t>Omerus mordax</w:t>
       </w:r>
       <w:r>
         <w:rPr>
           <w:rFonts w:ascii="Times New Roman" w:eastAsia="Times New Roman" w:hAnsi="Times New Roman" w:cs="Times New Roman"/>
           <w:i/>
-          <w:sz w:val="24"/>
-          <w:szCs w:val="24"/>
-        </w:rPr>
-        <w:t>et al.</w:t>
-      </w:r>
-      <w:r>
-        <w:rPr>
-          <w:rFonts w:ascii="Times New Roman" w:eastAsia="Times New Roman" w:hAnsi="Times New Roman" w:cs="Times New Roman"/>
-          <w:sz w:val="24"/>
-          <w:szCs w:val="24"/>
-        </w:rPr>
-        <w:t xml:space="preserve"> 2019). One study demonstrated that established populations could fluctuate like cyclic population dynamics (Kaeuffer </w:t>
+          <w:iCs/>
+          <w:sz w:val="24"/>
+          <w:szCs w:val="24"/>
+        </w:rPr>
+        <w:t>)</w:t>
       </w:r>
       <w:r>
         <w:rPr>
           <w:rFonts w:ascii="Times New Roman" w:eastAsia="Times New Roman" w:hAnsi="Times New Roman" w:cs="Times New Roman"/>
           <w:i/>
-          <w:sz w:val="24"/>
-          <w:szCs w:val="24"/>
-        </w:rPr>
-        <w:t>et al.</w:t>
-      </w:r>
-      <w:r>
-        <w:rPr>
-          <w:rFonts w:ascii="Times New Roman" w:eastAsia="Times New Roman" w:hAnsi="Times New Roman" w:cs="Times New Roman"/>
-          <w:sz w:val="24"/>
-          <w:szCs w:val="24"/>
-        </w:rPr>
-        <w:t xml:space="preserve"> 2009).</w:t>
+          <w:iCs/>
+          <w:sz w:val="24"/>
+          <w:szCs w:val="24"/>
+        </w:rPr>
+        <w:t>,</w:t>
+      </w:r>
+      <w:r>
+        <w:rPr>
+          <w:rFonts w:ascii="Times New Roman" w:eastAsia="Times New Roman" w:hAnsi="Times New Roman" w:cs="Times New Roman"/>
+          <w:sz w:val="24"/>
+          <w:szCs w:val="24"/>
+        </w:rPr>
+        <w:t xml:space="preserve"> </w:t>
+      </w:r>
+      <w:r>
+        <w:rPr>
+          <w:rFonts w:ascii="Times New Roman" w:eastAsia="Times New Roman" w:hAnsi="Times New Roman" w:cs="Times New Roman"/>
+          <w:sz w:val="24"/>
+          <w:szCs w:val="24"/>
+        </w:rPr>
+        <w:t xml:space="preserve">nutmeg mannikin </w:t>
+      </w:r>
+      <w:r>
+        <w:rPr>
+          <w:rFonts w:ascii="Times New Roman" w:eastAsia="Times New Roman" w:hAnsi="Times New Roman" w:cs="Times New Roman"/>
+          <w:sz w:val="24"/>
+          <w:szCs w:val="24"/>
+        </w:rPr>
+        <w:t>(</w:t>
+      </w:r>
+      <w:r>
+        <w:rPr>
+          <w:rFonts w:ascii="Times New Roman" w:eastAsia="Times New Roman" w:hAnsi="Times New Roman" w:cs="Times New Roman"/>
+          <w:sz w:val="24"/>
+          <w:szCs w:val="24"/>
+        </w:rPr>
+        <w:t>Lonchura puctulata</w:t>
+      </w:r>
+      <w:r>
+        <w:rPr>
+          <w:rFonts w:ascii="Times New Roman" w:eastAsia="Times New Roman" w:hAnsi="Times New Roman" w:cs="Times New Roman"/>
+          <w:sz w:val="24"/>
+          <w:szCs w:val="24"/>
+        </w:rPr>
+        <w:t>)</w:t>
+      </w:r>
+      <w:r>
+        <w:rPr>
+          <w:rFonts w:ascii="Times New Roman" w:eastAsia="Times New Roman" w:hAnsi="Times New Roman" w:cs="Times New Roman"/>
+          <w:sz w:val="24"/>
+          <w:szCs w:val="24"/>
+        </w:rPr>
+        <w:t xml:space="preserve">, </w:t>
+      </w:r>
+      <w:r>
+        <w:rPr>
+          <w:rFonts w:ascii="Times New Roman" w:eastAsia="Times New Roman" w:hAnsi="Times New Roman" w:cs="Times New Roman"/>
+          <w:sz w:val="24"/>
+          <w:szCs w:val="24"/>
+        </w:rPr>
+        <w:t>a</w:t>
+      </w:r>
+      <w:r>
+        <w:rPr>
+          <w:rFonts w:ascii="Times New Roman" w:eastAsia="Times New Roman" w:hAnsi="Times New Roman" w:cs="Times New Roman"/>
+          <w:sz w:val="24"/>
+          <w:szCs w:val="24"/>
+        </w:rPr>
+        <w:t xml:space="preserve">frican </w:t>
+      </w:r>
+      <w:r>
+        <w:rPr>
+          <w:rFonts w:ascii="Times New Roman" w:eastAsia="Times New Roman" w:hAnsi="Times New Roman" w:cs="Times New Roman"/>
+          <w:sz w:val="24"/>
+          <w:szCs w:val="24"/>
+        </w:rPr>
+        <w:t>j</w:t>
+      </w:r>
+      <w:r>
+        <w:rPr>
+          <w:rFonts w:ascii="Times New Roman" w:eastAsia="Times New Roman" w:hAnsi="Times New Roman" w:cs="Times New Roman"/>
+          <w:sz w:val="24"/>
+          <w:szCs w:val="24"/>
+        </w:rPr>
+        <w:t>ewelfish (</w:t>
+      </w:r>
+      <w:r>
+        <w:rPr>
+          <w:rFonts w:ascii="Times New Roman" w:eastAsia="Times New Roman" w:hAnsi="Times New Roman" w:cs="Times New Roman"/>
+          <w:i/>
+          <w:iCs/>
+          <w:sz w:val="24"/>
+          <w:szCs w:val="24"/>
+        </w:rPr>
+        <w:t>Hemichromis letoruneuxi</w:t>
+      </w:r>
+      <w:r>
+        <w:rPr>
+          <w:rFonts w:ascii="Times New Roman" w:eastAsia="Times New Roman" w:hAnsi="Times New Roman" w:cs="Times New Roman"/>
+          <w:sz w:val="24"/>
+          <w:szCs w:val="24"/>
+        </w:rPr>
+        <w:t xml:space="preserve">), </w:t>
+      </w:r>
+      <w:r>
+        <w:rPr>
+          <w:rFonts w:ascii="Times New Roman" w:eastAsia="Times New Roman" w:hAnsi="Times New Roman" w:cs="Times New Roman"/>
+          <w:sz w:val="24"/>
+          <w:szCs w:val="24"/>
+        </w:rPr>
+        <w:t xml:space="preserve">orange-cheeked waxbill </w:t>
+      </w:r>
+      <w:r>
+        <w:rPr>
+          <w:rFonts w:ascii="Times New Roman" w:eastAsia="Times New Roman" w:hAnsi="Times New Roman" w:cs="Times New Roman"/>
+          <w:sz w:val="24"/>
+          <w:szCs w:val="24"/>
+        </w:rPr>
+        <w:t>(</w:t>
+      </w:r>
+      <w:r>
+        <w:rPr>
+          <w:rFonts w:ascii="Times New Roman" w:eastAsia="Times New Roman" w:hAnsi="Times New Roman" w:cs="Times New Roman"/>
+          <w:i/>
+          <w:iCs/>
+          <w:sz w:val="24"/>
+          <w:szCs w:val="24"/>
+        </w:rPr>
+        <w:t>Estrilda melpoda</w:t>
+      </w:r>
+      <w:r>
+        <w:rPr>
+          <w:rFonts w:ascii="Times New Roman" w:eastAsia="Times New Roman" w:hAnsi="Times New Roman" w:cs="Times New Roman"/>
+          <w:sz w:val="24"/>
+          <w:szCs w:val="24"/>
+        </w:rPr>
+        <w:t>)</w:t>
+      </w:r>
+      <w:r>
+        <w:rPr>
+          <w:rFonts w:ascii="Times New Roman" w:eastAsia="Times New Roman" w:hAnsi="Times New Roman" w:cs="Times New Roman"/>
+          <w:sz w:val="24"/>
+          <w:szCs w:val="24"/>
+        </w:rPr>
+        <w:t xml:space="preserve"> and </w:t>
+      </w:r>
+      <w:r>
+        <w:rPr>
+          <w:rFonts w:ascii="Times New Roman" w:eastAsia="Times New Roman" w:hAnsi="Times New Roman" w:cs="Times New Roman"/>
+          <w:sz w:val="24"/>
+          <w:szCs w:val="24"/>
+        </w:rPr>
+        <w:t xml:space="preserve">threadfin shad </w:t>
+      </w:r>
+      <w:r>
+        <w:rPr>
+          <w:rFonts w:ascii="Times New Roman" w:eastAsia="Times New Roman" w:hAnsi="Times New Roman" w:cs="Times New Roman"/>
+          <w:sz w:val="24"/>
+          <w:szCs w:val="24"/>
+        </w:rPr>
+        <w:t>(</w:t>
+      </w:r>
+      <w:r>
+        <w:rPr>
+          <w:rFonts w:ascii="Times New Roman" w:eastAsia="Times New Roman" w:hAnsi="Times New Roman" w:cs="Times New Roman"/>
+          <w:i/>
+          <w:iCs/>
+          <w:sz w:val="24"/>
+          <w:szCs w:val="24"/>
+        </w:rPr>
+        <w:t>Dorosoma petenense</w:t>
+      </w:r>
+      <w:r>
+        <w:rPr>
+          <w:rFonts w:ascii="Times New Roman" w:eastAsia="Times New Roman" w:hAnsi="Times New Roman" w:cs="Times New Roman"/>
+          <w:sz w:val="24"/>
+          <w:szCs w:val="24"/>
+        </w:rPr>
+        <w:t>; Fig. 3B)</w:t>
+      </w:r>
+      <w:r>
+        <w:rPr>
+          <w:rFonts w:ascii="Times New Roman" w:eastAsia="Times New Roman" w:hAnsi="Times New Roman" w:cs="Times New Roman"/>
+          <w:sz w:val="24"/>
+          <w:szCs w:val="24"/>
+        </w:rPr>
+        <w:t>.</w:t>
+      </w:r>
+      <w:r>
+        <w:rPr>
+          <w:rFonts w:ascii="Times New Roman" w:eastAsia="Times New Roman" w:hAnsi="Times New Roman" w:cs="Times New Roman"/>
+          <w:sz w:val="24"/>
+          <w:szCs w:val="24"/>
+        </w:rPr>
+        <w:t xml:space="preserve">  </w:t>
+      </w:r>
+      <w:r>
+        <w:rPr>
+          <w:rFonts w:ascii="Times New Roman" w:eastAsia="Times New Roman" w:hAnsi="Times New Roman" w:cs="Times New Roman"/>
+          <w:sz w:val="24"/>
+          <w:szCs w:val="24"/>
+        </w:rPr>
+        <w:t>Most</w:t>
+      </w:r>
+      <w:r>
+        <w:rPr>
+          <w:rFonts w:ascii="Times New Roman" w:eastAsia="Times New Roman" w:hAnsi="Times New Roman" w:cs="Times New Roman"/>
+          <w:sz w:val="24"/>
+          <w:szCs w:val="24"/>
+        </w:rPr>
+        <w:t xml:space="preserve"> </w:t>
+      </w:r>
+      <w:r>
+        <w:rPr>
+          <w:rFonts w:ascii="Times New Roman" w:eastAsia="Times New Roman" w:hAnsi="Times New Roman" w:cs="Times New Roman"/>
+          <w:sz w:val="24"/>
+          <w:szCs w:val="24"/>
+        </w:rPr>
+        <w:t xml:space="preserve">time </w:t>
+      </w:r>
+      <w:r>
+        <w:rPr>
+          <w:rFonts w:ascii="Times New Roman" w:eastAsia="Times New Roman" w:hAnsi="Times New Roman" w:cs="Times New Roman"/>
+          <w:sz w:val="24"/>
+          <w:szCs w:val="24"/>
+        </w:rPr>
+        <w:t>series that had some evidence for boom-bust</w:t>
+      </w:r>
+      <w:r>
+        <w:rPr>
+          <w:rFonts w:ascii="Times New Roman" w:eastAsia="Times New Roman" w:hAnsi="Times New Roman" w:cs="Times New Roman"/>
+          <w:sz w:val="24"/>
+          <w:szCs w:val="24"/>
+        </w:rPr>
+        <w:t>s</w:t>
+      </w:r>
+      <w:r>
+        <w:rPr>
+          <w:rFonts w:ascii="Times New Roman" w:eastAsia="Times New Roman" w:hAnsi="Times New Roman" w:cs="Times New Roman"/>
+          <w:sz w:val="24"/>
+          <w:szCs w:val="24"/>
+        </w:rPr>
+        <w:t xml:space="preserve"> were from animals (Fig. 3C)</w:t>
+      </w:r>
+      <w:r>
+        <w:rPr>
+          <w:rFonts w:ascii="Times New Roman" w:eastAsia="Times New Roman" w:hAnsi="Times New Roman" w:cs="Times New Roman"/>
+          <w:sz w:val="24"/>
+          <w:szCs w:val="24"/>
+        </w:rPr>
+        <w:t xml:space="preserve">. </w:t>
+      </w:r>
+      <w:r>
+        <w:rPr>
+          <w:rFonts w:ascii="Times New Roman" w:eastAsia="Times New Roman" w:hAnsi="Times New Roman" w:cs="Times New Roman"/>
+          <w:sz w:val="24"/>
+          <w:szCs w:val="24"/>
+        </w:rPr>
+        <w:t xml:space="preserve"> </w:t>
+      </w:r>
+      <w:r>
+        <w:rPr>
+          <w:rFonts w:ascii="Times New Roman" w:eastAsia="Times New Roman" w:hAnsi="Times New Roman" w:cs="Times New Roman"/>
+          <w:sz w:val="24"/>
+          <w:szCs w:val="24"/>
+        </w:rPr>
+        <w:t>S</w:t>
+      </w:r>
+      <w:r>
+        <w:rPr>
+          <w:rFonts w:ascii="Times New Roman" w:eastAsia="Times New Roman" w:hAnsi="Times New Roman" w:cs="Times New Roman"/>
+          <w:sz w:val="24"/>
+          <w:szCs w:val="24"/>
+        </w:rPr>
+        <w:t>nails (Gasropoda), birds (Aves), and ray-finned fishes (Actinopterygii)</w:t>
+      </w:r>
+      <w:r>
+        <w:rPr>
+          <w:rFonts w:ascii="Times New Roman" w:eastAsia="Times New Roman" w:hAnsi="Times New Roman" w:cs="Times New Roman"/>
+          <w:sz w:val="24"/>
+          <w:szCs w:val="24"/>
+        </w:rPr>
+        <w:t xml:space="preserve"> had</w:t>
+      </w:r>
+      <w:r>
+        <w:rPr>
+          <w:rFonts w:ascii="Times New Roman" w:eastAsia="Times New Roman" w:hAnsi="Times New Roman" w:cs="Times New Roman"/>
+          <w:sz w:val="24"/>
+          <w:szCs w:val="24"/>
+        </w:rPr>
+        <w:t xml:space="preserve"> over 20 </w:t>
+      </w:r>
+      <w:r>
+        <w:rPr>
+          <w:rFonts w:ascii="Times New Roman" w:eastAsia="Times New Roman" w:hAnsi="Times New Roman" w:cs="Times New Roman"/>
+          <w:sz w:val="24"/>
+          <w:szCs w:val="24"/>
+        </w:rPr>
+        <w:t xml:space="preserve">times series with some evidence of boom-busts (Fig. 3C). </w:t>
+      </w:r>
+      <w:r>
+        <w:rPr>
+          <w:rFonts w:ascii="Times New Roman" w:eastAsia="Times New Roman" w:hAnsi="Times New Roman" w:cs="Times New Roman"/>
+          <w:sz w:val="24"/>
+          <w:szCs w:val="24"/>
+        </w:rPr>
+        <w:t xml:space="preserve"> Crustaceans had intermediate numbers of times series with some evidence of boom-bust while the rest had relatively few </w:t>
+      </w:r>
+      <w:r>
+        <w:rPr>
+          <w:rFonts w:ascii="Times New Roman" w:eastAsia="Times New Roman" w:hAnsi="Times New Roman" w:cs="Times New Roman"/>
+          <w:sz w:val="24"/>
+          <w:szCs w:val="24"/>
+        </w:rPr>
+        <w:lastRenderedPageBreak/>
+        <w:t>documented boom-busts</w:t>
+      </w:r>
+      <w:r>
+        <w:rPr>
+          <w:rFonts w:ascii="Times New Roman" w:eastAsia="Times New Roman" w:hAnsi="Times New Roman" w:cs="Times New Roman"/>
+          <w:sz w:val="24"/>
+          <w:szCs w:val="24"/>
+        </w:rPr>
+        <w:t xml:space="preserve"> (Fig. 3C).  Freshwater systems had the most time series with some evidence of boom-bust, followed by terrestrial systems, and marine systems had the fewest time series with some evidence of boom-bust (Fig. 3D).  Longevity…</w:t>
       </w:r>
     </w:p>
     <w:p>
       <w:pPr>
         <w:spacing w:line="480" w:lineRule="auto"/>
-        <w:ind w:firstLine="720"/>
-        <w:rPr>
-          <w:rFonts w:ascii="Times New Roman" w:eastAsia="Times New Roman" w:hAnsi="Times New Roman" w:cs="Times New Roman"/>
+        <w:rPr>
+          <w:rFonts w:ascii="Times New Roman" w:eastAsia="Times New Roman" w:hAnsi="Times New Roman" w:cs="Times New Roman"/>
+          <w:b/>
+          <w:bCs/>
           <w:sz w:val="24"/>
           <w:szCs w:val="24"/>
         </w:rPr>
@@ -6691,529 +7425,12 @@
       <w:r>
         <w:rPr>
           <w:rFonts w:ascii="Times New Roman" w:eastAsia="Times New Roman" w:hAnsi="Times New Roman" w:cs="Times New Roman"/>
-          <w:sz w:val="24"/>
-          <w:szCs w:val="24"/>
-        </w:rPr>
-        <w:t xml:space="preserve">I identified 28 of taxon that exhibited boom-bust cycles when invading (Mouthon 2003; Bilio &amp; Niermann 2004; Salonen &amp; Mutenia 2004; Boggs </w:t>
-      </w:r>
-      <w:r>
-        <w:rPr>
-          <w:rFonts w:ascii="Times New Roman" w:eastAsia="Times New Roman" w:hAnsi="Times New Roman" w:cs="Times New Roman"/>
-          <w:i/>
-          <w:sz w:val="24"/>
-          <w:szCs w:val="24"/>
-        </w:rPr>
-        <w:t>et al.</w:t>
-      </w:r>
-      <w:r>
-        <w:rPr>
-          <w:rFonts w:ascii="Times New Roman" w:eastAsia="Times New Roman" w:hAnsi="Times New Roman" w:cs="Times New Roman"/>
-          <w:sz w:val="24"/>
-          <w:szCs w:val="24"/>
-        </w:rPr>
-        <w:t xml:space="preserve"> 2006; Letnic &amp; Dickman 2006; Daskalov </w:t>
-      </w:r>
-      <w:r>
-        <w:rPr>
-          <w:rFonts w:ascii="Times New Roman" w:eastAsia="Times New Roman" w:hAnsi="Times New Roman" w:cs="Times New Roman"/>
-          <w:i/>
-          <w:sz w:val="24"/>
-          <w:szCs w:val="24"/>
-        </w:rPr>
-        <w:t>et al.</w:t>
-      </w:r>
-      <w:r>
-        <w:rPr>
-          <w:rFonts w:ascii="Times New Roman" w:eastAsia="Times New Roman" w:hAnsi="Times New Roman" w:cs="Times New Roman"/>
-          <w:sz w:val="24"/>
-          <w:szCs w:val="24"/>
-        </w:rPr>
-        <w:t xml:space="preserve"> 2007; Hurlbert </w:t>
-      </w:r>
-      <w:r>
-        <w:rPr>
-          <w:rFonts w:ascii="Times New Roman" w:eastAsia="Times New Roman" w:hAnsi="Times New Roman" w:cs="Times New Roman"/>
-          <w:i/>
-          <w:sz w:val="24"/>
-          <w:szCs w:val="24"/>
-        </w:rPr>
-        <w:t>et al.</w:t>
-      </w:r>
-      <w:r>
-        <w:rPr>
-          <w:rFonts w:ascii="Times New Roman" w:eastAsia="Times New Roman" w:hAnsi="Times New Roman" w:cs="Times New Roman"/>
-          <w:sz w:val="24"/>
-          <w:szCs w:val="24"/>
-        </w:rPr>
-        <w:t xml:space="preserve"> 2007; Carbayo </w:t>
-      </w:r>
-      <w:r>
-        <w:rPr>
-          <w:rFonts w:ascii="Times New Roman" w:eastAsia="Times New Roman" w:hAnsi="Times New Roman" w:cs="Times New Roman"/>
-          <w:i/>
-          <w:sz w:val="24"/>
-          <w:szCs w:val="24"/>
-        </w:rPr>
-        <w:t>et al.</w:t>
-      </w:r>
-      <w:r>
-        <w:rPr>
-          <w:rFonts w:ascii="Times New Roman" w:eastAsia="Times New Roman" w:hAnsi="Times New Roman" w:cs="Times New Roman"/>
-          <w:sz w:val="24"/>
-          <w:szCs w:val="24"/>
-        </w:rPr>
-        <w:t xml:space="preserve"> 2008; Eagles-Smith </w:t>
-      </w:r>
-      <w:r>
-        <w:rPr>
-          <w:rFonts w:ascii="Times New Roman" w:eastAsia="Times New Roman" w:hAnsi="Times New Roman" w:cs="Times New Roman"/>
-          <w:i/>
-          <w:sz w:val="24"/>
-          <w:szCs w:val="24"/>
-        </w:rPr>
-        <w:t>et al.</w:t>
-      </w:r>
-      <w:r>
-        <w:rPr>
-          <w:rFonts w:ascii="Times New Roman" w:eastAsia="Times New Roman" w:hAnsi="Times New Roman" w:cs="Times New Roman"/>
-          <w:sz w:val="24"/>
-          <w:szCs w:val="24"/>
-        </w:rPr>
-        <w:t xml:space="preserve"> 2008; Gerard </w:t>
-      </w:r>
-      <w:r>
-        <w:rPr>
-          <w:rFonts w:ascii="Times New Roman" w:eastAsia="Times New Roman" w:hAnsi="Times New Roman" w:cs="Times New Roman"/>
-          <w:i/>
-          <w:sz w:val="24"/>
-          <w:szCs w:val="24"/>
-        </w:rPr>
-        <w:t>et al.</w:t>
-      </w:r>
-      <w:r>
-        <w:rPr>
-          <w:rFonts w:ascii="Times New Roman" w:eastAsia="Times New Roman" w:hAnsi="Times New Roman" w:cs="Times New Roman"/>
-          <w:sz w:val="24"/>
-          <w:szCs w:val="24"/>
-        </w:rPr>
-        <w:t xml:space="preserve"> 2010; Hershberger </w:t>
-      </w:r>
-      <w:r>
-        <w:rPr>
-          <w:rFonts w:ascii="Times New Roman" w:eastAsia="Times New Roman" w:hAnsi="Times New Roman" w:cs="Times New Roman"/>
-          <w:i/>
-          <w:sz w:val="24"/>
-          <w:szCs w:val="24"/>
-        </w:rPr>
-        <w:t>et al.</w:t>
-      </w:r>
-      <w:r>
-        <w:rPr>
-          <w:rFonts w:ascii="Times New Roman" w:eastAsia="Times New Roman" w:hAnsi="Times New Roman" w:cs="Times New Roman"/>
-          <w:sz w:val="24"/>
-          <w:szCs w:val="24"/>
-        </w:rPr>
-        <w:t xml:space="preserve"> 2010; Moncayo-Estrada </w:t>
-      </w:r>
-      <w:r>
-        <w:rPr>
-          <w:rFonts w:ascii="Times New Roman" w:eastAsia="Times New Roman" w:hAnsi="Times New Roman" w:cs="Times New Roman"/>
-          <w:i/>
-          <w:sz w:val="24"/>
-          <w:szCs w:val="24"/>
-        </w:rPr>
-        <w:t>et al.</w:t>
-      </w:r>
-      <w:r>
-        <w:rPr>
-          <w:rFonts w:ascii="Times New Roman" w:eastAsia="Times New Roman" w:hAnsi="Times New Roman" w:cs="Times New Roman"/>
-          <w:sz w:val="24"/>
-          <w:szCs w:val="24"/>
-        </w:rPr>
-        <w:t xml:space="preserve"> 2012; Moore </w:t>
-      </w:r>
-      <w:r>
-        <w:rPr>
-          <w:rFonts w:ascii="Times New Roman" w:eastAsia="Times New Roman" w:hAnsi="Times New Roman" w:cs="Times New Roman"/>
-          <w:i/>
-          <w:sz w:val="24"/>
-          <w:szCs w:val="24"/>
-        </w:rPr>
-        <w:t>et al.</w:t>
-      </w:r>
-      <w:r>
-        <w:rPr>
-          <w:rFonts w:ascii="Times New Roman" w:eastAsia="Times New Roman" w:hAnsi="Times New Roman" w:cs="Times New Roman"/>
-          <w:sz w:val="24"/>
-          <w:szCs w:val="24"/>
-        </w:rPr>
-        <w:t xml:space="preserve"> 2012; Dunlop &amp; Riley 2013; Gustaveson &amp; Blommer 2013; Morris </w:t>
-      </w:r>
-      <w:r>
-        <w:rPr>
-          <w:rFonts w:ascii="Times New Roman" w:eastAsia="Times New Roman" w:hAnsi="Times New Roman" w:cs="Times New Roman"/>
-          <w:i/>
-          <w:sz w:val="24"/>
-          <w:szCs w:val="24"/>
-        </w:rPr>
-        <w:t>et al.</w:t>
-      </w:r>
-      <w:r>
-        <w:rPr>
-          <w:rFonts w:ascii="Times New Roman" w:eastAsia="Times New Roman" w:hAnsi="Times New Roman" w:cs="Times New Roman"/>
-          <w:sz w:val="24"/>
-          <w:szCs w:val="24"/>
-        </w:rPr>
-        <w:t xml:space="preserve"> 2013; Sandlund </w:t>
-      </w:r>
-      <w:r>
-        <w:rPr>
-          <w:rFonts w:ascii="Times New Roman" w:eastAsia="Times New Roman" w:hAnsi="Times New Roman" w:cs="Times New Roman"/>
-          <w:i/>
-          <w:sz w:val="24"/>
-          <w:szCs w:val="24"/>
-        </w:rPr>
-        <w:t>et al.</w:t>
-      </w:r>
-      <w:r>
-        <w:rPr>
-          <w:rFonts w:ascii="Times New Roman" w:eastAsia="Times New Roman" w:hAnsi="Times New Roman" w:cs="Times New Roman"/>
-          <w:sz w:val="24"/>
-          <w:szCs w:val="24"/>
-        </w:rPr>
-        <w:t xml:space="preserve"> 2013; Yerli </w:t>
-      </w:r>
-      <w:r>
-        <w:rPr>
-          <w:rFonts w:ascii="Times New Roman" w:eastAsia="Times New Roman" w:hAnsi="Times New Roman" w:cs="Times New Roman"/>
-          <w:i/>
-          <w:sz w:val="24"/>
-          <w:szCs w:val="24"/>
-        </w:rPr>
-        <w:t>et al.</w:t>
-      </w:r>
-      <w:r>
-        <w:rPr>
-          <w:rFonts w:ascii="Times New Roman" w:eastAsia="Times New Roman" w:hAnsi="Times New Roman" w:cs="Times New Roman"/>
-          <w:sz w:val="24"/>
-          <w:szCs w:val="24"/>
-        </w:rPr>
-        <w:t xml:space="preserve"> </w:t>
-      </w:r>
-      <w:r>
-        <w:rPr>
-          <w:rFonts w:ascii="Times New Roman" w:eastAsia="Times New Roman" w:hAnsi="Times New Roman" w:cs="Times New Roman"/>
-          <w:sz w:val="24"/>
-          <w:szCs w:val="24"/>
-        </w:rPr>
-        <w:lastRenderedPageBreak/>
-        <w:t xml:space="preserve">2013; Sandström </w:t>
-      </w:r>
-      <w:r>
-        <w:rPr>
-          <w:rFonts w:ascii="Times New Roman" w:eastAsia="Times New Roman" w:hAnsi="Times New Roman" w:cs="Times New Roman"/>
-          <w:i/>
-          <w:sz w:val="24"/>
-          <w:szCs w:val="24"/>
-        </w:rPr>
-        <w:t>et al.</w:t>
-      </w:r>
-      <w:r>
-        <w:rPr>
-          <w:rFonts w:ascii="Times New Roman" w:eastAsia="Times New Roman" w:hAnsi="Times New Roman" w:cs="Times New Roman"/>
-          <w:sz w:val="24"/>
-          <w:szCs w:val="24"/>
-        </w:rPr>
-        <w:t xml:space="preserve"> 2014; Dexter </w:t>
-      </w:r>
-      <w:r>
-        <w:rPr>
-          <w:rFonts w:ascii="Times New Roman" w:eastAsia="Times New Roman" w:hAnsi="Times New Roman" w:cs="Times New Roman"/>
-          <w:i/>
-          <w:sz w:val="24"/>
-          <w:szCs w:val="24"/>
-        </w:rPr>
-        <w:t>et al.</w:t>
-      </w:r>
-      <w:r>
-        <w:rPr>
-          <w:rFonts w:ascii="Times New Roman" w:eastAsia="Times New Roman" w:hAnsi="Times New Roman" w:cs="Times New Roman"/>
-          <w:sz w:val="24"/>
-          <w:szCs w:val="24"/>
-        </w:rPr>
-        <w:t xml:space="preserve"> 2015; Kauppi </w:t>
-      </w:r>
-      <w:r>
-        <w:rPr>
-          <w:rFonts w:ascii="Times New Roman" w:eastAsia="Times New Roman" w:hAnsi="Times New Roman" w:cs="Times New Roman"/>
-          <w:i/>
-          <w:sz w:val="24"/>
-          <w:szCs w:val="24"/>
-        </w:rPr>
-        <w:t>et al.</w:t>
-      </w:r>
-      <w:r>
-        <w:rPr>
-          <w:rFonts w:ascii="Times New Roman" w:eastAsia="Times New Roman" w:hAnsi="Times New Roman" w:cs="Times New Roman"/>
-          <w:sz w:val="24"/>
-          <w:szCs w:val="24"/>
-        </w:rPr>
-        <w:t xml:space="preserve"> 2015; Cecere </w:t>
-      </w:r>
-      <w:r>
-        <w:rPr>
-          <w:rFonts w:ascii="Times New Roman" w:eastAsia="Times New Roman" w:hAnsi="Times New Roman" w:cs="Times New Roman"/>
-          <w:i/>
-          <w:sz w:val="24"/>
-          <w:szCs w:val="24"/>
-        </w:rPr>
-        <w:t>et al.</w:t>
-      </w:r>
-      <w:r>
-        <w:rPr>
-          <w:rFonts w:ascii="Times New Roman" w:eastAsia="Times New Roman" w:hAnsi="Times New Roman" w:cs="Times New Roman"/>
-          <w:sz w:val="24"/>
-          <w:szCs w:val="24"/>
-        </w:rPr>
-        <w:t xml:space="preserve"> 2016; Korman </w:t>
-      </w:r>
-      <w:r>
-        <w:rPr>
-          <w:rFonts w:ascii="Times New Roman" w:eastAsia="Times New Roman" w:hAnsi="Times New Roman" w:cs="Times New Roman"/>
-          <w:i/>
-          <w:sz w:val="24"/>
-          <w:szCs w:val="24"/>
-        </w:rPr>
-        <w:t>et al.</w:t>
-      </w:r>
-      <w:r>
-        <w:rPr>
-          <w:rFonts w:ascii="Times New Roman" w:eastAsia="Times New Roman" w:hAnsi="Times New Roman" w:cs="Times New Roman"/>
-          <w:sz w:val="24"/>
-          <w:szCs w:val="24"/>
-        </w:rPr>
-        <w:t xml:space="preserve"> 2017; Wegner </w:t>
-      </w:r>
-      <w:r>
-        <w:rPr>
-          <w:rFonts w:ascii="Times New Roman" w:eastAsia="Times New Roman" w:hAnsi="Times New Roman" w:cs="Times New Roman"/>
-          <w:i/>
-          <w:sz w:val="24"/>
-          <w:szCs w:val="24"/>
-        </w:rPr>
-        <w:t>et al.</w:t>
-      </w:r>
-      <w:r>
-        <w:rPr>
-          <w:rFonts w:ascii="Times New Roman" w:eastAsia="Times New Roman" w:hAnsi="Times New Roman" w:cs="Times New Roman"/>
-          <w:sz w:val="24"/>
-          <w:szCs w:val="24"/>
-        </w:rPr>
-        <w:t xml:space="preserve"> 2019; Fernández 2020; Haubrock </w:t>
-      </w:r>
-      <w:r>
-        <w:rPr>
-          <w:rFonts w:ascii="Times New Roman" w:eastAsia="Times New Roman" w:hAnsi="Times New Roman" w:cs="Times New Roman"/>
-          <w:i/>
-          <w:sz w:val="24"/>
-          <w:szCs w:val="24"/>
-        </w:rPr>
-        <w:t>et al.</w:t>
-      </w:r>
-      <w:r>
-        <w:rPr>
-          <w:rFonts w:ascii="Times New Roman" w:eastAsia="Times New Roman" w:hAnsi="Times New Roman" w:cs="Times New Roman"/>
-          <w:sz w:val="24"/>
-          <w:szCs w:val="24"/>
-        </w:rPr>
-        <w:t xml:space="preserve"> 2022).  Nine of these studies included only one survey after the population declined (Boggs </w:t>
-      </w:r>
-      <w:r>
-        <w:rPr>
-          <w:rFonts w:ascii="Times New Roman" w:eastAsia="Times New Roman" w:hAnsi="Times New Roman" w:cs="Times New Roman"/>
-          <w:i/>
-          <w:sz w:val="24"/>
-          <w:szCs w:val="24"/>
-        </w:rPr>
-        <w:t>et al.</w:t>
-      </w:r>
-      <w:r>
-        <w:rPr>
-          <w:rFonts w:ascii="Times New Roman" w:eastAsia="Times New Roman" w:hAnsi="Times New Roman" w:cs="Times New Roman"/>
-          <w:sz w:val="24"/>
-          <w:szCs w:val="24"/>
-        </w:rPr>
-        <w:t xml:space="preserve"> 2006; Letnic &amp; Dickman 2006; Daskalov </w:t>
-      </w:r>
-      <w:r>
-        <w:rPr>
-          <w:rFonts w:ascii="Times New Roman" w:eastAsia="Times New Roman" w:hAnsi="Times New Roman" w:cs="Times New Roman"/>
-          <w:i/>
-          <w:sz w:val="24"/>
-          <w:szCs w:val="24"/>
-        </w:rPr>
-        <w:t>et al.</w:t>
-      </w:r>
-      <w:r>
-        <w:rPr>
-          <w:rFonts w:ascii="Times New Roman" w:eastAsia="Times New Roman" w:hAnsi="Times New Roman" w:cs="Times New Roman"/>
-          <w:sz w:val="24"/>
-          <w:szCs w:val="24"/>
-        </w:rPr>
-        <w:t xml:space="preserve"> 2007; Hershberger </w:t>
-      </w:r>
-      <w:r>
-        <w:rPr>
-          <w:rFonts w:ascii="Times New Roman" w:eastAsia="Times New Roman" w:hAnsi="Times New Roman" w:cs="Times New Roman"/>
-          <w:i/>
-          <w:sz w:val="24"/>
-          <w:szCs w:val="24"/>
-        </w:rPr>
-        <w:t>et al.</w:t>
-      </w:r>
-      <w:r>
-        <w:rPr>
-          <w:rFonts w:ascii="Times New Roman" w:eastAsia="Times New Roman" w:hAnsi="Times New Roman" w:cs="Times New Roman"/>
-          <w:sz w:val="24"/>
-          <w:szCs w:val="24"/>
-        </w:rPr>
-        <w:t xml:space="preserve"> 2010; Delefosse </w:t>
-      </w:r>
-      <w:r>
-        <w:rPr>
-          <w:rFonts w:ascii="Times New Roman" w:eastAsia="Times New Roman" w:hAnsi="Times New Roman" w:cs="Times New Roman"/>
-          <w:i/>
-          <w:sz w:val="24"/>
-          <w:szCs w:val="24"/>
-        </w:rPr>
-        <w:t>et al.</w:t>
-      </w:r>
-      <w:r>
-        <w:rPr>
-          <w:rFonts w:ascii="Times New Roman" w:eastAsia="Times New Roman" w:hAnsi="Times New Roman" w:cs="Times New Roman"/>
-          <w:sz w:val="24"/>
-          <w:szCs w:val="24"/>
-        </w:rPr>
-        <w:t xml:space="preserve"> 2012; Gustaveson &amp; Blommer 2013; Morris </w:t>
-      </w:r>
-      <w:r>
-        <w:rPr>
-          <w:rFonts w:ascii="Times New Roman" w:eastAsia="Times New Roman" w:hAnsi="Times New Roman" w:cs="Times New Roman"/>
-          <w:i/>
-          <w:sz w:val="24"/>
-          <w:szCs w:val="24"/>
-        </w:rPr>
-        <w:t>et al.</w:t>
-      </w:r>
-      <w:r>
-        <w:rPr>
-          <w:rFonts w:ascii="Times New Roman" w:eastAsia="Times New Roman" w:hAnsi="Times New Roman" w:cs="Times New Roman"/>
-          <w:sz w:val="24"/>
-          <w:szCs w:val="24"/>
-        </w:rPr>
-        <w:t xml:space="preserve"> 2013; Kauppi </w:t>
-      </w:r>
-      <w:r>
-        <w:rPr>
-          <w:rFonts w:ascii="Times New Roman" w:eastAsia="Times New Roman" w:hAnsi="Times New Roman" w:cs="Times New Roman"/>
-          <w:i/>
-          <w:sz w:val="24"/>
-          <w:szCs w:val="24"/>
-        </w:rPr>
-        <w:t>et al.</w:t>
-      </w:r>
-      <w:r>
-        <w:rPr>
-          <w:rFonts w:ascii="Times New Roman" w:eastAsia="Times New Roman" w:hAnsi="Times New Roman" w:cs="Times New Roman"/>
-          <w:sz w:val="24"/>
-          <w:szCs w:val="24"/>
-        </w:rPr>
-        <w:t xml:space="preserve"> 2015; Forsström </w:t>
-      </w:r>
-      <w:r>
-        <w:rPr>
-          <w:rFonts w:ascii="Times New Roman" w:eastAsia="Times New Roman" w:hAnsi="Times New Roman" w:cs="Times New Roman"/>
-          <w:i/>
-          <w:sz w:val="24"/>
-          <w:szCs w:val="24"/>
-        </w:rPr>
-        <w:t>et al.</w:t>
-      </w:r>
-      <w:r>
-        <w:rPr>
-          <w:rFonts w:ascii="Times New Roman" w:eastAsia="Times New Roman" w:hAnsi="Times New Roman" w:cs="Times New Roman"/>
-          <w:sz w:val="24"/>
-          <w:szCs w:val="24"/>
-        </w:rPr>
-        <w:t xml:space="preserve"> 2018).  Interestingly, I found two cases where boom-bust cycles were repeated (Eagles-Smith </w:t>
-      </w:r>
-      <w:r>
-        <w:rPr>
-          <w:rFonts w:ascii="Times New Roman" w:eastAsia="Times New Roman" w:hAnsi="Times New Roman" w:cs="Times New Roman"/>
-          <w:i/>
-          <w:sz w:val="24"/>
-          <w:szCs w:val="24"/>
-        </w:rPr>
-        <w:t>et al.</w:t>
-      </w:r>
-      <w:r>
-        <w:rPr>
-          <w:rFonts w:ascii="Times New Roman" w:eastAsia="Times New Roman" w:hAnsi="Times New Roman" w:cs="Times New Roman"/>
-          <w:sz w:val="24"/>
-          <w:szCs w:val="24"/>
-        </w:rPr>
-        <w:t xml:space="preserve"> 2008; Gherardi </w:t>
-      </w:r>
-      <w:r>
-        <w:rPr>
-          <w:rFonts w:ascii="Times New Roman" w:eastAsia="Times New Roman" w:hAnsi="Times New Roman" w:cs="Times New Roman"/>
-          <w:i/>
-          <w:sz w:val="24"/>
-          <w:szCs w:val="24"/>
-        </w:rPr>
-        <w:t>et al.</w:t>
-      </w:r>
-      <w:r>
-        <w:rPr>
-          <w:rFonts w:ascii="Times New Roman" w:eastAsia="Times New Roman" w:hAnsi="Times New Roman" w:cs="Times New Roman"/>
-          <w:sz w:val="24"/>
-          <w:szCs w:val="24"/>
-        </w:rPr>
-        <w:t xml:space="preserve"> 2011).  Finally, there were two studies where populations reached high abundances but population growth and/or population declines were slow (Magnusdottir </w:t>
-      </w:r>
-      <w:r>
-        <w:rPr>
-          <w:rFonts w:ascii="Times New Roman" w:eastAsia="Times New Roman" w:hAnsi="Times New Roman" w:cs="Times New Roman"/>
-          <w:i/>
-          <w:sz w:val="24"/>
-          <w:szCs w:val="24"/>
-        </w:rPr>
-        <w:t>et al.</w:t>
-      </w:r>
-      <w:r>
-        <w:rPr>
-          <w:rFonts w:ascii="Times New Roman" w:eastAsia="Times New Roman" w:hAnsi="Times New Roman" w:cs="Times New Roman"/>
-          <w:sz w:val="24"/>
-          <w:szCs w:val="24"/>
-        </w:rPr>
-        <w:t xml:space="preserve"> 2014; Bloch </w:t>
-      </w:r>
-      <w:r>
-        <w:rPr>
-          <w:rFonts w:ascii="Times New Roman" w:eastAsia="Times New Roman" w:hAnsi="Times New Roman" w:cs="Times New Roman"/>
-          <w:i/>
-          <w:sz w:val="24"/>
-          <w:szCs w:val="24"/>
-        </w:rPr>
-        <w:t>et al.</w:t>
-      </w:r>
-      <w:r>
-        <w:rPr>
-          <w:rFonts w:ascii="Times New Roman" w:eastAsia="Times New Roman" w:hAnsi="Times New Roman" w:cs="Times New Roman"/>
-          <w:sz w:val="24"/>
-          <w:szCs w:val="24"/>
-        </w:rPr>
-        <w:t xml:space="preserve"> 2019).</w:t>
+          <w:b/>
+          <w:bCs/>
+          <w:sz w:val="24"/>
+          <w:szCs w:val="24"/>
+        </w:rPr>
+        <w:t>Discussion</w:t>
       </w:r>
     </w:p>
     <w:p>
@@ -7221,21 +7438,26 @@
         <w:spacing w:line="480" w:lineRule="auto"/>
         <w:rPr>
           <w:rFonts w:ascii="Times New Roman" w:eastAsia="Times New Roman" w:hAnsi="Times New Roman" w:cs="Times New Roman"/>
-          <w:b/>
-          <w:bCs/>
           <w:sz w:val="24"/>
           <w:szCs w:val="24"/>
         </w:rPr>
       </w:pPr>
-      <w:r>
-        <w:rPr>
-          <w:rFonts w:ascii="Times New Roman" w:eastAsia="Times New Roman" w:hAnsi="Times New Roman" w:cs="Times New Roman"/>
-          <w:b/>
-          <w:bCs/>
-          <w:sz w:val="24"/>
-          <w:szCs w:val="24"/>
-        </w:rPr>
-        <w:t>Discussion</w:t>
+      <w:commentRangeStart w:id="8"/>
+      <w:r>
+        <w:rPr>
+          <w:rFonts w:ascii="Times New Roman" w:eastAsia="Times New Roman" w:hAnsi="Times New Roman" w:cs="Times New Roman"/>
+          <w:i/>
+          <w:sz w:val="24"/>
+          <w:szCs w:val="24"/>
+        </w:rPr>
+        <w:t>Are irruptive dynamics and cyclic populations repeated boom-busts?</w:t>
+      </w:r>
+      <w:commentRangeEnd w:id="8"/>
+      <w:r>
+        <w:rPr>
+          <w:rStyle w:val="CommentReference"/>
+        </w:rPr>
+        <w:commentReference w:id="8"/>
       </w:r>
     </w:p>
     <w:p>
@@ -7247,7 +7469,15 @@
           <w:szCs w:val="24"/>
         </w:rPr>
       </w:pPr>
-      <w:commentRangeStart w:id="7"/>
+      <w:r>
+        <w:rPr>
+          <w:rFonts w:ascii="Times New Roman" w:eastAsia="Times New Roman" w:hAnsi="Times New Roman" w:cs="Times New Roman"/>
+          <w:sz w:val="24"/>
+          <w:szCs w:val="24"/>
+        </w:rPr>
+        <w:tab/>
+        <w:t xml:space="preserve">Another important aspect to consider when clarifying terminology of boom-bust is the potential for occurrences of repeated boom-busts cycles.   Irruptive population dynamics were first identified in arid small mammal populations where populations can persist at low abundance for many years (Pavey </w:t>
+      </w:r>
       <w:r>
         <w:rPr>
           <w:rFonts w:ascii="Times New Roman" w:eastAsia="Times New Roman" w:hAnsi="Times New Roman" w:cs="Times New Roman"/>
@@ -7255,14 +7485,100 @@
           <w:sz w:val="24"/>
           <w:szCs w:val="24"/>
         </w:rPr>
-        <w:t>Are irruptive dynamics and cyclic populations repeated boom-busts?</w:t>
-      </w:r>
-      <w:commentRangeEnd w:id="7"/>
-      <w:r>
-        <w:rPr>
-          <w:rStyle w:val="CommentReference"/>
-        </w:rPr>
-        <w:commentReference w:id="7"/>
+        <w:t>et al.</w:t>
+      </w:r>
+      <w:r>
+        <w:rPr>
+          <w:rFonts w:ascii="Times New Roman" w:eastAsia="Times New Roman" w:hAnsi="Times New Roman" w:cs="Times New Roman"/>
+          <w:sz w:val="24"/>
+          <w:szCs w:val="24"/>
+        </w:rPr>
+        <w:t xml:space="preserve"> 2017; Andreassen </w:t>
+      </w:r>
+      <w:r>
+        <w:rPr>
+          <w:rFonts w:ascii="Times New Roman" w:eastAsia="Times New Roman" w:hAnsi="Times New Roman" w:cs="Times New Roman"/>
+          <w:i/>
+          <w:sz w:val="24"/>
+          <w:szCs w:val="24"/>
+        </w:rPr>
+        <w:t>et al.</w:t>
+      </w:r>
+      <w:r>
+        <w:rPr>
+          <w:rFonts w:ascii="Times New Roman" w:eastAsia="Times New Roman" w:hAnsi="Times New Roman" w:cs="Times New Roman"/>
+          <w:sz w:val="24"/>
+          <w:szCs w:val="24"/>
+        </w:rPr>
+        <w:t xml:space="preserve"> 2021). Then, in response to stochastic events of high abnormal rainfall, these small mammal populations irrupt to states of high abundances (Letnic &amp; Dickman 2006).  In reference to persistence (or sustained) low abundances and the rapid growth and declines exhibited in these dynamics (Andreassen </w:t>
+      </w:r>
+      <w:r>
+        <w:rPr>
+          <w:rFonts w:ascii="Times New Roman" w:eastAsia="Times New Roman" w:hAnsi="Times New Roman" w:cs="Times New Roman"/>
+          <w:i/>
+          <w:sz w:val="24"/>
+          <w:szCs w:val="24"/>
+        </w:rPr>
+        <w:t>et al.</w:t>
+      </w:r>
+      <w:r>
+        <w:rPr>
+          <w:rFonts w:ascii="Times New Roman" w:eastAsia="Times New Roman" w:hAnsi="Times New Roman" w:cs="Times New Roman"/>
+          <w:sz w:val="24"/>
+          <w:szCs w:val="24"/>
+        </w:rPr>
+        <w:t xml:space="preserve"> 2021) which are a necessary criteria that I previously proposed, I choose to use “irruptive population dynamics” as the term to describe repeated boom-bust cycles in invasions. Furthermore, non-native common house mice (</w:t>
+      </w:r>
+      <w:r>
+        <w:rPr>
+          <w:rFonts w:ascii="Times New Roman" w:eastAsia="Times New Roman" w:hAnsi="Times New Roman" w:cs="Times New Roman"/>
+          <w:i/>
+          <w:sz w:val="24"/>
+          <w:szCs w:val="24"/>
+        </w:rPr>
+        <w:t>Mus musculus</w:t>
+      </w:r>
+      <w:r>
+        <w:rPr>
+          <w:rFonts w:ascii="Times New Roman" w:eastAsia="Times New Roman" w:hAnsi="Times New Roman" w:cs="Times New Roman"/>
+          <w:sz w:val="24"/>
+          <w:szCs w:val="24"/>
+        </w:rPr>
+        <w:t xml:space="preserve">) have also been documented to exhibit irruptive population dynamics in these same regions (Breed </w:t>
+      </w:r>
+      <w:r>
+        <w:rPr>
+          <w:rFonts w:ascii="Times New Roman" w:eastAsia="Times New Roman" w:hAnsi="Times New Roman" w:cs="Times New Roman"/>
+          <w:i/>
+          <w:sz w:val="24"/>
+          <w:szCs w:val="24"/>
+        </w:rPr>
+        <w:t>et al.</w:t>
+      </w:r>
+      <w:r>
+        <w:rPr>
+          <w:rFonts w:ascii="Times New Roman" w:eastAsia="Times New Roman" w:hAnsi="Times New Roman" w:cs="Times New Roman"/>
+          <w:sz w:val="24"/>
+          <w:szCs w:val="24"/>
+        </w:rPr>
+        <w:t xml:space="preserve"> 2017; Bennison </w:t>
+      </w:r>
+      <w:r>
+        <w:rPr>
+          <w:rFonts w:ascii="Times New Roman" w:eastAsia="Times New Roman" w:hAnsi="Times New Roman" w:cs="Times New Roman"/>
+          <w:i/>
+          <w:sz w:val="24"/>
+          <w:szCs w:val="24"/>
+        </w:rPr>
+        <w:t>et al.</w:t>
+      </w:r>
+      <w:r>
+        <w:rPr>
+          <w:rFonts w:ascii="Times New Roman" w:eastAsia="Times New Roman" w:hAnsi="Times New Roman" w:cs="Times New Roman"/>
+          <w:sz w:val="24"/>
+          <w:szCs w:val="24"/>
+        </w:rPr>
+        <w:t xml:space="preserve"> 2018).</w:t>
       </w:r>
     </w:p>
     <w:p>
@@ -7281,7 +7597,16 @@
           <w:szCs w:val="24"/>
         </w:rPr>
         <w:tab/>
-        <w:t xml:space="preserve">Another important aspect to consider when clarifying terminology of boom-bust is the potential for occurrences of repeated boom-busts cycles.   Irruptive population dynamics were first identified in arid small mammal populations where populations can persist at low abundance for many years (Pavey </w:t>
+        <w:t xml:space="preserve">In contrast to irruptive population dynamics, I do not classify cyclic population dynamics in invasive species as repeated boom-bust cycles. Cyclic population dynamics undergo regular fluctuations of population size (Myers 2018). Although the rate of population increase and decline during the fluctuations in abundance might meet the criteria for boom-bust cycles, declines during fluctuations rarely are sustained and severe.  I interpret cyclic population dynamics in invasions as the natural variation in the established/boom phases of invasions (Figure 1). Fluctuations akin to cyclic dynamics have been reported in non-native populations </w:t>
+      </w:r>
+      <w:r>
+        <w:rPr>
+          <w:rFonts w:ascii="Times New Roman" w:eastAsia="Times New Roman" w:hAnsi="Times New Roman" w:cs="Times New Roman"/>
+          <w:sz w:val="24"/>
+          <w:szCs w:val="24"/>
+        </w:rPr>
+        <w:lastRenderedPageBreak/>
+        <w:t xml:space="preserve">during invasions (Strayer &amp; Malcom 2006; Kaeuffer </w:t>
       </w:r>
       <w:r>
         <w:rPr>
@@ -7298,7 +7623,7 @@
           <w:sz w:val="24"/>
           <w:szCs w:val="24"/>
         </w:rPr>
-        <w:t xml:space="preserve"> 2017; Andreassen </w:t>
+        <w:t xml:space="preserve"> 2009; Moncayo-Estrada </w:t>
       </w:r>
       <w:r>
         <w:rPr>
@@ -7315,7 +7640,7 @@
           <w:sz w:val="24"/>
           <w:szCs w:val="24"/>
         </w:rPr>
-        <w:t xml:space="preserve"> 2021). Then, in response to stochastic events of high abnormal rainfall, these small mammal populations irrupt to states of high abundances (Letnic &amp; Dickman 2006).  In reference to persistence (or sustained) low abundances and the rapid growth and declines exhibited in these dynamics (Andreassen </w:t>
+        <w:t xml:space="preserve"> 2012; Dexter </w:t>
       </w:r>
       <w:r>
         <w:rPr>
@@ -7332,7 +7657,7 @@
           <w:sz w:val="24"/>
           <w:szCs w:val="24"/>
         </w:rPr>
-        <w:t xml:space="preserve"> 2021) which are a necessary criteria that I previously proposed, I choose to use “irruptive population dynamics” as the term to describe repeated boom-bust cycles in invasions. Furthermore, non-native common house mice (</w:t>
+        <w:t xml:space="preserve"> 2015; Lester </w:t>
       </w:r>
       <w:r>
         <w:rPr>
@@ -7341,23 +7666,6 @@
           <w:sz w:val="24"/>
           <w:szCs w:val="24"/>
         </w:rPr>
-        <w:t>Mus musculus</w:t>
-      </w:r>
-      <w:r>
-        <w:rPr>
-          <w:rFonts w:ascii="Times New Roman" w:eastAsia="Times New Roman" w:hAnsi="Times New Roman" w:cs="Times New Roman"/>
-          <w:sz w:val="24"/>
-          <w:szCs w:val="24"/>
-        </w:rPr>
-        <w:t xml:space="preserve">) have also been documented to exhibit irruptive population dynamics in these same regions (Breed </w:t>
-      </w:r>
-      <w:r>
-        <w:rPr>
-          <w:rFonts w:ascii="Times New Roman" w:eastAsia="Times New Roman" w:hAnsi="Times New Roman" w:cs="Times New Roman"/>
-          <w:i/>
-          <w:sz w:val="24"/>
-          <w:szCs w:val="24"/>
-        </w:rPr>
         <w:t>et al.</w:t>
       </w:r>
       <w:r>
@@ -7366,24 +7674,7 @@
           <w:sz w:val="24"/>
           <w:szCs w:val="24"/>
         </w:rPr>
-        <w:t xml:space="preserve"> 2017; Bennison </w:t>
-      </w:r>
-      <w:r>
-        <w:rPr>
-          <w:rFonts w:ascii="Times New Roman" w:eastAsia="Times New Roman" w:hAnsi="Times New Roman" w:cs="Times New Roman"/>
-          <w:i/>
-          <w:sz w:val="24"/>
-          <w:szCs w:val="24"/>
-        </w:rPr>
-        <w:t>et al.</w:t>
-      </w:r>
-      <w:r>
-        <w:rPr>
-          <w:rFonts w:ascii="Times New Roman" w:eastAsia="Times New Roman" w:hAnsi="Times New Roman" w:cs="Times New Roman"/>
-          <w:sz w:val="24"/>
-          <w:szCs w:val="24"/>
-        </w:rPr>
-        <w:t xml:space="preserve"> 2018).</w:t>
+        <w:t xml:space="preserve"> 2017). Although rare, it may be possible that boom-bust cycles repeat at regular intervals rather than stochastically like population irruptions.  In this case, I would name these “cyclic irruptions” in reference to the sustained nature of the population declines between cycles.  </w:t>
       </w:r>
     </w:p>
     <w:p>
@@ -7391,6 +7682,9 @@
         <w:spacing w:line="480" w:lineRule="auto"/>
         <w:rPr>
           <w:rFonts w:ascii="Times New Roman" w:eastAsia="Times New Roman" w:hAnsi="Times New Roman" w:cs="Times New Roman"/>
+          <w:bCs/>
+          <w:i/>
+          <w:iCs/>
           <w:sz w:val="24"/>
           <w:szCs w:val="24"/>
         </w:rPr>
@@ -7398,205 +7692,136 @@
       <w:r>
         <w:rPr>
           <w:rFonts w:ascii="Times New Roman" w:eastAsia="Times New Roman" w:hAnsi="Times New Roman" w:cs="Times New Roman"/>
-          <w:sz w:val="24"/>
-          <w:szCs w:val="24"/>
-        </w:rPr>
-        <w:lastRenderedPageBreak/>
-        <w:tab/>
-        <w:t xml:space="preserve">In contrast to irruptive population dynamics, I do not classify cyclic population dynamics in invasive species as repeated boom-bust cycles. Cyclic population dynamics undergo regular fluctuations of population size (Myers 2018). Although the rate of population increase and decline during the fluctuations in abundance might meet the criteria for boom-bust cycles, declines during fluctuations rarely are sustained and severe.  I interpret cyclic population dynamics in invasions as the natural variation in the established/boom phases of invasions (Figure 1). Fluctuations akin to cyclic dynamics have been reported in non-native populations during invasions (Strayer &amp; Malcom 2006; Kaeuffer </w:t>
-      </w:r>
-      <w:r>
-        <w:rPr>
-          <w:rFonts w:ascii="Times New Roman" w:eastAsia="Times New Roman" w:hAnsi="Times New Roman" w:cs="Times New Roman"/>
+          <w:bCs/>
           <w:i/>
-          <w:sz w:val="24"/>
-          <w:szCs w:val="24"/>
-        </w:rPr>
-        <w:t>et al.</w:t>
-      </w:r>
-      <w:r>
-        <w:rPr>
-          <w:rFonts w:ascii="Times New Roman" w:eastAsia="Times New Roman" w:hAnsi="Times New Roman" w:cs="Times New Roman"/>
-          <w:sz w:val="24"/>
-          <w:szCs w:val="24"/>
-        </w:rPr>
-        <w:t xml:space="preserve"> 2009; Moncayo-Estrada </w:t>
-      </w:r>
-      <w:r>
-        <w:rPr>
-          <w:rFonts w:ascii="Times New Roman" w:eastAsia="Times New Roman" w:hAnsi="Times New Roman" w:cs="Times New Roman"/>
-          <w:i/>
-          <w:sz w:val="24"/>
-          <w:szCs w:val="24"/>
-        </w:rPr>
-        <w:t>et al.</w:t>
-      </w:r>
-      <w:r>
-        <w:rPr>
-          <w:rFonts w:ascii="Times New Roman" w:eastAsia="Times New Roman" w:hAnsi="Times New Roman" w:cs="Times New Roman"/>
-          <w:sz w:val="24"/>
-          <w:szCs w:val="24"/>
-        </w:rPr>
-        <w:t xml:space="preserve"> 2012; Dexter </w:t>
-      </w:r>
-      <w:r>
-        <w:rPr>
-          <w:rFonts w:ascii="Times New Roman" w:eastAsia="Times New Roman" w:hAnsi="Times New Roman" w:cs="Times New Roman"/>
-          <w:i/>
-          <w:sz w:val="24"/>
-          <w:szCs w:val="24"/>
-        </w:rPr>
-        <w:t>et al.</w:t>
-      </w:r>
-      <w:r>
-        <w:rPr>
-          <w:rFonts w:ascii="Times New Roman" w:eastAsia="Times New Roman" w:hAnsi="Times New Roman" w:cs="Times New Roman"/>
-          <w:sz w:val="24"/>
-          <w:szCs w:val="24"/>
-        </w:rPr>
-        <w:t xml:space="preserve"> 2015; Lester </w:t>
-      </w:r>
-      <w:r>
-        <w:rPr>
-          <w:rFonts w:ascii="Times New Roman" w:eastAsia="Times New Roman" w:hAnsi="Times New Roman" w:cs="Times New Roman"/>
-          <w:i/>
-          <w:sz w:val="24"/>
-          <w:szCs w:val="24"/>
-        </w:rPr>
-        <w:t>et al.</w:t>
-      </w:r>
-      <w:r>
-        <w:rPr>
-          <w:rFonts w:ascii="Times New Roman" w:eastAsia="Times New Roman" w:hAnsi="Times New Roman" w:cs="Times New Roman"/>
-          <w:sz w:val="24"/>
-          <w:szCs w:val="24"/>
-        </w:rPr>
-        <w:t xml:space="preserve"> 2017). Although rare, it may be possible that boom-bust cycles repeat at regular intervals rather than stochastically like population irruptions.  In this case, I would name these “cyclic irruptions” in reference to the sustained nature of the population declines between cycles.  </w:t>
+          <w:iCs/>
+          <w:sz w:val="24"/>
+          <w:szCs w:val="24"/>
+        </w:rPr>
+        <w:t>Conclusions</w:t>
       </w:r>
     </w:p>
     <w:p>
       <w:pPr>
         <w:spacing w:line="480" w:lineRule="auto"/>
         <w:rPr>
-          <w:rFonts w:ascii="Times New Roman" w:eastAsia="Times New Roman" w:hAnsi="Times New Roman" w:cs="Times New Roman"/>
-          <w:bCs/>
+          <w:rFonts w:ascii="Times New Roman" w:eastAsia="Gungsuh" w:hAnsi="Times New Roman" w:cs="Times New Roman"/>
+          <w:sz w:val="24"/>
+          <w:szCs w:val="24"/>
+        </w:rPr>
+      </w:pPr>
+      <w:r>
+        <w:rPr>
+          <w:rFonts w:ascii="Times New Roman" w:eastAsia="Times New Roman" w:hAnsi="Times New Roman" w:cs="Times New Roman"/>
+          <w:sz w:val="24"/>
+          <w:szCs w:val="24"/>
+        </w:rPr>
+        <w:tab/>
+        <w:t>Overall, I quantitatively define boom-bust cycles in invasions as a sequence of three phases 1) lag/growth phase, 2) boom phase, and 3) bust phase (Figure 1) where the transition between the growth and boom phase must be rapid (</w:t>
+      </w:r>
+      <w:r>
+        <w:rPr>
+          <w:rFonts w:ascii="Times New Roman" w:eastAsia="Times New Roman" w:hAnsi="Times New Roman" w:cs="Times New Roman"/>
+          <w:sz w:val="24"/>
+          <w:szCs w:val="24"/>
+        </w:rPr>
+        <w:t>λ</w:t>
+      </w:r>
+      <w:r>
+        <w:rPr>
+          <w:rFonts w:ascii="Times New Roman" w:eastAsia="Times New Roman" w:hAnsi="Times New Roman" w:cs="Times New Roman"/>
+          <w:sz w:val="24"/>
+          <w:szCs w:val="24"/>
+        </w:rPr>
+        <w:t xml:space="preserve"> ≥ </w:t>
+      </w:r>
+      <w:r>
+        <w:rPr>
+          <w:rFonts w:ascii="Times New Roman" w:eastAsia="Times New Roman" w:hAnsi="Times New Roman" w:cs="Times New Roman"/>
+          <w:sz w:val="24"/>
+          <w:szCs w:val="24"/>
+        </w:rPr>
+        <w:t>2</w:t>
+      </w:r>
+      <w:r>
+        <w:rPr>
+          <w:rFonts w:ascii="Times New Roman" w:eastAsia="Times New Roman" w:hAnsi="Times New Roman" w:cs="Times New Roman"/>
+          <w:sz w:val="24"/>
+          <w:szCs w:val="24"/>
+        </w:rPr>
+        <w:t xml:space="preserve">; </w:t>
+      </w:r>
+      <w:r>
+        <w:rPr>
+          <w:rFonts w:ascii="Times New Roman" w:eastAsia="Times New Roman" w:hAnsi="Times New Roman" w:cs="Times New Roman"/>
           <w:i/>
-          <w:iCs/>
-          <w:sz w:val="24"/>
-          <w:szCs w:val="24"/>
-        </w:rPr>
-      </w:pPr>
-      <w:r>
-        <w:rPr>
-          <w:rFonts w:ascii="Times New Roman" w:eastAsia="Times New Roman" w:hAnsi="Times New Roman" w:cs="Times New Roman"/>
-          <w:bCs/>
+          <w:sz w:val="24"/>
+          <w:szCs w:val="24"/>
+        </w:rPr>
+        <w:t>r</w:t>
+      </w:r>
+      <w:r>
+        <w:rPr>
+          <w:rFonts w:ascii="Times New Roman" w:eastAsia="Times New Roman" w:hAnsi="Times New Roman" w:cs="Times New Roman"/>
+          <w:sz w:val="24"/>
+          <w:szCs w:val="24"/>
+        </w:rPr>
+        <w:t xml:space="preserve"> ≥1.386), and the transition from the boom to the bust phase must be rapid (0 &lt; </w:t>
+      </w:r>
+      <w:r>
+        <w:rPr>
+          <w:rFonts w:ascii="Times New Roman" w:eastAsia="Times New Roman" w:hAnsi="Times New Roman" w:cs="Times New Roman"/>
+          <w:sz w:val="24"/>
+          <w:szCs w:val="24"/>
+        </w:rPr>
+        <w:t>λ</w:t>
+      </w:r>
+      <w:r>
+        <w:rPr>
+          <w:rFonts w:ascii="Times New Roman" w:eastAsia="Times New Roman" w:hAnsi="Times New Roman" w:cs="Times New Roman"/>
+          <w:sz w:val="24"/>
+          <w:szCs w:val="24"/>
+        </w:rPr>
+        <w:t xml:space="preserve"> ≤ 0.372;  </w:t>
+      </w:r>
+      <w:r>
+        <w:rPr>
+          <w:rFonts w:ascii="Times New Roman" w:eastAsia="Times New Roman" w:hAnsi="Times New Roman" w:cs="Times New Roman"/>
           <w:i/>
-          <w:iCs/>
-          <w:sz w:val="24"/>
-          <w:szCs w:val="24"/>
-        </w:rPr>
-        <w:t>Conclusions</w:t>
+          <w:sz w:val="24"/>
+          <w:szCs w:val="24"/>
+        </w:rPr>
+        <w:t>r</w:t>
+      </w:r>
+      <w:r>
+        <w:rPr>
+          <w:rFonts w:ascii="Times New Roman" w:eastAsia="Gungsuh" w:hAnsi="Times New Roman" w:cs="Times New Roman"/>
+          <w:sz w:val="24"/>
+          <w:szCs w:val="24"/>
+        </w:rPr>
+        <w:t xml:space="preserve"> ≤ -0.99), severe (≥ 90%), and sustained (≥3 years; Figure 1). These criteria narrowed the definition of boom-bust cycles which potentially could help find mechanisms general to these phenomena. I also provide metrics that describe boom-busts cycles that could facilitate comparison across species and locations.  Using these criteria, I identified 28 studies demonstrating boom-bust cycles with 2 studies exhibiting repeated boom-bust cycles.</w:t>
       </w:r>
     </w:p>
     <w:p>
       <w:pPr>
         <w:spacing w:line="480" w:lineRule="auto"/>
         <w:rPr>
+          <w:rFonts w:ascii="Times New Roman" w:eastAsia="Times New Roman" w:hAnsi="Times New Roman" w:cs="Times New Roman"/>
+          <w:b/>
+          <w:bCs/>
+          <w:sz w:val="24"/>
+          <w:szCs w:val="24"/>
+        </w:rPr>
+      </w:pPr>
+      <w:r>
+        <w:rPr>
           <w:rFonts w:ascii="Times New Roman" w:eastAsia="Gungsuh" w:hAnsi="Times New Roman" w:cs="Times New Roman"/>
-          <w:sz w:val="24"/>
-          <w:szCs w:val="24"/>
-        </w:rPr>
-      </w:pPr>
-      <w:r>
-        <w:rPr>
-          <w:rFonts w:ascii="Times New Roman" w:eastAsia="Times New Roman" w:hAnsi="Times New Roman" w:cs="Times New Roman"/>
-          <w:sz w:val="24"/>
-          <w:szCs w:val="24"/>
-        </w:rPr>
-        <w:tab/>
-        <w:t>Overall, I quantitatively define boom-bust cycles in invasions as a sequence of three phases 1) lag/growth phase, 2) boom phase, and 3) bust phase (Figure 1) where the transition between the growth and boom phase must be rapid (</w:t>
-      </w:r>
-      <w:r>
-        <w:rPr>
-          <w:rFonts w:ascii="Times New Roman" w:eastAsia="Times New Roman" w:hAnsi="Times New Roman" w:cs="Times New Roman"/>
-          <w:sz w:val="24"/>
-          <w:szCs w:val="24"/>
-        </w:rPr>
-        <w:t>λ</w:t>
-      </w:r>
-      <w:r>
-        <w:rPr>
-          <w:rFonts w:ascii="Times New Roman" w:eastAsia="Times New Roman" w:hAnsi="Times New Roman" w:cs="Times New Roman"/>
-          <w:sz w:val="24"/>
-          <w:szCs w:val="24"/>
-        </w:rPr>
-        <w:t xml:space="preserve"> ≥ </w:t>
-      </w:r>
-      <w:r>
-        <w:rPr>
-          <w:rFonts w:ascii="Times New Roman" w:eastAsia="Times New Roman" w:hAnsi="Times New Roman" w:cs="Times New Roman"/>
-          <w:sz w:val="24"/>
-          <w:szCs w:val="24"/>
-        </w:rPr>
-        <w:t>2</w:t>
-      </w:r>
-      <w:r>
-        <w:rPr>
-          <w:rFonts w:ascii="Times New Roman" w:eastAsia="Times New Roman" w:hAnsi="Times New Roman" w:cs="Times New Roman"/>
-          <w:sz w:val="24"/>
-          <w:szCs w:val="24"/>
-        </w:rPr>
-        <w:t xml:space="preserve">; </w:t>
-      </w:r>
-      <w:r>
-        <w:rPr>
-          <w:rFonts w:ascii="Times New Roman" w:eastAsia="Times New Roman" w:hAnsi="Times New Roman" w:cs="Times New Roman"/>
-          <w:i/>
-          <w:sz w:val="24"/>
-          <w:szCs w:val="24"/>
-        </w:rPr>
-        <w:t>r</w:t>
-      </w:r>
-      <w:r>
-        <w:rPr>
-          <w:rFonts w:ascii="Times New Roman" w:eastAsia="Times New Roman" w:hAnsi="Times New Roman" w:cs="Times New Roman"/>
-          <w:sz w:val="24"/>
-          <w:szCs w:val="24"/>
-        </w:rPr>
-        <w:t xml:space="preserve"> ≥1.386), and the transition from the boom to the bust phase must be rapid (0 &lt; </w:t>
-      </w:r>
-      <w:r>
-        <w:rPr>
-          <w:rFonts w:ascii="Times New Roman" w:eastAsia="Times New Roman" w:hAnsi="Times New Roman" w:cs="Times New Roman"/>
-          <w:sz w:val="24"/>
-          <w:szCs w:val="24"/>
-        </w:rPr>
-        <w:t>λ</w:t>
-      </w:r>
-      <w:r>
-        <w:rPr>
-          <w:rFonts w:ascii="Times New Roman" w:eastAsia="Times New Roman" w:hAnsi="Times New Roman" w:cs="Times New Roman"/>
-          <w:sz w:val="24"/>
-          <w:szCs w:val="24"/>
-        </w:rPr>
-        <w:t xml:space="preserve"> ≤ 0.372;  </w:t>
-      </w:r>
-      <w:r>
-        <w:rPr>
-          <w:rFonts w:ascii="Times New Roman" w:eastAsia="Times New Roman" w:hAnsi="Times New Roman" w:cs="Times New Roman"/>
-          <w:i/>
-          <w:sz w:val="24"/>
-          <w:szCs w:val="24"/>
-        </w:rPr>
-        <w:t>r</w:t>
-      </w:r>
-      <w:r>
-        <w:rPr>
-          <w:rFonts w:ascii="Times New Roman" w:eastAsia="Gungsuh" w:hAnsi="Times New Roman" w:cs="Times New Roman"/>
-          <w:sz w:val="24"/>
-          <w:szCs w:val="24"/>
-        </w:rPr>
-        <w:t xml:space="preserve"> ≤ -0.99), severe (≥ 90%), and sustained (≥3 years; Figure 1). These criteria narrowed the definition of boom-bust cycles which potentially could help find mechanisms general to these phenomena. I also provide metrics that describe boom-busts cycles that could facilitate comparison across species and locations.  Using these criteria, I identified 28 studies demonstrating boom-bust cycles with 2 studies exhibiting repeated boom-bust cycles.</w:t>
+          <w:b/>
+          <w:bCs/>
+          <w:sz w:val="24"/>
+          <w:szCs w:val="24"/>
+        </w:rPr>
+        <w:t>Acknowledgements</w:t>
       </w:r>
     </w:p>
     <w:p>
@@ -7605,40 +7830,17 @@
         <w:rPr>
           <w:rFonts w:ascii="Times New Roman" w:eastAsia="Times New Roman" w:hAnsi="Times New Roman" w:cs="Times New Roman"/>
           <w:b/>
-          <w:bCs/>
           <w:sz w:val="24"/>
           <w:szCs w:val="24"/>
         </w:rPr>
       </w:pPr>
       <w:r>
         <w:rPr>
-          <w:rFonts w:ascii="Times New Roman" w:eastAsia="Gungsuh" w:hAnsi="Times New Roman" w:cs="Times New Roman"/>
+          <w:rFonts w:ascii="Times New Roman" w:eastAsia="Times New Roman" w:hAnsi="Times New Roman" w:cs="Times New Roman"/>
           <w:b/>
-          <w:bCs/>
-          <w:sz w:val="24"/>
-          <w:szCs w:val="24"/>
-        </w:rPr>
-        <w:t>Acknowledgements</w:t>
-      </w:r>
-    </w:p>
-    <w:p>
-      <w:pPr>
-        <w:spacing w:line="480" w:lineRule="auto"/>
-        <w:rPr>
-          <w:rFonts w:ascii="Times New Roman" w:eastAsia="Times New Roman" w:hAnsi="Times New Roman" w:cs="Times New Roman"/>
-          <w:b/>
-          <w:sz w:val="24"/>
-          <w:szCs w:val="24"/>
-        </w:rPr>
-      </w:pPr>
-      <w:r>
-        <w:rPr>
-          <w:rFonts w:ascii="Times New Roman" w:eastAsia="Times New Roman" w:hAnsi="Times New Roman" w:cs="Times New Roman"/>
-          <w:b/>
-          <w:sz w:val="24"/>
-          <w:szCs w:val="24"/>
-        </w:rPr>
-        <w:lastRenderedPageBreak/>
+          <w:sz w:val="24"/>
+          <w:szCs w:val="24"/>
+        </w:rPr>
         <w:t>References</w:t>
       </w:r>
     </w:p>
@@ -7682,7 +7884,7 @@
           <w:rFonts w:ascii="Times New Roman" w:hAnsi="Times New Roman" w:cs="Times New Roman"/>
           <w:sz w:val="24"/>
         </w:rPr>
-        <w:t xml:space="preserve">Aagaard, K. &amp; Lockwood, J.L. (2016). Severe and rapid population declines in exotic birds. </w:t>
+        <w:t xml:space="preserve">Aagaard, K., Lockwood, J.L. &amp; Green, E.J. (2016). A Bayesian approach for characterizing uncertainty in declaring a population collapse. </w:t>
       </w:r>
       <w:r>
         <w:rPr>
@@ -7691,14 +7893,14 @@
           <w:iCs/>
           <w:sz w:val="24"/>
         </w:rPr>
-        <w:t>Biol Invasions</w:t>
-      </w:r>
-      <w:r>
-        <w:rPr>
-          <w:rFonts w:ascii="Times New Roman" w:hAnsi="Times New Roman" w:cs="Times New Roman"/>
-          <w:sz w:val="24"/>
-        </w:rPr>
-        <w:t>, 18, 1667–1678.</w:t>
+        <w:t>Ecological Modelling</w:t>
+      </w:r>
+      <w:r>
+        <w:rPr>
+          <w:rFonts w:ascii="Times New Roman" w:hAnsi="Times New Roman" w:cs="Times New Roman"/>
+          <w:sz w:val="24"/>
+        </w:rPr>
+        <w:t>, 328, 78–84.</w:t>
       </w:r>
     </w:p>
     <w:p>
@@ -7714,7 +7916,7 @@
           <w:rFonts w:ascii="Times New Roman" w:hAnsi="Times New Roman" w:cs="Times New Roman"/>
           <w:sz w:val="24"/>
         </w:rPr>
-        <w:t xml:space="preserve">Aagaard, K., Lockwood, J.L. &amp; Green, E.J. (2016). A Bayesian approach for characterizing uncertainty in declaring a population collapse. </w:t>
+        <w:t xml:space="preserve">Andreassen, H.P., Sundell, J., Ecke, F., Halle, S., Haapakoski, M., Henttonen, H., </w:t>
       </w:r>
       <w:r>
         <w:rPr>
@@ -7723,14 +7925,30 @@
           <w:iCs/>
           <w:sz w:val="24"/>
         </w:rPr>
-        <w:t>Ecological Modelling</w:t>
-      </w:r>
-      <w:r>
-        <w:rPr>
-          <w:rFonts w:ascii="Times New Roman" w:hAnsi="Times New Roman" w:cs="Times New Roman"/>
-          <w:sz w:val="24"/>
-        </w:rPr>
-        <w:t>, 328, 78–84.</w:t>
+        <w:t>et al.</w:t>
+      </w:r>
+      <w:r>
+        <w:rPr>
+          <w:rFonts w:ascii="Times New Roman" w:hAnsi="Times New Roman" w:cs="Times New Roman"/>
+          <w:sz w:val="24"/>
+        </w:rPr>
+        <w:t xml:space="preserve"> (2021). Population cycles and outbreaks of small rodents: ten essential questions we still need to solve. </w:t>
+      </w:r>
+      <w:r>
+        <w:rPr>
+          <w:rFonts w:ascii="Times New Roman" w:hAnsi="Times New Roman" w:cs="Times New Roman"/>
+          <w:i/>
+          <w:iCs/>
+          <w:sz w:val="24"/>
+        </w:rPr>
+        <w:t>Oecologia</w:t>
+      </w:r>
+      <w:r>
+        <w:rPr>
+          <w:rFonts w:ascii="Times New Roman" w:hAnsi="Times New Roman" w:cs="Times New Roman"/>
+          <w:sz w:val="24"/>
+        </w:rPr>
+        <w:t>, 195, 601–622.</w:t>
       </w:r>
     </w:p>
     <w:p>
@@ -7746,7 +7964,7 @@
           <w:rFonts w:ascii="Times New Roman" w:hAnsi="Times New Roman" w:cs="Times New Roman"/>
           <w:sz w:val="24"/>
         </w:rPr>
-        <w:t xml:space="preserve">Andreassen, H.P., Sundell, J., Ecke, F., Halle, S., Haapakoski, M., Henttonen, H., </w:t>
+        <w:t xml:space="preserve">Bird, J.P., Martin, R., Akçakaya, H.R., Gilroy, J., Burfield, I.J., Garnett, S.T., </w:t>
       </w:r>
       <w:r>
         <w:rPr>
@@ -7762,7 +7980,7 @@
           <w:rFonts w:ascii="Times New Roman" w:hAnsi="Times New Roman" w:cs="Times New Roman"/>
           <w:sz w:val="24"/>
         </w:rPr>
-        <w:t xml:space="preserve"> (2021). Population cycles and outbreaks of small rodents: ten essential questions we still need to solve. </w:t>
+        <w:t xml:space="preserve"> (2020). Generation lengths of the world’s birds and their implications for extinction risk. </w:t>
       </w:r>
       <w:r>
         <w:rPr>
@@ -7771,14 +7989,14 @@
           <w:iCs/>
           <w:sz w:val="24"/>
         </w:rPr>
-        <w:t>Oecologia</w:t>
-      </w:r>
-      <w:r>
-        <w:rPr>
-          <w:rFonts w:ascii="Times New Roman" w:hAnsi="Times New Roman" w:cs="Times New Roman"/>
-          <w:sz w:val="24"/>
-        </w:rPr>
-        <w:t>, 195, 601–622.</w:t>
+        <w:t>Conservation Biology</w:t>
+      </w:r>
+      <w:r>
+        <w:rPr>
+          <w:rFonts w:ascii="Times New Roman" w:hAnsi="Times New Roman" w:cs="Times New Roman"/>
+          <w:sz w:val="24"/>
+        </w:rPr>
+        <w:t>, 34, 1252–1261.</w:t>
       </w:r>
     </w:p>
     <w:p>
@@ -7794,7 +8012,7 @@
           <w:rFonts w:ascii="Times New Roman" w:hAnsi="Times New Roman" w:cs="Times New Roman"/>
           <w:sz w:val="24"/>
         </w:rPr>
-        <w:t xml:space="preserve">Bird, J.P., Martin, R., Akçakaya, H.R., Gilroy, J., Burfield, I.J., Garnett, S.T., </w:t>
+        <w:t xml:space="preserve">Clavero, M., Brotons, L., Pons, P. &amp; Sol, D. (2009). Prominent role of invasive species in avian biodiversity loss. </w:t>
       </w:r>
       <w:r>
         <w:rPr>
@@ -7803,30 +8021,14 @@
           <w:iCs/>
           <w:sz w:val="24"/>
         </w:rPr>
-        <w:t>et al.</w:t>
-      </w:r>
-      <w:r>
-        <w:rPr>
-          <w:rFonts w:ascii="Times New Roman" w:hAnsi="Times New Roman" w:cs="Times New Roman"/>
-          <w:sz w:val="24"/>
-        </w:rPr>
-        <w:t xml:space="preserve"> (2020). Generation lengths of the world’s birds and their implications for extinction risk. </w:t>
-      </w:r>
-      <w:r>
-        <w:rPr>
-          <w:rFonts w:ascii="Times New Roman" w:hAnsi="Times New Roman" w:cs="Times New Roman"/>
-          <w:i/>
-          <w:iCs/>
-          <w:sz w:val="24"/>
-        </w:rPr>
-        <w:t>Conservation Biology</w:t>
-      </w:r>
-      <w:r>
-        <w:rPr>
-          <w:rFonts w:ascii="Times New Roman" w:hAnsi="Times New Roman" w:cs="Times New Roman"/>
-          <w:sz w:val="24"/>
-        </w:rPr>
-        <w:t>, 34, 1252–1261.</w:t>
+        <w:t>Biological Conservation</w:t>
+      </w:r>
+      <w:r>
+        <w:rPr>
+          <w:rFonts w:ascii="Times New Roman" w:hAnsi="Times New Roman" w:cs="Times New Roman"/>
+          <w:sz w:val="24"/>
+        </w:rPr>
+        <w:t>, 142, 2043–2049.</w:t>
       </w:r>
     </w:p>
     <w:p>
@@ -7842,7 +8044,8 @@
           <w:rFonts w:ascii="Times New Roman" w:hAnsi="Times New Roman" w:cs="Times New Roman"/>
           <w:sz w:val="24"/>
         </w:rPr>
-        <w:t xml:space="preserve">Clavero, M., Brotons, L., Pons, P. &amp; Sol, D. (2009). Prominent role of invasive species in avian biodiversity loss. </w:t>
+        <w:lastRenderedPageBreak/>
+        <w:t xml:space="preserve">Dexter, E., Bollens, S.M., Rollwagen-Bollens, G., Emerson, J. &amp; Zimmerman, J. (2015). Persistent vs. ephemeral invasions: 8.5 years of zooplankton community dynamics in the Columbia River: Persistent vs. ephemeral invasions. </w:t>
       </w:r>
       <w:r>
         <w:rPr>
@@ -7851,14 +8054,14 @@
           <w:iCs/>
           <w:sz w:val="24"/>
         </w:rPr>
-        <w:t>Biological Conservation</w:t>
-      </w:r>
-      <w:r>
-        <w:rPr>
-          <w:rFonts w:ascii="Times New Roman" w:hAnsi="Times New Roman" w:cs="Times New Roman"/>
-          <w:sz w:val="24"/>
-        </w:rPr>
-        <w:t>, 142, 2043–2049.</w:t>
+        <w:t>Limnol. Oceanogr.</w:t>
+      </w:r>
+      <w:r>
+        <w:rPr>
+          <w:rFonts w:ascii="Times New Roman" w:hAnsi="Times New Roman" w:cs="Times New Roman"/>
+          <w:sz w:val="24"/>
+        </w:rPr>
+        <w:t>, 60, 527–539.</w:t>
       </w:r>
     </w:p>
     <w:p>
@@ -7874,7 +8077,7 @@
           <w:rFonts w:ascii="Times New Roman" w:hAnsi="Times New Roman" w:cs="Times New Roman"/>
           <w:sz w:val="24"/>
         </w:rPr>
-        <w:t xml:space="preserve">Dexter, E., Bollens, S.M., Rollwagen-Bollens, G., Emerson, J. &amp; Zimmerman, J. (2015). Persistent vs. ephemeral invasions: 8.5 years of zooplankton community dynamics in the Columbia River: Persistent vs. ephemeral invasions. </w:t>
+        <w:t xml:space="preserve">Elton, C. (1927). </w:t>
       </w:r>
       <w:r>
         <w:rPr>
@@ -7883,14 +8086,14 @@
           <w:iCs/>
           <w:sz w:val="24"/>
         </w:rPr>
-        <w:t>Limnol. Oceanogr.</w:t>
-      </w:r>
-      <w:r>
-        <w:rPr>
-          <w:rFonts w:ascii="Times New Roman" w:hAnsi="Times New Roman" w:cs="Times New Roman"/>
-          <w:sz w:val="24"/>
-        </w:rPr>
-        <w:t>, 60, 527–539.</w:t>
+        <w:t>Animal Ecology</w:t>
+      </w:r>
+      <w:r>
+        <w:rPr>
+          <w:rFonts w:ascii="Times New Roman" w:hAnsi="Times New Roman" w:cs="Times New Roman"/>
+          <w:sz w:val="24"/>
+        </w:rPr>
+        <w:t>. The Macmillan Company, New York, NY.</w:t>
       </w:r>
     </w:p>
     <w:p>
@@ -7906,7 +8109,7 @@
           <w:rFonts w:ascii="Times New Roman" w:hAnsi="Times New Roman" w:cs="Times New Roman"/>
           <w:sz w:val="24"/>
         </w:rPr>
-        <w:t xml:space="preserve">Elton, C. (1927). </w:t>
+        <w:t xml:space="preserve">Elton, C. &amp; Nicholson, M. (1942). The Ten-Year Cycle in Numbers of the Lynx in Canada. </w:t>
       </w:r>
       <w:r>
         <w:rPr>
@@ -7915,14 +8118,14 @@
           <w:iCs/>
           <w:sz w:val="24"/>
         </w:rPr>
-        <w:t>Animal Ecology</w:t>
-      </w:r>
-      <w:r>
-        <w:rPr>
-          <w:rFonts w:ascii="Times New Roman" w:hAnsi="Times New Roman" w:cs="Times New Roman"/>
-          <w:sz w:val="24"/>
-        </w:rPr>
-        <w:t>. The Macmillan Company, New York, NY.</w:t>
+        <w:t>The Journal of Animal Ecology</w:t>
+      </w:r>
+      <w:r>
+        <w:rPr>
+          <w:rFonts w:ascii="Times New Roman" w:hAnsi="Times New Roman" w:cs="Times New Roman"/>
+          <w:sz w:val="24"/>
+        </w:rPr>
+        <w:t>, 11, 215.</w:t>
       </w:r>
     </w:p>
     <w:p>
@@ -7938,7 +8141,7 @@
           <w:rFonts w:ascii="Times New Roman" w:hAnsi="Times New Roman" w:cs="Times New Roman"/>
           <w:sz w:val="24"/>
         </w:rPr>
-        <w:t xml:space="preserve">Elton, C. &amp; Nicholson, M. (1942). The Ten-Year Cycle in Numbers of the Lynx in Canada. </w:t>
+        <w:t xml:space="preserve">Linders, T.E.W., Schaffner, U., Eschen, R., Abebe, A., Choge, S.K., Nigatu, L., </w:t>
       </w:r>
       <w:r>
         <w:rPr>
@@ -7947,14 +8150,30 @@
           <w:iCs/>
           <w:sz w:val="24"/>
         </w:rPr>
-        <w:t>The Journal of Animal Ecology</w:t>
-      </w:r>
-      <w:r>
-        <w:rPr>
-          <w:rFonts w:ascii="Times New Roman" w:hAnsi="Times New Roman" w:cs="Times New Roman"/>
-          <w:sz w:val="24"/>
-        </w:rPr>
-        <w:t>, 11, 215.</w:t>
+        <w:t>et al.</w:t>
+      </w:r>
+      <w:r>
+        <w:rPr>
+          <w:rFonts w:ascii="Times New Roman" w:hAnsi="Times New Roman" w:cs="Times New Roman"/>
+          <w:sz w:val="24"/>
+        </w:rPr>
+        <w:t xml:space="preserve"> (2019). Direct and indirect effects of invasive species: Biodiversity loss is a major mechanism by which an invasive tree affects ecosystem functioning. </w:t>
+      </w:r>
+      <w:r>
+        <w:rPr>
+          <w:rFonts w:ascii="Times New Roman" w:hAnsi="Times New Roman" w:cs="Times New Roman"/>
+          <w:i/>
+          <w:iCs/>
+          <w:sz w:val="24"/>
+        </w:rPr>
+        <w:t>J Ecol</w:t>
+      </w:r>
+      <w:r>
+        <w:rPr>
+          <w:rFonts w:ascii="Times New Roman" w:hAnsi="Times New Roman" w:cs="Times New Roman"/>
+          <w:sz w:val="24"/>
+        </w:rPr>
+        <w:t>, 107, 2660–2672.</w:t>
       </w:r>
     </w:p>
     <w:p>
@@ -7970,7 +8189,7 @@
           <w:rFonts w:ascii="Times New Roman" w:hAnsi="Times New Roman" w:cs="Times New Roman"/>
           <w:sz w:val="24"/>
         </w:rPr>
-        <w:t xml:space="preserve">Linders, T.E.W., Schaffner, U., Eschen, R., Abebe, A., Choge, S.K., Nigatu, L., </w:t>
+        <w:t xml:space="preserve">Lindström, J., Ranta, E., Kokko, H., Lundberg, P. &amp; Kaitala, V. (2007). From arctic lemmings to adaptive dynamics: Charles Elton’s legacy in population ecology. </w:t>
       </w:r>
       <w:r>
         <w:rPr>
@@ -7979,30 +8198,14 @@
           <w:iCs/>
           <w:sz w:val="24"/>
         </w:rPr>
-        <w:t>et al.</w:t>
-      </w:r>
-      <w:r>
-        <w:rPr>
-          <w:rFonts w:ascii="Times New Roman" w:hAnsi="Times New Roman" w:cs="Times New Roman"/>
-          <w:sz w:val="24"/>
-        </w:rPr>
-        <w:t xml:space="preserve"> (2019). Direct and indirect effects of invasive species: Biodiversity loss is a major mechanism by which an invasive tree affects ecosystem functioning. </w:t>
-      </w:r>
-      <w:r>
-        <w:rPr>
-          <w:rFonts w:ascii="Times New Roman" w:hAnsi="Times New Roman" w:cs="Times New Roman"/>
-          <w:i/>
-          <w:iCs/>
-          <w:sz w:val="24"/>
-        </w:rPr>
-        <w:t>J Ecol</w:t>
-      </w:r>
-      <w:r>
-        <w:rPr>
-          <w:rFonts w:ascii="Times New Roman" w:hAnsi="Times New Roman" w:cs="Times New Roman"/>
-          <w:sz w:val="24"/>
-        </w:rPr>
-        <w:t>, 107, 2660–2672.</w:t>
+        <w:t>Biological Reviews</w:t>
+      </w:r>
+      <w:r>
+        <w:rPr>
+          <w:rFonts w:ascii="Times New Roman" w:hAnsi="Times New Roman" w:cs="Times New Roman"/>
+          <w:sz w:val="24"/>
+        </w:rPr>
+        <w:t>, 76, 129–158.</w:t>
       </w:r>
     </w:p>
     <w:p>
@@ -8018,7 +8221,7 @@
           <w:rFonts w:ascii="Times New Roman" w:hAnsi="Times New Roman" w:cs="Times New Roman"/>
           <w:sz w:val="24"/>
         </w:rPr>
-        <w:t xml:space="preserve">Lindström, J., Ranta, E., Kokko, H., Lundberg, P. &amp; Kaitala, V. (2007). From arctic lemmings to adaptive dynamics: Charles Elton’s legacy in population ecology. </w:t>
+        <w:t xml:space="preserve">McDowell, W.G. &amp; Sousa, R. (2019). Mass Mortality Events of Invasive Freshwater Bivalves: Current Understanding and Potential Directions for Future Research. </w:t>
       </w:r>
       <w:r>
         <w:rPr>
@@ -8027,14 +8230,14 @@
           <w:iCs/>
           <w:sz w:val="24"/>
         </w:rPr>
-        <w:t>Biological Reviews</w:t>
-      </w:r>
-      <w:r>
-        <w:rPr>
-          <w:rFonts w:ascii="Times New Roman" w:hAnsi="Times New Roman" w:cs="Times New Roman"/>
-          <w:sz w:val="24"/>
-        </w:rPr>
-        <w:t>, 76, 129–158.</w:t>
+        <w:t>Front. Ecol. Evol.</w:t>
+      </w:r>
+      <w:r>
+        <w:rPr>
+          <w:rFonts w:ascii="Times New Roman" w:hAnsi="Times New Roman" w:cs="Times New Roman"/>
+          <w:sz w:val="24"/>
+        </w:rPr>
+        <w:t>, 7, 331.</w:t>
       </w:r>
     </w:p>
     <w:p>
@@ -8050,7 +8253,7 @@
           <w:rFonts w:ascii="Times New Roman" w:hAnsi="Times New Roman" w:cs="Times New Roman"/>
           <w:sz w:val="24"/>
         </w:rPr>
-        <w:t xml:space="preserve">McDowell, W.G. &amp; Sousa, R. (2019). Mass Mortality Events of Invasive Freshwater Bivalves: Current Understanding and Potential Directions for Future Research. </w:t>
+        <w:t xml:space="preserve">Myers, J.H. (2018). Population cycles: generalities, exceptions and remaining mysteries. </w:t>
       </w:r>
       <w:r>
         <w:rPr>
@@ -8059,14 +8262,14 @@
           <w:iCs/>
           <w:sz w:val="24"/>
         </w:rPr>
-        <w:t>Front. Ecol. Evol.</w:t>
-      </w:r>
-      <w:r>
-        <w:rPr>
-          <w:rFonts w:ascii="Times New Roman" w:hAnsi="Times New Roman" w:cs="Times New Roman"/>
-          <w:sz w:val="24"/>
-        </w:rPr>
-        <w:t>, 7, 331.</w:t>
+        <w:t>Proc. R. Soc. B.</w:t>
+      </w:r>
+      <w:r>
+        <w:rPr>
+          <w:rFonts w:ascii="Times New Roman" w:hAnsi="Times New Roman" w:cs="Times New Roman"/>
+          <w:sz w:val="24"/>
+        </w:rPr>
+        <w:t>, 285, 20172841.</w:t>
       </w:r>
     </w:p>
     <w:p>
@@ -8082,7 +8285,7 @@
           <w:rFonts w:ascii="Times New Roman" w:hAnsi="Times New Roman" w:cs="Times New Roman"/>
           <w:sz w:val="24"/>
         </w:rPr>
-        <w:t xml:space="preserve">Myers, J.H. (2018). Population cycles: generalities, exceptions and remaining mysteries. </w:t>
+        <w:t xml:space="preserve">Pacifici, M., Santini, L., Di Marco, M., Baisero, D., Francucci, L., Grottolo Marasini, G., </w:t>
       </w:r>
       <w:r>
         <w:rPr>
@@ -8091,14 +8294,30 @@
           <w:iCs/>
           <w:sz w:val="24"/>
         </w:rPr>
-        <w:t>Proc. R. Soc. B.</w:t>
-      </w:r>
-      <w:r>
-        <w:rPr>
-          <w:rFonts w:ascii="Times New Roman" w:hAnsi="Times New Roman" w:cs="Times New Roman"/>
-          <w:sz w:val="24"/>
-        </w:rPr>
-        <w:t>, 285, 20172841.</w:t>
+        <w:t>et al.</w:t>
+      </w:r>
+      <w:r>
+        <w:rPr>
+          <w:rFonts w:ascii="Times New Roman" w:hAnsi="Times New Roman" w:cs="Times New Roman"/>
+          <w:sz w:val="24"/>
+        </w:rPr>
+        <w:t xml:space="preserve"> (2013). Generation length for mammals. </w:t>
+      </w:r>
+      <w:r>
+        <w:rPr>
+          <w:rFonts w:ascii="Times New Roman" w:hAnsi="Times New Roman" w:cs="Times New Roman"/>
+          <w:i/>
+          <w:iCs/>
+          <w:sz w:val="24"/>
+        </w:rPr>
+        <w:t>NC</w:t>
+      </w:r>
+      <w:r>
+        <w:rPr>
+          <w:rFonts w:ascii="Times New Roman" w:hAnsi="Times New Roman" w:cs="Times New Roman"/>
+          <w:sz w:val="24"/>
+        </w:rPr>
+        <w:t>, 5, 89–94.</w:t>
       </w:r>
     </w:p>
     <w:p>
@@ -8114,7 +8333,7 @@
           <w:rFonts w:ascii="Times New Roman" w:hAnsi="Times New Roman" w:cs="Times New Roman"/>
           <w:sz w:val="24"/>
         </w:rPr>
-        <w:t xml:space="preserve">Pacifici, M., Santini, L., Di Marco, M., Baisero, D., Francucci, L., Grottolo Marasini, G., </w:t>
+        <w:t xml:space="preserve">Pick, J.L., Nakagawa, S. &amp; Noble, D.W.A. (2019). Reproducible, flexible and high-throughput data extraction from primary literature: the metaDigitize R package. </w:t>
       </w:r>
       <w:r>
         <w:rPr>
@@ -8123,30 +8342,14 @@
           <w:iCs/>
           <w:sz w:val="24"/>
         </w:rPr>
-        <w:t>et al.</w:t>
-      </w:r>
-      <w:r>
-        <w:rPr>
-          <w:rFonts w:ascii="Times New Roman" w:hAnsi="Times New Roman" w:cs="Times New Roman"/>
-          <w:sz w:val="24"/>
-        </w:rPr>
-        <w:t xml:space="preserve"> (2013). Generation length for mammals. </w:t>
-      </w:r>
-      <w:r>
-        <w:rPr>
-          <w:rFonts w:ascii="Times New Roman" w:hAnsi="Times New Roman" w:cs="Times New Roman"/>
-          <w:i/>
-          <w:iCs/>
-          <w:sz w:val="24"/>
-        </w:rPr>
-        <w:t>NC</w:t>
-      </w:r>
-      <w:r>
-        <w:rPr>
-          <w:rFonts w:ascii="Times New Roman" w:hAnsi="Times New Roman" w:cs="Times New Roman"/>
-          <w:sz w:val="24"/>
-        </w:rPr>
-        <w:t>, 5, 89–94.</w:t>
+        <w:t>Methods in Ecology and Evolution</w:t>
+      </w:r>
+      <w:r>
+        <w:rPr>
+          <w:rFonts w:ascii="Times New Roman" w:hAnsi="Times New Roman" w:cs="Times New Roman"/>
+          <w:sz w:val="24"/>
+        </w:rPr>
+        <w:t>, 10, 426–431.</w:t>
       </w:r>
     </w:p>
     <w:p>
@@ -8162,7 +8365,7 @@
           <w:rFonts w:ascii="Times New Roman" w:hAnsi="Times New Roman" w:cs="Times New Roman"/>
           <w:sz w:val="24"/>
         </w:rPr>
-        <w:t xml:space="preserve">Pick, J.L., Nakagawa, S. &amp; Noble, D.W.A. (2019). Reproducible, flexible and high-throughput data extraction from primary literature: the metaDigitize R package. </w:t>
+        <w:t xml:space="preserve">Pintar, M.R., Dorn, N.J., Kline, J.L. &amp; Trexler, J.C. (2023). Contrasting invasion histories and effects of three non-native fishes observed with long-term monitoring data. </w:t>
       </w:r>
       <w:r>
         <w:rPr>
@@ -8171,14 +8374,14 @@
           <w:iCs/>
           <w:sz w:val="24"/>
         </w:rPr>
-        <w:t>Methods in Ecology and Evolution</w:t>
-      </w:r>
-      <w:r>
-        <w:rPr>
-          <w:rFonts w:ascii="Times New Roman" w:hAnsi="Times New Roman" w:cs="Times New Roman"/>
-          <w:sz w:val="24"/>
-        </w:rPr>
-        <w:t>, 10, 426–431.</w:t>
+        <w:t>Biol Invasions</w:t>
+      </w:r>
+      <w:r>
+        <w:rPr>
+          <w:rFonts w:ascii="Times New Roman" w:hAnsi="Times New Roman" w:cs="Times New Roman"/>
+          <w:sz w:val="24"/>
+        </w:rPr>
+        <w:t>.</w:t>
       </w:r>
     </w:p>
     <w:p>
@@ -8194,23 +8397,7 @@
           <w:rFonts w:ascii="Times New Roman" w:hAnsi="Times New Roman" w:cs="Times New Roman"/>
           <w:sz w:val="24"/>
         </w:rPr>
-        <w:t xml:space="preserve">Pintar, M.R., Dorn, N.J., Kline, J.L. &amp; Trexler, J.C. (2023). Contrasting invasion histories and effects of three non-native fishes observed with long-term monitoring data. </w:t>
-      </w:r>
-      <w:r>
-        <w:rPr>
-          <w:rFonts w:ascii="Times New Roman" w:hAnsi="Times New Roman" w:cs="Times New Roman"/>
-          <w:i/>
-          <w:iCs/>
-          <w:sz w:val="24"/>
-        </w:rPr>
-        <w:t>Biol Invasions</w:t>
-      </w:r>
-      <w:r>
-        <w:rPr>
-          <w:rFonts w:ascii="Times New Roman" w:hAnsi="Times New Roman" w:cs="Times New Roman"/>
-          <w:sz w:val="24"/>
-        </w:rPr>
-        <w:t>.</w:t>
+        <w:t>R Core Team. (2023). R: A Language and Environment for Statistical Computing.</w:t>
       </w:r>
     </w:p>
     <w:p>
@@ -8226,7 +8413,39 @@
           <w:rFonts w:ascii="Times New Roman" w:hAnsi="Times New Roman" w:cs="Times New Roman"/>
           <w:sz w:val="24"/>
         </w:rPr>
-        <w:t>R Core Team. (2023). R: A Language and Environment for Statistical Computing.</w:t>
+        <w:t xml:space="preserve">Sandström, A., Andersson, M., Asp, A., Bohman, P., Edsman, L., Engdahl, F., </w:t>
+      </w:r>
+      <w:r>
+        <w:rPr>
+          <w:rFonts w:ascii="Times New Roman" w:hAnsi="Times New Roman" w:cs="Times New Roman"/>
+          <w:i/>
+          <w:iCs/>
+          <w:sz w:val="24"/>
+        </w:rPr>
+        <w:t>et al.</w:t>
+      </w:r>
+      <w:r>
+        <w:rPr>
+          <w:rFonts w:ascii="Times New Roman" w:hAnsi="Times New Roman" w:cs="Times New Roman"/>
+          <w:sz w:val="24"/>
+        </w:rPr>
+        <w:t xml:space="preserve"> (2014). Population collapses in introduced non-indigenous crayfish. </w:t>
+      </w:r>
+      <w:r>
+        <w:rPr>
+          <w:rFonts w:ascii="Times New Roman" w:hAnsi="Times New Roman" w:cs="Times New Roman"/>
+          <w:i/>
+          <w:iCs/>
+          <w:sz w:val="24"/>
+        </w:rPr>
+        <w:t>Biol Invasions</w:t>
+      </w:r>
+      <w:r>
+        <w:rPr>
+          <w:rFonts w:ascii="Times New Roman" w:hAnsi="Times New Roman" w:cs="Times New Roman"/>
+          <w:sz w:val="24"/>
+        </w:rPr>
+        <w:t>, 16, 1961–1977.</w:t>
       </w:r>
     </w:p>
     <w:p>
@@ -8242,7 +8461,7 @@
           <w:rFonts w:ascii="Times New Roman" w:hAnsi="Times New Roman" w:cs="Times New Roman"/>
           <w:sz w:val="24"/>
         </w:rPr>
-        <w:t xml:space="preserve">Sandström, A., Andersson, M., Asp, A., Bohman, P., Edsman, L., Engdahl, F., </w:t>
+        <w:t xml:space="preserve">Sheriff, M.J., McMahon, E.K., Krebs, C.J. &amp; Boonstra, R. (2015). Predator‐induced maternal stress and population demography in snowshoe hares: the more severe the risk, the longer the generational effect. </w:t>
       </w:r>
       <w:r>
         <w:rPr>
@@ -8251,30 +8470,14 @@
           <w:iCs/>
           <w:sz w:val="24"/>
         </w:rPr>
-        <w:t>et al.</w:t>
-      </w:r>
-      <w:r>
-        <w:rPr>
-          <w:rFonts w:ascii="Times New Roman" w:hAnsi="Times New Roman" w:cs="Times New Roman"/>
-          <w:sz w:val="24"/>
-        </w:rPr>
-        <w:t xml:space="preserve"> (2014). Population collapses in introduced non-indigenous crayfish. </w:t>
-      </w:r>
-      <w:r>
-        <w:rPr>
-          <w:rFonts w:ascii="Times New Roman" w:hAnsi="Times New Roman" w:cs="Times New Roman"/>
-          <w:i/>
-          <w:iCs/>
-          <w:sz w:val="24"/>
-        </w:rPr>
-        <w:t>Biol Invasions</w:t>
-      </w:r>
-      <w:r>
-        <w:rPr>
-          <w:rFonts w:ascii="Times New Roman" w:hAnsi="Times New Roman" w:cs="Times New Roman"/>
-          <w:sz w:val="24"/>
-        </w:rPr>
-        <w:t>, 16, 1961–1977.</w:t>
+        <w:t>J Zool</w:t>
+      </w:r>
+      <w:r>
+        <w:rPr>
+          <w:rFonts w:ascii="Times New Roman" w:hAnsi="Times New Roman" w:cs="Times New Roman"/>
+          <w:sz w:val="24"/>
+        </w:rPr>
+        <w:t>, 296, 305–310.</w:t>
       </w:r>
     </w:p>
     <w:p>
@@ -8290,39 +8493,6 @@
           <w:rFonts w:ascii="Times New Roman" w:hAnsi="Times New Roman" w:cs="Times New Roman"/>
           <w:sz w:val="24"/>
         </w:rPr>
-        <w:t xml:space="preserve">Sheriff, M.J., McMahon, E.K., Krebs, C.J. &amp; Boonstra, R. (2015). Predator‐induced maternal stress and population demography in snowshoe hares: the more severe the risk, the longer the generational effect. </w:t>
-      </w:r>
-      <w:r>
-        <w:rPr>
-          <w:rFonts w:ascii="Times New Roman" w:hAnsi="Times New Roman" w:cs="Times New Roman"/>
-          <w:i/>
-          <w:iCs/>
-          <w:sz w:val="24"/>
-        </w:rPr>
-        <w:t>J Zool</w:t>
-      </w:r>
-      <w:r>
-        <w:rPr>
-          <w:rFonts w:ascii="Times New Roman" w:hAnsi="Times New Roman" w:cs="Times New Roman"/>
-          <w:sz w:val="24"/>
-        </w:rPr>
-        <w:t>, 296, 305–310.</w:t>
-      </w:r>
-    </w:p>
-    <w:p>
-      <w:pPr>
-        <w:pStyle w:val="Bibliography"/>
-        <w:rPr>
-          <w:rFonts w:ascii="Times New Roman" w:hAnsi="Times New Roman" w:cs="Times New Roman"/>
-          <w:sz w:val="24"/>
-        </w:rPr>
-      </w:pPr>
-      <w:r>
-        <w:rPr>
-          <w:rFonts w:ascii="Times New Roman" w:hAnsi="Times New Roman" w:cs="Times New Roman"/>
-          <w:sz w:val="24"/>
-        </w:rPr>
-        <w:lastRenderedPageBreak/>
         <w:t xml:space="preserve">Spear, M.J., Walsh, J.R., Ricciardi, A. &amp; Zanden, M.J.V. (2021). The Invasion Ecology of Sleeper Populations: Prevalence, Persistence, and Abrupt Shifts. </w:t>
       </w:r>
       <w:r>
@@ -8573,7 +8743,25 @@
           <w:sz w:val="24"/>
           <w:szCs w:val="24"/>
         </w:rPr>
-        <w:t>t and the classificaiton of boom-bust, overshoot, and establishment. B) Graphical depictions of the prosed metrics of a boom-bust</w:t>
+        <w:t>t and the classificaiton of boom-bust, overshoot, and establishment. B) Graphical depictions of the pro</w:t>
+      </w:r>
+      <w:r>
+        <w:rPr>
+          <w:rFonts w:ascii="Times New Roman" w:hAnsi="Times New Roman" w:cs="Times New Roman"/>
+          <w:noProof/>
+          <w:sz w:val="24"/>
+          <w:szCs w:val="24"/>
+        </w:rPr>
+        <w:t>po</w:t>
+      </w:r>
+      <w:r>
+        <w:rPr>
+          <w:rFonts w:ascii="Times New Roman" w:hAnsi="Times New Roman" w:cs="Times New Roman"/>
+          <w:noProof/>
+          <w:sz w:val="24"/>
+          <w:szCs w:val="24"/>
+        </w:rPr>
+        <w:t>sed metrics of a boom-bust</w:t>
       </w:r>
       <w:r>
         <w:rPr>
@@ -8930,17 +9118,6 @@
           <w:sz w:val="24"/>
           <w:szCs w:val="24"/>
         </w:rPr>
-      </w:pPr>
-    </w:p>
-    <w:p>
-      <w:pPr>
-        <w:spacing w:line="480" w:lineRule="auto"/>
-        <w:rPr>
-          <w:rFonts w:ascii="Times New Roman" w:eastAsia="Times New Roman" w:hAnsi="Times New Roman" w:cs="Times New Roman"/>
-          <w:b/>
-          <w:sz w:val="24"/>
-          <w:szCs w:val="24"/>
-        </w:rPr>
         <w:sectPr>
           <w:pgSz w:w="12240" w:h="15840"/>
           <w:pgMar w:top="1440" w:right="1440" w:bottom="1440" w:left="1440" w:header="720" w:footer="720" w:gutter="0"/>
@@ -8956,28 +9133,69 @@
         <w:spacing w:line="480" w:lineRule="auto"/>
         <w:rPr>
           <w:rFonts w:ascii="Times New Roman" w:eastAsia="Times New Roman" w:hAnsi="Times New Roman" w:cs="Times New Roman"/>
-          <w:sz w:val="24"/>
-          <w:szCs w:val="24"/>
-        </w:rPr>
+          <w:b/>
+          <w:sz w:val="24"/>
+          <w:szCs w:val="24"/>
+        </w:rPr>
+        <w:sectPr>
+          <w:pgSz w:w="12240" w:h="15840"/>
+          <w:pgMar w:top="1440" w:right="1440" w:bottom="1440" w:left="1440" w:header="720" w:footer="720" w:gutter="0"/>
+          <w:lnNumType w:countBy="1" w:restart="continuous"/>
+          <w:pgNumType w:start="1"/>
+          <w:cols w:space="720"/>
+          <w:docGrid w:linePitch="299"/>
+        </w:sectPr>
       </w:pPr>
       <w:r>
         <w:rPr>
           <w:rFonts w:ascii="Times New Roman" w:eastAsia="Times New Roman" w:hAnsi="Times New Roman" w:cs="Times New Roman"/>
           <w:b/>
+          <w:noProof/>
           <w:sz w:val="24"/>
           <w:szCs w:val="24"/>
         </w:rPr>
         <w:lastRenderedPageBreak/>
-        <w:t xml:space="preserve">Text </w:t>
-      </w:r>
-      <w:r>
-        <w:rPr>
-          <w:rFonts w:ascii="Times New Roman" w:eastAsia="Times New Roman" w:hAnsi="Times New Roman" w:cs="Times New Roman"/>
-          <w:b/>
-          <w:sz w:val="24"/>
-          <w:szCs w:val="24"/>
-        </w:rPr>
-        <w:t>Box 1: a quantitative definition of a boom-bust (limited to 750 words)</w:t>
+        <w:drawing>
+          <wp:inline distT="0" distB="0" distL="0" distR="0" wp14:anchorId="66F1C49F" wp14:editId="2AF50EFC">
+            <wp:extent cx="5309870" cy="8229600"/>
+            <wp:effectExtent l="0" t="0" r="0" b="0"/>
+            <wp:docPr id="1847349840" name="Picture 1" descr="A screenshot of a computer screen&#10;&#10;AI-generated content may be incorrect."/>
+            <wp:cNvGraphicFramePr>
+              <a:graphicFrameLocks xmlns:a="http://schemas.openxmlformats.org/drawingml/2006/main" noChangeAspect="1"/>
+            </wp:cNvGraphicFramePr>
+            <a:graphic xmlns:a="http://schemas.openxmlformats.org/drawingml/2006/main">
+              <a:graphicData uri="http://schemas.openxmlformats.org/drawingml/2006/picture">
+                <pic:pic xmlns:pic="http://schemas.openxmlformats.org/drawingml/2006/picture">
+                  <pic:nvPicPr>
+                    <pic:cNvPr id="1847349840" name="Picture 1" descr="A screenshot of a computer screen&#10;&#10;AI-generated content may be incorrect."/>
+                    <pic:cNvPicPr/>
+                  </pic:nvPicPr>
+                  <pic:blipFill>
+                    <a:blip r:embed="rId14">
+                      <a:extLst>
+                        <a:ext uri="{28A0092B-C50C-407E-A947-70E740481C1C}">
+                          <a14:useLocalDpi xmlns:a14="http://schemas.microsoft.com/office/drawing/2010/main" val="0"/>
+                        </a:ext>
+                      </a:extLst>
+                    </a:blip>
+                    <a:stretch>
+                      <a:fillRect/>
+                    </a:stretch>
+                  </pic:blipFill>
+                  <pic:spPr>
+                    <a:xfrm>
+                      <a:off x="0" y="0"/>
+                      <a:ext cx="5309870" cy="8229600"/>
+                    </a:xfrm>
+                    <a:prstGeom prst="rect">
+                      <a:avLst/>
+                    </a:prstGeom>
+                  </pic:spPr>
+                </pic:pic>
+              </a:graphicData>
+            </a:graphic>
+          </wp:inline>
+        </w:drawing>
       </w:r>
     </w:p>
     <w:p>
@@ -8985,27 +9203,73 @@
         <w:spacing w:line="480" w:lineRule="auto"/>
         <w:rPr>
           <w:rFonts w:ascii="Times New Roman" w:eastAsia="Times New Roman" w:hAnsi="Times New Roman" w:cs="Times New Roman"/>
-          <w:i/>
-          <w:sz w:val="24"/>
-          <w:szCs w:val="24"/>
-        </w:rPr>
+          <w:bCs/>
+          <w:sz w:val="24"/>
+          <w:szCs w:val="24"/>
+        </w:rPr>
+        <w:sectPr>
+          <w:pgSz w:w="12240" w:h="15840"/>
+          <w:pgMar w:top="1440" w:right="1440" w:bottom="1440" w:left="1440" w:header="720" w:footer="720" w:gutter="0"/>
+          <w:lnNumType w:countBy="1" w:restart="continuous"/>
+          <w:pgNumType w:start="1"/>
+          <w:cols w:space="720"/>
+          <w:docGrid w:linePitch="299"/>
+        </w:sectPr>
       </w:pPr>
-      <w:commentRangeStart w:id="8"/>
-      <w:r>
-        <w:rPr>
-          <w:rFonts w:ascii="Times New Roman" w:eastAsia="Times New Roman" w:hAnsi="Times New Roman" w:cs="Times New Roman"/>
-          <w:i/>
-          <w:sz w:val="24"/>
-          <w:szCs w:val="24"/>
-        </w:rPr>
-        <w:t>Quantitative Definition</w:t>
-      </w:r>
-      <w:commentRangeEnd w:id="8"/>
-      <w:r>
-        <w:rPr>
-          <w:rStyle w:val="CommentReference"/>
-        </w:rPr>
-        <w:commentReference w:id="8"/>
+      <w:r>
+        <w:rPr>
+          <w:rFonts w:ascii="Times New Roman" w:eastAsia="Times New Roman" w:hAnsi="Times New Roman" w:cs="Times New Roman"/>
+          <w:bCs/>
+          <w:sz w:val="24"/>
+          <w:szCs w:val="24"/>
+        </w:rPr>
+        <w:lastRenderedPageBreak/>
+        <w:t>Fig. 3:</w:t>
+      </w:r>
+      <w:r>
+        <w:rPr>
+          <w:rFonts w:ascii="Times New Roman" w:eastAsia="Times New Roman" w:hAnsi="Times New Roman" w:cs="Times New Roman"/>
+          <w:bCs/>
+          <w:sz w:val="24"/>
+          <w:szCs w:val="24"/>
+        </w:rPr>
+        <w:t xml:space="preserve"> </w:t>
+      </w:r>
+      <w:r>
+        <w:rPr>
+          <w:rFonts w:ascii="Times New Roman" w:eastAsia="Times New Roman" w:hAnsi="Times New Roman" w:cs="Times New Roman"/>
+          <w:bCs/>
+          <w:sz w:val="24"/>
+          <w:szCs w:val="24"/>
+        </w:rPr>
+        <w:t xml:space="preserve">The breakdown of the counts of time series that had some evidence for boom-bust within each A) continent, B) species, C) order, D) system, and E) </w:t>
+      </w:r>
+      <w:r>
+        <w:rPr>
+          <w:rFonts w:ascii="Times New Roman" w:eastAsia="Times New Roman" w:hAnsi="Times New Roman" w:cs="Times New Roman"/>
+          <w:bCs/>
+          <w:sz w:val="24"/>
+          <w:szCs w:val="24"/>
+        </w:rPr>
+        <w:t>k</w:t>
+      </w:r>
+      <w:r>
+        <w:rPr>
+          <w:rFonts w:ascii="Times New Roman" w:eastAsia="Times New Roman" w:hAnsi="Times New Roman" w:cs="Times New Roman"/>
+          <w:bCs/>
+          <w:sz w:val="24"/>
+          <w:szCs w:val="24"/>
+        </w:rPr>
+        <w:t>ingdom.</w:t>
+      </w:r>
+      <w:r>
+        <w:rPr>
+          <w:rFonts w:ascii="Times New Roman" w:eastAsia="Times New Roman" w:hAnsi="Times New Roman" w:cs="Times New Roman"/>
+          <w:bCs/>
+          <w:sz w:val="24"/>
+          <w:szCs w:val="24"/>
+        </w:rPr>
+        <w:t xml:space="preserve"> </w:t>
       </w:r>
     </w:p>
     <w:p>
@@ -9020,11 +9284,68 @@
       <w:r>
         <w:rPr>
           <w:rFonts w:ascii="Times New Roman" w:eastAsia="Times New Roman" w:hAnsi="Times New Roman" w:cs="Times New Roman"/>
+          <w:b/>
+          <w:sz w:val="24"/>
+          <w:szCs w:val="24"/>
+        </w:rPr>
+        <w:lastRenderedPageBreak/>
+        <w:t xml:space="preserve">Text </w:t>
+      </w:r>
+      <w:r>
+        <w:rPr>
+          <w:rFonts w:ascii="Times New Roman" w:eastAsia="Times New Roman" w:hAnsi="Times New Roman" w:cs="Times New Roman"/>
+          <w:b/>
+          <w:sz w:val="24"/>
+          <w:szCs w:val="24"/>
+        </w:rPr>
+        <w:t>Box 1: a quantitative definition of a boom-bust (limited to 750 words)</w:t>
+      </w:r>
+    </w:p>
+    <w:p>
+      <w:pPr>
+        <w:spacing w:line="480" w:lineRule="auto"/>
+        <w:rPr>
+          <w:rFonts w:ascii="Times New Roman" w:eastAsia="Times New Roman" w:hAnsi="Times New Roman" w:cs="Times New Roman"/>
+          <w:i/>
+          <w:sz w:val="24"/>
+          <w:szCs w:val="24"/>
+        </w:rPr>
+      </w:pPr>
+      <w:commentRangeStart w:id="9"/>
+      <w:r>
+        <w:rPr>
+          <w:rFonts w:ascii="Times New Roman" w:eastAsia="Times New Roman" w:hAnsi="Times New Roman" w:cs="Times New Roman"/>
+          <w:i/>
+          <w:sz w:val="24"/>
+          <w:szCs w:val="24"/>
+        </w:rPr>
+        <w:t>Quantitative Definition</w:t>
+      </w:r>
+      <w:commentRangeEnd w:id="9"/>
+      <w:r>
+        <w:rPr>
+          <w:rStyle w:val="CommentReference"/>
+        </w:rPr>
+        <w:commentReference w:id="9"/>
+      </w:r>
+    </w:p>
+    <w:p>
+      <w:pPr>
+        <w:spacing w:line="480" w:lineRule="auto"/>
+        <w:rPr>
+          <w:rFonts w:ascii="Times New Roman" w:eastAsia="Times New Roman" w:hAnsi="Times New Roman" w:cs="Times New Roman"/>
+          <w:sz w:val="24"/>
+          <w:szCs w:val="24"/>
+        </w:rPr>
+      </w:pPr>
+      <w:r>
+        <w:rPr>
+          <w:rFonts w:ascii="Times New Roman" w:eastAsia="Times New Roman" w:hAnsi="Times New Roman" w:cs="Times New Roman"/>
           <w:sz w:val="24"/>
           <w:szCs w:val="24"/>
         </w:rPr>
         <w:tab/>
-        <w:t xml:space="preserve"> Before a quantitative definition of a boom-bust can be made, the different phases of the invasion should be identified (Figure 1)</w:t>
+        <w:t xml:space="preserve"> Before a quantitative definition of a boom-bust can be made, the different phases of the invasion should be identified</w:t>
       </w:r>
       <w:r>
         <w:rPr>
@@ -9048,6 +9369,14 @@
           <w:sz w:val="24"/>
           <w:szCs w:val="24"/>
         </w:rPr>
+        <w:t xml:space="preserve"> (Figure 1)</w:t>
+      </w:r>
+      <w:r>
+        <w:rPr>
+          <w:rFonts w:ascii="Times New Roman" w:eastAsia="Times New Roman" w:hAnsi="Times New Roman" w:cs="Times New Roman"/>
+          <w:sz w:val="24"/>
+          <w:szCs w:val="24"/>
+        </w:rPr>
         <w:t xml:space="preserve">.  </w:t>
       </w:r>
       <w:r>
@@ -9160,7 +9489,62 @@
           <w:sz w:val="24"/>
           <w:szCs w:val="24"/>
         </w:rPr>
-        <w:t xml:space="preserve"> (Citation)</w:t>
+        <w:t xml:space="preserve"> </w:t>
+      </w:r>
+      <w:r>
+        <w:rPr>
+          <w:rFonts w:ascii="Times New Roman" w:eastAsia="Times New Roman" w:hAnsi="Times New Roman" w:cs="Times New Roman"/>
+          <w:sz w:val="24"/>
+          <w:szCs w:val="24"/>
+        </w:rPr>
+        <w:fldChar w:fldCharType="begin"/>
+      </w:r>
+      <w:r>
+        <w:rPr>
+          <w:rFonts w:ascii="Times New Roman" w:eastAsia="Times New Roman" w:hAnsi="Times New Roman" w:cs="Times New Roman"/>
+          <w:sz w:val="24"/>
+          <w:szCs w:val="24"/>
+        </w:rPr>
+        <w:instrText xml:space="preserve"> ADDIN ZOTERO_ITEM CSL_CITATION {"citationID":"oLAJKmZ3","properties":{"formattedCitation":"(Sandstr\\uc0\\u246{}m {\\i{}et al.} 2014)","plainCitation":"(Sandström et al. 2014)","noteIndex":0},"citationItems":[{"id":199,"uris":["http://zotero.org/users/9972654/items/VFU2AJ2S"],"itemData":{"id":199,"type":"article-journal","container-title":"Biological Invasions","DOI":"10.1007/s10530-014-0641-1","ISSN":"1387-3547, 1573-1464","issue":"9","journalAbbreviation":"Biol Invasions","language":"en","page":"1961-1977","source":"DOI.org (Crossref)","title":"Population collapses in introduced non-indigenous crayfish","volume":"16","author":[{"family":"Sandström","given":"Alfred"},{"family":"Andersson","given":"Magnus"},{"family":"Asp","given":"Anders"},{"family":"Bohman","given":"Patrik"},{"family":"Edsman","given":"Lennart"},{"family":"Engdahl","given":"Fredrik"},{"family":"Nyström","given":"Per"},{"family":"Stenberg","given":"Marika"},{"family":"Hertonsson","given":"Pia"},{"family":"Vrålstad","given":"Trude"},{"family":"Granèli","given":"Wilhelm"}],"issued":{"date-parts":[["2014",9]]}}}],"schema":"https://github.com/citation-style-language/schema/raw/master/csl-citation.json"} </w:instrText>
+      </w:r>
+      <w:r>
+        <w:rPr>
+          <w:rFonts w:ascii="Times New Roman" w:eastAsia="Times New Roman" w:hAnsi="Times New Roman" w:cs="Times New Roman"/>
+          <w:sz w:val="24"/>
+          <w:szCs w:val="24"/>
+        </w:rPr>
+        <w:fldChar w:fldCharType="separate"/>
+      </w:r>
+      <w:r>
+        <w:rPr>
+          <w:rFonts w:ascii="Times New Roman" w:hAnsi="Times New Roman" w:cs="Times New Roman"/>
+          <w:sz w:val="24"/>
+        </w:rPr>
+        <w:t xml:space="preserve">(Sandström </w:t>
+      </w:r>
+      <w:r>
+        <w:rPr>
+          <w:rFonts w:ascii="Times New Roman" w:hAnsi="Times New Roman" w:cs="Times New Roman"/>
+          <w:i/>
+          <w:iCs/>
+          <w:sz w:val="24"/>
+        </w:rPr>
+        <w:t>et al.</w:t>
+      </w:r>
+      <w:r>
+        <w:rPr>
+          <w:rFonts w:ascii="Times New Roman" w:hAnsi="Times New Roman" w:cs="Times New Roman"/>
+          <w:sz w:val="24"/>
+        </w:rPr>
+        <w:t xml:space="preserve"> 2014)</w:t>
+      </w:r>
+      <w:r>
+        <w:rPr>
+          <w:rFonts w:ascii="Times New Roman" w:eastAsia="Times New Roman" w:hAnsi="Times New Roman" w:cs="Times New Roman"/>
+          <w:sz w:val="24"/>
+          <w:szCs w:val="24"/>
+        </w:rPr>
+        <w:fldChar w:fldCharType="end"/>
       </w:r>
       <w:r>
         <w:rPr>
@@ -10213,6 +10597,7 @@
         <w:spacing w:line="480" w:lineRule="auto"/>
         <w:rPr>
           <w:rFonts w:ascii="Times New Roman" w:eastAsia="Times New Roman" w:hAnsi="Times New Roman" w:cs="Times New Roman"/>
+          <w:b/>
           <w:sz w:val="24"/>
           <w:szCs w:val="24"/>
         </w:rPr>
@@ -10240,6 +10625,14 @@
           <w:sz w:val="24"/>
           <w:szCs w:val="24"/>
         </w:rPr>
+        <w:t xml:space="preserve"> (Figure 1)</w:t>
+      </w:r>
+      <w:r>
+        <w:rPr>
+          <w:rFonts w:ascii="Times New Roman" w:eastAsia="Times New Roman" w:hAnsi="Times New Roman" w:cs="Times New Roman"/>
+          <w:sz w:val="24"/>
+          <w:szCs w:val="24"/>
+        </w:rPr>
         <w:t xml:space="preserve">.  Creating metrics </w:t>
       </w:r>
       <w:r>
@@ -10602,7 +10995,7 @@
           <w:sz w:val="24"/>
           <w:szCs w:val="24"/>
         </w:rPr>
-        <w:t>variatiability</w:t>
+        <w:t>variability</w:t>
       </w:r>
       <w:r>
         <w:rPr>
@@ -10806,7 +11199,7 @@
           <w:sz w:val="24"/>
           <w:szCs w:val="24"/>
         </w:rPr>
-        <w:t xml:space="preserve"> the magnitude of </w:t>
+        <w:t xml:space="preserve"> the </w:t>
       </w:r>
       <w:r>
         <w:rPr>
@@ -10815,7 +11208,7 @@
           <w:szCs w:val="24"/>
         </w:rPr>
         <w:lastRenderedPageBreak/>
-        <w:t>decline, and the duration</w:t>
+        <w:t>magnitude of decline, and the duration</w:t>
       </w:r>
       <w:r>
         <w:rPr>
@@ -10986,17 +11379,6 @@
         </w:rPr>
         <w:t xml:space="preserve"> </w:t>
       </w:r>
-    </w:p>
-    <w:p>
-      <w:pPr>
-        <w:spacing w:line="480" w:lineRule="auto"/>
-        <w:rPr>
-          <w:rFonts w:ascii="Times New Roman" w:eastAsia="Times New Roman" w:hAnsi="Times New Roman" w:cs="Times New Roman"/>
-          <w:b/>
-          <w:sz w:val="24"/>
-          <w:szCs w:val="24"/>
-        </w:rPr>
-      </w:pPr>
     </w:p>
     <w:sectPr>
       <w:pgSz w:w="12240" w:h="15840"/>
@@ -11072,11 +11454,11 @@
         <w:annotationRef/>
       </w:r>
       <w:r>
-        <w:t>This is a result I think</w:t>
+        <w:t>Compile this appendix</w:t>
       </w:r>
     </w:p>
   </w:comment>
-  <w:comment w:id="4" w:author="Nathan Barrus" w:date="2025-07-24T17:00:00Z" w:initials="NB">
+  <w:comment w:id="4" w:author="Nathan Barrus" w:date="2025-08-04T18:01:00Z" w:initials="NB">
     <w:p>
       <w:pPr>
         <w:pStyle w:val="CommentText"/>
@@ -11088,11 +11470,11 @@
         <w:annotationRef/>
       </w:r>
       <w:r>
-        <w:t>Compile this appendix</w:t>
+        <w:t>Create the text box about coming up with the definition of boom-bust and the metrics and components of a boom-bust</w:t>
       </w:r>
     </w:p>
   </w:comment>
-  <w:comment w:id="5" w:author="Nathan Barrus" w:date="2025-08-04T18:01:00Z" w:initials="NB">
+  <w:comment w:id="5" w:author="Nathan Barrus" w:date="2025-08-05T12:07:00Z" w:initials="NB">
     <w:p>
       <w:pPr>
         <w:pStyle w:val="CommentText"/>
@@ -11104,11 +11486,11 @@
         <w:annotationRef/>
       </w:r>
       <w:r>
-        <w:t>Create the text box about coming up with the definition of boom-bust and the metrics and components of a boom-bust</w:t>
+        <w:t>Make sure to make this appendix.</w:t>
       </w:r>
     </w:p>
   </w:comment>
-  <w:comment w:id="6" w:author="Nathan Barrus" w:date="2025-08-05T12:07:00Z" w:initials="NB">
+  <w:comment w:id="6" w:author="Nathan Barrus" w:date="2025-07-24T17:00:00Z" w:initials="NB">
     <w:p>
       <w:pPr>
         <w:pStyle w:val="CommentText"/>
@@ -11120,11 +11502,11 @@
         <w:annotationRef/>
       </w:r>
       <w:r>
-        <w:t>Make sure to make this appendix.</w:t>
+        <w:t>This is a result I think</w:t>
       </w:r>
     </w:p>
   </w:comment>
-  <w:comment w:id="7" w:author="Nathan Barrus" w:date="2025-07-16T14:17:00Z" w:initials="NB">
+  <w:comment w:id="7" w:author="Nathan Barrus" w:date="2025-08-08T16:17:00Z" w:initials="NB">
     <w:p>
       <w:pPr>
         <w:pStyle w:val="CommentText"/>
@@ -11136,11 +11518,27 @@
         <w:annotationRef/>
       </w:r>
       <w:r>
-        <w:t>A discussion topic maybe?</w:t>
+        <w:t>Make this time series</w:t>
       </w:r>
     </w:p>
   </w:comment>
-  <w:comment w:id="8" w:author="Nathan Barrus" w:date="2025-08-05T12:08:00Z" w:initials="NB">
+  <w:comment w:id="8" w:author="Nathan Barrus" w:date="2025-07-16T14:17:00Z" w:initials="NB">
+    <w:p>
+      <w:pPr>
+        <w:pStyle w:val="CommentText"/>
+      </w:pPr>
+      <w:r>
+        <w:rPr>
+          <w:rStyle w:val="CommentReference"/>
+        </w:rPr>
+        <w:annotationRef/>
+      </w:r>
+      <w:r>
+        <w:t>A discussion topic maybe?</w:t>
+      </w:r>
+    </w:p>
+  </w:comment>
+  <w:comment w:id="9" w:author="Nathan Barrus" w:date="2025-08-05T12:08:00Z" w:initials="NB">
     <w:p>
       <w:pPr>
         <w:pStyle w:val="CommentText"/>
@@ -11164,10 +11562,11 @@
   <w15:commentEx w15:paraId="46846918" w15:done="0"/>
   <w15:commentEx w15:paraId="38434E2B" w15:done="0"/>
   <w15:commentEx w15:paraId="555F58FE" w15:done="0"/>
-  <w15:commentEx w15:paraId="57D59D2C" w15:done="0"/>
   <w15:commentEx w15:paraId="6D117937" w15:done="0"/>
   <w15:commentEx w15:paraId="74C8DBA3" w15:done="0"/>
   <w15:commentEx w15:paraId="594748FA" w15:done="0"/>
+  <w15:commentEx w15:paraId="2B979261" w15:done="0"/>
+  <w15:commentEx w15:paraId="47B11C30" w15:done="0"/>
   <w15:commentEx w15:paraId="48A24572" w15:done="0"/>
   <w15:commentEx w15:paraId="3BD742B1" w15:done="0"/>
 </w15:commentsEx>
@@ -11178,10 +11577,11 @@
   <w16cex:commentExtensible w16cex:durableId="355BEC0B" w16cex:dateUtc="2025-07-22T14:47:00Z"/>
   <w16cex:commentExtensible w16cex:durableId="73CC0037" w16cex:dateUtc="2025-07-22T14:46:00Z"/>
   <w16cex:commentExtensible w16cex:durableId="49F149A7" w16cex:dateUtc="2025-07-22T16:02:00Z"/>
-  <w16cex:commentExtensible w16cex:durableId="70B2B2D6" w16cex:dateUtc="2025-07-24T21:00:00Z"/>
   <w16cex:commentExtensible w16cex:durableId="5360C101" w16cex:dateUtc="2025-07-24T21:00:00Z"/>
   <w16cex:commentExtensible w16cex:durableId="2C3F37AB" w16cex:dateUtc="2025-08-04T22:01:00Z"/>
   <w16cex:commentExtensible w16cex:durableId="1DE00FA0" w16cex:dateUtc="2025-08-05T16:07:00Z"/>
+  <w16cex:commentExtensible w16cex:durableId="70B2B2D6" w16cex:dateUtc="2025-07-24T21:00:00Z"/>
+  <w16cex:commentExtensible w16cex:durableId="1502B944" w16cex:dateUtc="2025-08-08T20:17:00Z"/>
   <w16cex:commentExtensible w16cex:durableId="4D689BC5" w16cex:dateUtc="2025-07-16T18:17:00Z"/>
   <w16cex:commentExtensible w16cex:durableId="3A0923E2" w16cex:dateUtc="2025-08-05T16:08:00Z"/>
 </w16cex:commentsExtensible>
@@ -11192,10 +11592,11 @@
   <w16cid:commentId w16cid:paraId="46846918" w16cid:durableId="355BEC0B"/>
   <w16cid:commentId w16cid:paraId="38434E2B" w16cid:durableId="73CC0037"/>
   <w16cid:commentId w16cid:paraId="555F58FE" w16cid:durableId="49F149A7"/>
-  <w16cid:commentId w16cid:paraId="57D59D2C" w16cid:durableId="70B2B2D6"/>
   <w16cid:commentId w16cid:paraId="6D117937" w16cid:durableId="5360C101"/>
   <w16cid:commentId w16cid:paraId="74C8DBA3" w16cid:durableId="2C3F37AB"/>
   <w16cid:commentId w16cid:paraId="594748FA" w16cid:durableId="1DE00FA0"/>
+  <w16cid:commentId w16cid:paraId="2B979261" w16cid:durableId="70B2B2D6"/>
+  <w16cid:commentId w16cid:paraId="47B11C30" w16cid:durableId="1502B944"/>
   <w16cid:commentId w16cid:paraId="48A24572" w16cid:durableId="4D689BC5"/>
   <w16cid:commentId w16cid:paraId="3BD742B1" w16cid:durableId="3A0923E2"/>
 </w16cid:commentsIds>
@@ -12017,7 +12418,6 @@
   <w:style w:type="character" w:default="1" w:styleId="DefaultParagraphFont">
     <w:name w:val="Default Paragraph Font"/>
     <w:uiPriority w:val="1"/>
-    <w:semiHidden/>
     <w:unhideWhenUsed/>
   </w:style>
   <w:style w:type="table" w:default="1" w:styleId="TableNormal">

</xml_diff>

<commit_message>
Boom-Bust-new time series form tyler 2010 ecological monographs: 8-21-2025
</commit_message>
<xml_diff>
--- a/ms/BoomBust_ms_v2nb.docx
+++ b/ms/BoomBust_ms_v2nb.docx
@@ -560,77 +560,23 @@
           <w:sz w:val="24"/>
           <w:szCs w:val="24"/>
         </w:rPr>
-        <w:t xml:space="preserve">Abstract Word </w:t>
-      </w:r>
-      <w:proofErr w:type="gramStart"/>
-      <w:r>
-        <w:rPr>
-          <w:rFonts w:ascii="Times New Roman" w:eastAsia="Times New Roman" w:hAnsi="Times New Roman" w:cs="Times New Roman"/>
-          <w:sz w:val="24"/>
-          <w:szCs w:val="24"/>
-        </w:rPr>
-        <w:t>Count (##</w:t>
-      </w:r>
-      <w:proofErr w:type="gramEnd"/>
-      <w:r>
-        <w:rPr>
-          <w:rFonts w:ascii="Times New Roman" w:eastAsia="Times New Roman" w:hAnsi="Times New Roman" w:cs="Times New Roman"/>
-          <w:sz w:val="24"/>
-          <w:szCs w:val="24"/>
-        </w:rPr>
-        <w:t xml:space="preserve">), </w:t>
-      </w:r>
-      <w:r>
-        <w:rPr>
-          <w:rFonts w:ascii="Times New Roman" w:eastAsia="Times New Roman" w:hAnsi="Times New Roman" w:cs="Times New Roman"/>
-          <w:sz w:val="24"/>
-          <w:szCs w:val="24"/>
-        </w:rPr>
-        <w:t xml:space="preserve">Main </w:t>
-      </w:r>
-      <w:proofErr w:type="gramStart"/>
-      <w:r>
-        <w:rPr>
-          <w:rFonts w:ascii="Times New Roman" w:eastAsia="Times New Roman" w:hAnsi="Times New Roman" w:cs="Times New Roman"/>
-          <w:sz w:val="24"/>
-          <w:szCs w:val="24"/>
-        </w:rPr>
-        <w:t>Text (##</w:t>
-      </w:r>
-      <w:proofErr w:type="gramEnd"/>
-      <w:r>
-        <w:rPr>
-          <w:rFonts w:ascii="Times New Roman" w:eastAsia="Times New Roman" w:hAnsi="Times New Roman" w:cs="Times New Roman"/>
-          <w:sz w:val="24"/>
-          <w:szCs w:val="24"/>
-        </w:rPr>
-        <w:t>), Text Box</w:t>
-      </w:r>
-      <w:r>
-        <w:rPr>
-          <w:rFonts w:ascii="Times New Roman" w:eastAsia="Times New Roman" w:hAnsi="Times New Roman" w:cs="Times New Roman"/>
-          <w:sz w:val="24"/>
-          <w:szCs w:val="24"/>
-        </w:rPr>
-        <w:t xml:space="preserve"> 1 Word </w:t>
-      </w:r>
-      <w:proofErr w:type="gramStart"/>
-      <w:r>
-        <w:rPr>
-          <w:rFonts w:ascii="Times New Roman" w:eastAsia="Times New Roman" w:hAnsi="Times New Roman" w:cs="Times New Roman"/>
-          <w:sz w:val="24"/>
-          <w:szCs w:val="24"/>
-        </w:rPr>
-        <w:t>Count (##</w:t>
-      </w:r>
-      <w:proofErr w:type="gramEnd"/>
-      <w:r>
-        <w:rPr>
-          <w:rFonts w:ascii="Times New Roman" w:eastAsia="Times New Roman" w:hAnsi="Times New Roman" w:cs="Times New Roman"/>
-          <w:sz w:val="24"/>
-          <w:szCs w:val="24"/>
-        </w:rPr>
-        <w:t>)</w:t>
+        <w:t xml:space="preserve">Abstract Word Count (##), </w:t>
+      </w:r>
+      <w:r>
+        <w:rPr>
+          <w:rFonts w:ascii="Times New Roman" w:eastAsia="Times New Roman" w:hAnsi="Times New Roman" w:cs="Times New Roman"/>
+          <w:sz w:val="24"/>
+          <w:szCs w:val="24"/>
+        </w:rPr>
+        <w:t>Main Text (##), Text Box</w:t>
+      </w:r>
+      <w:r>
+        <w:rPr>
+          <w:rFonts w:ascii="Times New Roman" w:eastAsia="Times New Roman" w:hAnsi="Times New Roman" w:cs="Times New Roman"/>
+          <w:sz w:val="24"/>
+          <w:szCs w:val="24"/>
+        </w:rPr>
+        <w:t xml:space="preserve"> 1 Word Count (##)</w:t>
       </w:r>
     </w:p>
     <w:p>
@@ -642,77 +588,13 @@
           <w:szCs w:val="24"/>
         </w:rPr>
       </w:pPr>
-      <w:proofErr w:type="gramStart"/>
-      <w:r>
-        <w:rPr>
-          <w:rFonts w:ascii="Times New Roman" w:eastAsia="Times New Roman" w:hAnsi="Times New Roman" w:cs="Times New Roman"/>
-          <w:sz w:val="24"/>
-          <w:szCs w:val="24"/>
-        </w:rPr>
-        <w:t>References (##</w:t>
-      </w:r>
-      <w:proofErr w:type="gramEnd"/>
-      <w:r>
-        <w:rPr>
-          <w:rFonts w:ascii="Times New Roman" w:eastAsia="Times New Roman" w:hAnsi="Times New Roman" w:cs="Times New Roman"/>
-          <w:sz w:val="24"/>
-          <w:szCs w:val="24"/>
-        </w:rPr>
-        <w:t xml:space="preserve">), </w:t>
-      </w:r>
-      <w:proofErr w:type="gramStart"/>
-      <w:r>
-        <w:rPr>
-          <w:rFonts w:ascii="Times New Roman" w:eastAsia="Times New Roman" w:hAnsi="Times New Roman" w:cs="Times New Roman"/>
-          <w:sz w:val="24"/>
-          <w:szCs w:val="24"/>
-        </w:rPr>
-        <w:t>Figures (##</w:t>
-      </w:r>
-      <w:proofErr w:type="gramEnd"/>
-      <w:r>
-        <w:rPr>
-          <w:rFonts w:ascii="Times New Roman" w:eastAsia="Times New Roman" w:hAnsi="Times New Roman" w:cs="Times New Roman"/>
-          <w:sz w:val="24"/>
-          <w:szCs w:val="24"/>
-        </w:rPr>
-        <w:t xml:space="preserve">), </w:t>
-      </w:r>
-      <w:proofErr w:type="gramStart"/>
-      <w:r>
-        <w:rPr>
-          <w:rFonts w:ascii="Times New Roman" w:eastAsia="Times New Roman" w:hAnsi="Times New Roman" w:cs="Times New Roman"/>
-          <w:sz w:val="24"/>
-          <w:szCs w:val="24"/>
-        </w:rPr>
-        <w:t>Tables (##</w:t>
-      </w:r>
-      <w:proofErr w:type="gramEnd"/>
-      <w:r>
-        <w:rPr>
-          <w:rFonts w:ascii="Times New Roman" w:eastAsia="Times New Roman" w:hAnsi="Times New Roman" w:cs="Times New Roman"/>
-          <w:sz w:val="24"/>
-          <w:szCs w:val="24"/>
-        </w:rPr>
-        <w:t xml:space="preserve">), Text </w:t>
-      </w:r>
-      <w:proofErr w:type="gramStart"/>
-      <w:r>
-        <w:rPr>
-          <w:rFonts w:ascii="Times New Roman" w:eastAsia="Times New Roman" w:hAnsi="Times New Roman" w:cs="Times New Roman"/>
-          <w:sz w:val="24"/>
-          <w:szCs w:val="24"/>
-        </w:rPr>
-        <w:t>boxes (##</w:t>
-      </w:r>
-      <w:proofErr w:type="gramEnd"/>
-      <w:r>
-        <w:rPr>
-          <w:rFonts w:ascii="Times New Roman" w:eastAsia="Times New Roman" w:hAnsi="Times New Roman" w:cs="Times New Roman"/>
-          <w:sz w:val="24"/>
-          <w:szCs w:val="24"/>
-        </w:rPr>
-        <w:t>)</w:t>
+      <w:r>
+        <w:rPr>
+          <w:rFonts w:ascii="Times New Roman" w:eastAsia="Times New Roman" w:hAnsi="Times New Roman" w:cs="Times New Roman"/>
+          <w:sz w:val="24"/>
+          <w:szCs w:val="24"/>
+        </w:rPr>
+        <w:t>References (##), Figures (##), Tables (##), Text boxes (##)</w:t>
       </w:r>
     </w:p>
     <w:p>
@@ -758,25 +640,7 @@
           <w:sz w:val="24"/>
           <w:szCs w:val="24"/>
         </w:rPr>
-        <w:t xml:space="preserve">Upon acceptance, all data and code associated with the manuscript will be provided in </w:t>
-      </w:r>
-      <w:proofErr w:type="spellStart"/>
-      <w:r>
-        <w:rPr>
-          <w:rFonts w:ascii="Times New Roman" w:eastAsia="Times New Roman" w:hAnsi="Times New Roman" w:cs="Times New Roman"/>
-          <w:sz w:val="24"/>
-          <w:szCs w:val="24"/>
-        </w:rPr>
-        <w:t>Zenodo</w:t>
-      </w:r>
-      <w:proofErr w:type="spellEnd"/>
-      <w:r>
-        <w:rPr>
-          <w:rFonts w:ascii="Times New Roman" w:eastAsia="Times New Roman" w:hAnsi="Times New Roman" w:cs="Times New Roman"/>
-          <w:sz w:val="24"/>
-          <w:szCs w:val="24"/>
-        </w:rPr>
-        <w:t>. For review, the data and code can be found in (</w:t>
+        <w:t>Upon acceptance, all data and code associated with the manuscript will be provided in Zenodo. For review, the data and code can be found in (</w:t>
       </w:r>
       <w:r>
         <w:rPr>
@@ -808,7 +672,6 @@
           <w:pgSz w:w="12240" w:h="15840"/>
           <w:pgMar w:top="1440" w:right="1440" w:bottom="1440" w:left="1440" w:header="720" w:footer="720" w:gutter="0"/>
           <w:lnNumType w:countBy="1" w:restart="continuous"/>
-          <w:pgNumType w:start="1"/>
           <w:cols w:space="720"/>
           <w:docGrid w:linePitch="299"/>
         </w:sectPr>
@@ -961,43 +824,7 @@
           <w:sz w:val="24"/>
           <w:szCs w:val="24"/>
         </w:rPr>
-        <w:t xml:space="preserve">), severe (≥ 90%), and sustained (≥3 years).  I also present a variety of metrics to describe population growth when making comparisons across </w:t>
-      </w:r>
-      <w:proofErr w:type="gramStart"/>
-      <w:r>
-        <w:rPr>
-          <w:rFonts w:ascii="Times New Roman" w:eastAsia="Gungsuh" w:hAnsi="Times New Roman" w:cs="Times New Roman"/>
-          <w:sz w:val="24"/>
-          <w:szCs w:val="24"/>
-        </w:rPr>
-        <w:t>taxa</w:t>
-      </w:r>
-      <w:proofErr w:type="gramEnd"/>
-      <w:r>
-        <w:rPr>
-          <w:rFonts w:ascii="Times New Roman" w:eastAsia="Gungsuh" w:hAnsi="Times New Roman" w:cs="Times New Roman"/>
-          <w:sz w:val="24"/>
-          <w:szCs w:val="24"/>
-        </w:rPr>
-        <w:t xml:space="preserve"> and subpopulations. I use my identification to identify 28 studies document boom-bust cycles across </w:t>
-      </w:r>
-      <w:proofErr w:type="gramStart"/>
-      <w:r>
-        <w:rPr>
-          <w:rFonts w:ascii="Times New Roman" w:eastAsia="Gungsuh" w:hAnsi="Times New Roman" w:cs="Times New Roman"/>
-          <w:sz w:val="24"/>
-          <w:szCs w:val="24"/>
-        </w:rPr>
-        <w:t>taxa</w:t>
-      </w:r>
-      <w:proofErr w:type="gramEnd"/>
-      <w:r>
-        <w:rPr>
-          <w:rFonts w:ascii="Times New Roman" w:eastAsia="Gungsuh" w:hAnsi="Times New Roman" w:cs="Times New Roman"/>
-          <w:sz w:val="24"/>
-          <w:szCs w:val="24"/>
-        </w:rPr>
-        <w:t xml:space="preserve"> and systems with 2 studies documenting repeated boom-bust cycles.</w:t>
+        <w:t>), severe (≥ 90%), and sustained (≥3 years).  I also present a variety of metrics to describe population growth when making comparisons across taxa and subpopulations. I use my identification to identify 28 studies document boom-bust cycles across taxa and systems with 2 studies documenting repeated boom-bust cycles.</w:t>
       </w:r>
     </w:p>
     <w:p>
@@ -2906,25 +2733,7 @@
           <w:sz w:val="24"/>
           <w:szCs w:val="24"/>
         </w:rPr>
-        <w:t xml:space="preserve"> using Web of Science with the following keywords: boom and bust; explosion and crash; population and explosion; population and outbreak; population and cycles; </w:t>
-      </w:r>
-      <w:proofErr w:type="spellStart"/>
-      <w:r>
-        <w:rPr>
-          <w:rFonts w:ascii="Times New Roman" w:eastAsia="Times New Roman" w:hAnsi="Times New Roman" w:cs="Times New Roman"/>
-          <w:sz w:val="24"/>
-          <w:szCs w:val="24"/>
-        </w:rPr>
-        <w:t>fluctuat</w:t>
-      </w:r>
-      <w:proofErr w:type="spellEnd"/>
-      <w:r>
-        <w:rPr>
-          <w:rFonts w:ascii="Times New Roman" w:eastAsia="Times New Roman" w:hAnsi="Times New Roman" w:cs="Times New Roman"/>
-          <w:sz w:val="24"/>
-          <w:szCs w:val="24"/>
-        </w:rPr>
-        <w:t xml:space="preserve">* populations.  </w:t>
+        <w:t xml:space="preserve"> using Web of Science with the following keywords: boom and bust; explosion and crash; population and explosion; population and outbreak; population and cycles; fluctuat* populations.  </w:t>
       </w:r>
       <w:r>
         <w:rPr>
@@ -3359,25 +3168,7 @@
           <w:sz w:val="24"/>
           <w:szCs w:val="24"/>
         </w:rPr>
-        <w:t xml:space="preserve">s using the </w:t>
-      </w:r>
-      <w:proofErr w:type="spellStart"/>
-      <w:r>
-        <w:rPr>
-          <w:rFonts w:ascii="Times New Roman" w:eastAsia="Times New Roman" w:hAnsi="Times New Roman" w:cs="Times New Roman"/>
-          <w:sz w:val="24"/>
-          <w:szCs w:val="24"/>
-        </w:rPr>
-        <w:t>metaDigitise</w:t>
-      </w:r>
-      <w:proofErr w:type="spellEnd"/>
-      <w:r>
-        <w:rPr>
-          <w:rFonts w:ascii="Times New Roman" w:eastAsia="Times New Roman" w:hAnsi="Times New Roman" w:cs="Times New Roman"/>
-          <w:sz w:val="24"/>
-          <w:szCs w:val="24"/>
-        </w:rPr>
-        <w:t xml:space="preserve"> package</w:t>
+        <w:t>s using the metaDigitise package</w:t>
       </w:r>
       <w:r>
         <w:rPr>
@@ -3527,7 +3318,23 @@
           <w:sz w:val="24"/>
           <w:szCs w:val="24"/>
         </w:rPr>
-        <w:t>the survey frequence (i.e., yearly, monthly, twice a year, every two years, three times a year, weekly, every two months), the population metric (i.e., Annual Maximum Density, Biomass, Biovolume, Captures, CPUE, Density, Harvest, abundance, Percent Cover, Trap Success),</w:t>
+        <w:t xml:space="preserve">the survey frequence (i.e., yearly, monthly, twice a year, every two years, three times a year, weekly, every two months), the population metric (i.e., Annual Maximum Density, Biomass, Biovolume, Captures, CPUE, Density, Harvest, </w:t>
+      </w:r>
+      <w:r>
+        <w:rPr>
+          <w:rFonts w:ascii="Times New Roman" w:eastAsia="Times New Roman" w:hAnsi="Times New Roman" w:cs="Times New Roman"/>
+          <w:sz w:val="24"/>
+          <w:szCs w:val="24"/>
+        </w:rPr>
+        <w:t>A</w:t>
+      </w:r>
+      <w:r>
+        <w:rPr>
+          <w:rFonts w:ascii="Times New Roman" w:eastAsia="Times New Roman" w:hAnsi="Times New Roman" w:cs="Times New Roman"/>
+          <w:sz w:val="24"/>
+          <w:szCs w:val="24"/>
+        </w:rPr>
+        <w:t>bundance, Percent Cover, Trap Success),</w:t>
       </w:r>
       <w:r>
         <w:rPr>
@@ -3836,25 +3643,7 @@
           <w:sz w:val="24"/>
           <w:szCs w:val="24"/>
         </w:rPr>
-        <w:t xml:space="preserve">, respectively. The remaining taxa were found in large trait databases when available (i.e., </w:t>
-      </w:r>
-      <w:proofErr w:type="spellStart"/>
-      <w:r>
-        <w:rPr>
-          <w:rFonts w:ascii="Times New Roman" w:eastAsia="Times New Roman" w:hAnsi="Times New Roman" w:cs="Times New Roman"/>
-          <w:sz w:val="24"/>
-          <w:szCs w:val="24"/>
-        </w:rPr>
-        <w:t>AnAge</w:t>
-      </w:r>
-      <w:proofErr w:type="spellEnd"/>
-      <w:r>
-        <w:rPr>
-          <w:rFonts w:ascii="Times New Roman" w:eastAsia="Times New Roman" w:hAnsi="Times New Roman" w:cs="Times New Roman"/>
-          <w:sz w:val="24"/>
-          <w:szCs w:val="24"/>
-        </w:rPr>
-        <w:t>-</w:t>
+        <w:t>, respectively. The remaining taxa were found in large trait databases when available (i.e., AnAge-</w:t>
       </w:r>
       <w:r>
         <w:rPr>
@@ -3901,25 +3690,7 @@
           <w:sz w:val="24"/>
           <w:szCs w:val="24"/>
         </w:rPr>
-        <w:t xml:space="preserve">, </w:t>
-      </w:r>
-      <w:proofErr w:type="spellStart"/>
-      <w:r>
-        <w:rPr>
-          <w:rFonts w:ascii="Times New Roman" w:eastAsia="Times New Roman" w:hAnsi="Times New Roman" w:cs="Times New Roman"/>
-          <w:sz w:val="24"/>
-          <w:szCs w:val="24"/>
-        </w:rPr>
-        <w:t>FishBase</w:t>
-      </w:r>
-      <w:proofErr w:type="spellEnd"/>
-      <w:r>
-        <w:rPr>
-          <w:rFonts w:ascii="Times New Roman" w:eastAsia="Times New Roman" w:hAnsi="Times New Roman" w:cs="Times New Roman"/>
-          <w:sz w:val="24"/>
-          <w:szCs w:val="24"/>
-        </w:rPr>
-        <w:t>-</w:t>
+        <w:t>, FishBase-</w:t>
       </w:r>
       <w:r>
         <w:rPr>
@@ -4000,7 +3771,6 @@
         </w:rPr>
         <w:t>-</w:t>
       </w:r>
-      <w:proofErr w:type="spellStart"/>
       <w:r>
         <w:rPr>
           <w:rFonts w:ascii="Times New Roman" w:eastAsia="Times New Roman" w:hAnsi="Times New Roman" w:cs="Times New Roman"/>
@@ -4030,15 +3800,7 @@
           <w:rFonts w:ascii="Times New Roman" w:hAnsi="Times New Roman" w:cs="Times New Roman"/>
           <w:sz w:val="24"/>
         </w:rPr>
-        <w:t>Kattge</w:t>
-      </w:r>
-      <w:proofErr w:type="spellEnd"/>
-      <w:r>
-        <w:rPr>
-          <w:rFonts w:ascii="Times New Roman" w:hAnsi="Times New Roman" w:cs="Times New Roman"/>
-          <w:sz w:val="24"/>
-        </w:rPr>
-        <w:t xml:space="preserve"> </w:t>
+        <w:t xml:space="preserve">Kattge </w:t>
       </w:r>
       <w:r>
         <w:rPr>
@@ -4295,25 +4057,7 @@
           <w:sz w:val="24"/>
           <w:szCs w:val="24"/>
         </w:rPr>
-        <w:t xml:space="preserve">, thus we took the average population metric across the habitats.  Thus, </w:t>
-      </w:r>
-      <w:proofErr w:type="spellStart"/>
-      <w:r>
-        <w:rPr>
-          <w:rFonts w:ascii="Times New Roman" w:eastAsia="Times New Roman" w:hAnsi="Times New Roman" w:cs="Times New Roman"/>
-          <w:sz w:val="24"/>
-          <w:szCs w:val="24"/>
-        </w:rPr>
-        <w:t>all time</w:t>
-      </w:r>
-      <w:proofErr w:type="spellEnd"/>
-      <w:r>
-        <w:rPr>
-          <w:rFonts w:ascii="Times New Roman" w:eastAsia="Times New Roman" w:hAnsi="Times New Roman" w:cs="Times New Roman"/>
-          <w:sz w:val="24"/>
-          <w:szCs w:val="24"/>
-        </w:rPr>
-        <w:t xml:space="preserve"> series would have one record for each surveyed year. Using these yearly time series, we obtained the surveyed</w:t>
+        <w:t>, thus we took the average population metric across the habitats.  Thus, all time series would have one record for each surveyed year. Using these yearly time series, we obtained the surveyed</w:t>
       </w:r>
       <w:r>
         <w:rPr>
@@ -5021,25 +4765,7 @@
           <w:sz w:val="24"/>
           <w:szCs w:val="24"/>
         </w:rPr>
-        <w:t>“</w:t>
-      </w:r>
-      <w:proofErr w:type="spellStart"/>
-      <w:r>
-        <w:rPr>
-          <w:rFonts w:ascii="Times New Roman" w:eastAsia="Times New Roman" w:hAnsi="Times New Roman" w:cs="Times New Roman"/>
-          <w:sz w:val="24"/>
-          <w:szCs w:val="24"/>
-        </w:rPr>
-        <w:t>strucchange</w:t>
-      </w:r>
-      <w:proofErr w:type="spellEnd"/>
-      <w:r>
-        <w:rPr>
-          <w:rFonts w:ascii="Times New Roman" w:eastAsia="Times New Roman" w:hAnsi="Times New Roman" w:cs="Times New Roman"/>
-          <w:sz w:val="24"/>
-          <w:szCs w:val="24"/>
-        </w:rPr>
-        <w:t>” package in R</w:t>
+        <w:t>“strucchange” package in R</w:t>
       </w:r>
       <w:r>
         <w:rPr>
@@ -5257,7 +4983,6 @@
         </w:rPr>
         <w:t>signal crayfish (</w:t>
       </w:r>
-      <w:proofErr w:type="spellStart"/>
       <w:r>
         <w:rPr>
           <w:rFonts w:ascii="Times New Roman" w:eastAsia="Times New Roman" w:hAnsi="Times New Roman" w:cs="Times New Roman"/>
@@ -5266,31 +4991,8 @@
           <w:sz w:val="24"/>
           <w:szCs w:val="24"/>
         </w:rPr>
-        <w:t>Pacifastacus</w:t>
-      </w:r>
-      <w:proofErr w:type="spellEnd"/>
-      <w:r>
-        <w:rPr>
-          <w:rFonts w:ascii="Times New Roman" w:eastAsia="Times New Roman" w:hAnsi="Times New Roman" w:cs="Times New Roman"/>
-          <w:i/>
-          <w:iCs/>
-          <w:sz w:val="24"/>
-          <w:szCs w:val="24"/>
-        </w:rPr>
-        <w:t xml:space="preserve"> </w:t>
-      </w:r>
-      <w:proofErr w:type="spellStart"/>
-      <w:r>
-        <w:rPr>
-          <w:rFonts w:ascii="Times New Roman" w:eastAsia="Times New Roman" w:hAnsi="Times New Roman" w:cs="Times New Roman"/>
-          <w:i/>
-          <w:iCs/>
-          <w:sz w:val="24"/>
-          <w:szCs w:val="24"/>
-        </w:rPr>
-        <w:t>leniusculus</w:t>
-      </w:r>
-      <w:proofErr w:type="spellEnd"/>
+        <w:t>Pacifastacus leniusculus</w:t>
+      </w:r>
       <w:r>
         <w:rPr>
           <w:rFonts w:ascii="Times New Roman" w:eastAsia="Times New Roman" w:hAnsi="Times New Roman" w:cs="Times New Roman"/>
@@ -6490,25 +6192,7 @@
           <w:sz w:val="24"/>
           <w:szCs w:val="24"/>
         </w:rPr>
-        <w:t xml:space="preserve"> which met the criteria for a bust (i.e., </w:t>
-      </w:r>
-      <w:proofErr w:type="gramStart"/>
-      <w:r>
-        <w:rPr>
-          <w:rFonts w:ascii="Times New Roman" w:eastAsia="Times New Roman" w:hAnsi="Times New Roman" w:cs="Times New Roman"/>
-          <w:sz w:val="24"/>
-          <w:szCs w:val="24"/>
-        </w:rPr>
-        <w:t>fast  λ</w:t>
-      </w:r>
-      <w:proofErr w:type="gramEnd"/>
-      <w:r>
-        <w:rPr>
-          <w:rFonts w:ascii="Times New Roman" w:eastAsia="Times New Roman" w:hAnsi="Times New Roman" w:cs="Times New Roman"/>
-          <w:sz w:val="24"/>
-          <w:szCs w:val="24"/>
-        </w:rPr>
-        <w:t xml:space="preserve"> ≤ </w:t>
+        <w:t xml:space="preserve"> which met the criteria for a bust (i.e., fast  λ ≤ </w:t>
       </w:r>
       <w:r>
         <w:rPr>
@@ -6588,25 +6272,7 @@
           <w:sz w:val="24"/>
           <w:szCs w:val="24"/>
         </w:rPr>
-        <w:t xml:space="preserve"> series that documented regime </w:t>
-      </w:r>
-      <w:proofErr w:type="gramStart"/>
-      <w:r>
-        <w:rPr>
-          <w:rFonts w:ascii="Times New Roman" w:eastAsia="Times New Roman" w:hAnsi="Times New Roman" w:cs="Times New Roman"/>
-          <w:sz w:val="24"/>
-          <w:szCs w:val="24"/>
-        </w:rPr>
-        <w:t>shifts</w:t>
-      </w:r>
-      <w:proofErr w:type="gramEnd"/>
-      <w:r>
-        <w:rPr>
-          <w:rFonts w:ascii="Times New Roman" w:eastAsia="Times New Roman" w:hAnsi="Times New Roman" w:cs="Times New Roman"/>
-          <w:sz w:val="24"/>
-          <w:szCs w:val="24"/>
-        </w:rPr>
-        <w:t xml:space="preserve"> but the decline phase </w:t>
+        <w:t xml:space="preserve"> series that documented regime shifts but the decline phase </w:t>
       </w:r>
       <w:r>
         <w:rPr>
@@ -7890,7 +7556,6 @@
         </w:rPr>
         <w:t xml:space="preserve"> (</w:t>
       </w:r>
-      <w:proofErr w:type="spellStart"/>
       <w:r>
         <w:rPr>
           <w:rFonts w:ascii="Times New Roman" w:eastAsia="Times New Roman" w:hAnsi="Times New Roman" w:cs="Times New Roman"/>
@@ -7899,9 +7564,144 @@
           <w:sz w:val="24"/>
           <w:szCs w:val="24"/>
         </w:rPr>
-        <w:t>Potamopyrgus</w:t>
-      </w:r>
-      <w:proofErr w:type="spellEnd"/>
+        <w:t>Potamopyrgus antipodarum</w:t>
+      </w:r>
+      <w:r>
+        <w:rPr>
+          <w:rFonts w:ascii="Times New Roman" w:eastAsia="Times New Roman" w:hAnsi="Times New Roman" w:cs="Times New Roman"/>
+          <w:sz w:val="24"/>
+          <w:szCs w:val="24"/>
+        </w:rPr>
+        <w:t xml:space="preserve">) was </w:t>
+      </w:r>
+      <w:r>
+        <w:rPr>
+          <w:rFonts w:ascii="Times New Roman" w:eastAsia="Times New Roman" w:hAnsi="Times New Roman" w:cs="Times New Roman"/>
+          <w:sz w:val="24"/>
+          <w:szCs w:val="24"/>
+        </w:rPr>
+        <w:t xml:space="preserve">the </w:t>
+      </w:r>
+      <w:r>
+        <w:rPr>
+          <w:rFonts w:ascii="Times New Roman" w:eastAsia="Times New Roman" w:hAnsi="Times New Roman" w:cs="Times New Roman"/>
+          <w:sz w:val="24"/>
+          <w:szCs w:val="24"/>
+        </w:rPr>
+        <w:t>species</w:t>
+      </w:r>
+      <w:r>
+        <w:rPr>
+          <w:rFonts w:ascii="Times New Roman" w:eastAsia="Times New Roman" w:hAnsi="Times New Roman" w:cs="Times New Roman"/>
+          <w:sz w:val="24"/>
+          <w:szCs w:val="24"/>
+        </w:rPr>
+        <w:t xml:space="preserve"> that had the most documented boom-busts</w:t>
+      </w:r>
+      <w:r>
+        <w:rPr>
+          <w:rFonts w:ascii="Times New Roman" w:eastAsia="Times New Roman" w:hAnsi="Times New Roman" w:cs="Times New Roman"/>
+          <w:sz w:val="24"/>
+          <w:szCs w:val="24"/>
+        </w:rPr>
+        <w:t xml:space="preserve"> (Fig. 3B).</w:t>
+      </w:r>
+      <w:r>
+        <w:rPr>
+          <w:rFonts w:ascii="Times New Roman" w:eastAsia="Times New Roman" w:hAnsi="Times New Roman" w:cs="Times New Roman"/>
+          <w:sz w:val="24"/>
+          <w:szCs w:val="24"/>
+        </w:rPr>
+        <w:t xml:space="preserve"> </w:t>
+      </w:r>
+      <w:r>
+        <w:rPr>
+          <w:rFonts w:ascii="Times New Roman" w:eastAsia="Times New Roman" w:hAnsi="Times New Roman" w:cs="Times New Roman"/>
+          <w:sz w:val="24"/>
+          <w:szCs w:val="24"/>
+        </w:rPr>
+        <w:t>O</w:t>
+      </w:r>
+      <w:r>
+        <w:rPr>
+          <w:rFonts w:ascii="Times New Roman" w:eastAsia="Times New Roman" w:hAnsi="Times New Roman" w:cs="Times New Roman"/>
+          <w:sz w:val="24"/>
+          <w:szCs w:val="24"/>
+        </w:rPr>
+        <w:t xml:space="preserve">ther </w:t>
+      </w:r>
+      <w:r>
+        <w:rPr>
+          <w:rFonts w:ascii="Times New Roman" w:eastAsia="Times New Roman" w:hAnsi="Times New Roman" w:cs="Times New Roman"/>
+          <w:sz w:val="24"/>
+          <w:szCs w:val="24"/>
+        </w:rPr>
+        <w:t>species</w:t>
+      </w:r>
+      <w:r>
+        <w:rPr>
+          <w:rFonts w:ascii="Times New Roman" w:eastAsia="Times New Roman" w:hAnsi="Times New Roman" w:cs="Times New Roman"/>
+          <w:sz w:val="24"/>
+          <w:szCs w:val="24"/>
+        </w:rPr>
+        <w:t xml:space="preserve"> that </w:t>
+      </w:r>
+      <w:r>
+        <w:rPr>
+          <w:rFonts w:ascii="Times New Roman" w:eastAsia="Times New Roman" w:hAnsi="Times New Roman" w:cs="Times New Roman"/>
+          <w:sz w:val="24"/>
+          <w:szCs w:val="24"/>
+        </w:rPr>
+        <w:t xml:space="preserve">had multiple time series </w:t>
+      </w:r>
+      <w:r>
+        <w:rPr>
+          <w:rFonts w:ascii="Times New Roman" w:eastAsia="Times New Roman" w:hAnsi="Times New Roman" w:cs="Times New Roman"/>
+          <w:sz w:val="24"/>
+          <w:szCs w:val="24"/>
+        </w:rPr>
+        <w:t xml:space="preserve">with some evidence of a </w:t>
+      </w:r>
+      <w:r>
+        <w:rPr>
+          <w:rFonts w:ascii="Times New Roman" w:eastAsia="Times New Roman" w:hAnsi="Times New Roman" w:cs="Times New Roman"/>
+          <w:sz w:val="24"/>
+          <w:szCs w:val="24"/>
+        </w:rPr>
+        <w:t xml:space="preserve">boom-busts </w:t>
+      </w:r>
+      <w:r>
+        <w:rPr>
+          <w:rFonts w:ascii="Times New Roman" w:eastAsia="Times New Roman" w:hAnsi="Times New Roman" w:cs="Times New Roman"/>
+          <w:sz w:val="24"/>
+          <w:szCs w:val="24"/>
+        </w:rPr>
+        <w:t>were</w:t>
+      </w:r>
+      <w:r>
+        <w:rPr>
+          <w:rFonts w:ascii="Times New Roman" w:eastAsia="Times New Roman" w:hAnsi="Times New Roman" w:cs="Times New Roman"/>
+          <w:sz w:val="24"/>
+          <w:szCs w:val="24"/>
+        </w:rPr>
+        <w:t xml:space="preserve"> </w:t>
+      </w:r>
+      <w:r>
+        <w:rPr>
+          <w:rFonts w:ascii="Times New Roman" w:eastAsia="Times New Roman" w:hAnsi="Times New Roman" w:cs="Times New Roman"/>
+          <w:sz w:val="24"/>
+          <w:szCs w:val="24"/>
+        </w:rPr>
+        <w:t xml:space="preserve">round goby </w:t>
+      </w:r>
+      <w:r>
+        <w:rPr>
+          <w:rFonts w:ascii="Times New Roman" w:eastAsia="Times New Roman" w:hAnsi="Times New Roman" w:cs="Times New Roman"/>
+          <w:sz w:val="24"/>
+          <w:szCs w:val="24"/>
+        </w:rPr>
+        <w:t>(</w:t>
+      </w:r>
       <w:r>
         <w:rPr>
           <w:rFonts w:ascii="Times New Roman" w:eastAsia="Times New Roman" w:hAnsi="Times New Roman" w:cs="Times New Roman"/>
@@ -7910,9 +7710,32 @@
           <w:sz w:val="24"/>
           <w:szCs w:val="24"/>
         </w:rPr>
-        <w:t xml:space="preserve"> </w:t>
-      </w:r>
-      <w:proofErr w:type="spellStart"/>
+        <w:t>Neogobius melanostomus</w:t>
+      </w:r>
+      <w:r>
+        <w:rPr>
+          <w:rFonts w:ascii="Times New Roman" w:eastAsia="Times New Roman" w:hAnsi="Times New Roman" w:cs="Times New Roman"/>
+          <w:sz w:val="24"/>
+          <w:szCs w:val="24"/>
+        </w:rPr>
+        <w:t>)</w:t>
+      </w:r>
+      <w:r>
+        <w:rPr>
+          <w:rFonts w:ascii="Times New Roman" w:eastAsia="Times New Roman" w:hAnsi="Times New Roman" w:cs="Times New Roman"/>
+          <w:sz w:val="24"/>
+          <w:szCs w:val="24"/>
+        </w:rPr>
+        <w:t xml:space="preserve">, </w:t>
+      </w:r>
+      <w:r>
+        <w:rPr>
+          <w:rFonts w:ascii="Times New Roman" w:eastAsia="Times New Roman" w:hAnsi="Times New Roman" w:cs="Times New Roman"/>
+          <w:sz w:val="24"/>
+          <w:szCs w:val="24"/>
+        </w:rPr>
+        <w:t>(</w:t>
+      </w:r>
       <w:r>
         <w:rPr>
           <w:rFonts w:ascii="Times New Roman" w:eastAsia="Times New Roman" w:hAnsi="Times New Roman" w:cs="Times New Roman"/>
@@ -7921,146 +7744,32 @@
           <w:sz w:val="24"/>
           <w:szCs w:val="24"/>
         </w:rPr>
-        <w:t>antipodarum</w:t>
-      </w:r>
-      <w:proofErr w:type="spellEnd"/>
-      <w:r>
-        <w:rPr>
-          <w:rFonts w:ascii="Times New Roman" w:eastAsia="Times New Roman" w:hAnsi="Times New Roman" w:cs="Times New Roman"/>
-          <w:sz w:val="24"/>
-          <w:szCs w:val="24"/>
-        </w:rPr>
-        <w:t xml:space="preserve">) was </w:t>
-      </w:r>
-      <w:r>
-        <w:rPr>
-          <w:rFonts w:ascii="Times New Roman" w:eastAsia="Times New Roman" w:hAnsi="Times New Roman" w:cs="Times New Roman"/>
-          <w:sz w:val="24"/>
-          <w:szCs w:val="24"/>
-        </w:rPr>
-        <w:t xml:space="preserve">the </w:t>
-      </w:r>
-      <w:r>
-        <w:rPr>
-          <w:rFonts w:ascii="Times New Roman" w:eastAsia="Times New Roman" w:hAnsi="Times New Roman" w:cs="Times New Roman"/>
-          <w:sz w:val="24"/>
-          <w:szCs w:val="24"/>
-        </w:rPr>
-        <w:t>species</w:t>
-      </w:r>
-      <w:r>
-        <w:rPr>
-          <w:rFonts w:ascii="Times New Roman" w:eastAsia="Times New Roman" w:hAnsi="Times New Roman" w:cs="Times New Roman"/>
-          <w:sz w:val="24"/>
-          <w:szCs w:val="24"/>
-        </w:rPr>
-        <w:t xml:space="preserve"> that had the most documented boom-busts</w:t>
-      </w:r>
-      <w:r>
-        <w:rPr>
-          <w:rFonts w:ascii="Times New Roman" w:eastAsia="Times New Roman" w:hAnsi="Times New Roman" w:cs="Times New Roman"/>
-          <w:sz w:val="24"/>
-          <w:szCs w:val="24"/>
-        </w:rPr>
-        <w:t xml:space="preserve"> (Fig. 3B).</w:t>
-      </w:r>
-      <w:r>
-        <w:rPr>
-          <w:rFonts w:ascii="Times New Roman" w:eastAsia="Times New Roman" w:hAnsi="Times New Roman" w:cs="Times New Roman"/>
-          <w:sz w:val="24"/>
-          <w:szCs w:val="24"/>
-        </w:rPr>
-        <w:t xml:space="preserve"> </w:t>
-      </w:r>
-      <w:r>
-        <w:rPr>
-          <w:rFonts w:ascii="Times New Roman" w:eastAsia="Times New Roman" w:hAnsi="Times New Roman" w:cs="Times New Roman"/>
-          <w:sz w:val="24"/>
-          <w:szCs w:val="24"/>
-        </w:rPr>
-        <w:t>O</w:t>
-      </w:r>
-      <w:r>
-        <w:rPr>
-          <w:rFonts w:ascii="Times New Roman" w:eastAsia="Times New Roman" w:hAnsi="Times New Roman" w:cs="Times New Roman"/>
-          <w:sz w:val="24"/>
-          <w:szCs w:val="24"/>
-        </w:rPr>
-        <w:t xml:space="preserve">ther </w:t>
-      </w:r>
-      <w:r>
-        <w:rPr>
-          <w:rFonts w:ascii="Times New Roman" w:eastAsia="Times New Roman" w:hAnsi="Times New Roman" w:cs="Times New Roman"/>
-          <w:sz w:val="24"/>
-          <w:szCs w:val="24"/>
-        </w:rPr>
-        <w:t>species</w:t>
-      </w:r>
-      <w:r>
-        <w:rPr>
-          <w:rFonts w:ascii="Times New Roman" w:eastAsia="Times New Roman" w:hAnsi="Times New Roman" w:cs="Times New Roman"/>
-          <w:sz w:val="24"/>
-          <w:szCs w:val="24"/>
-        </w:rPr>
-        <w:t xml:space="preserve"> that </w:t>
-      </w:r>
-      <w:r>
-        <w:rPr>
-          <w:rFonts w:ascii="Times New Roman" w:eastAsia="Times New Roman" w:hAnsi="Times New Roman" w:cs="Times New Roman"/>
-          <w:sz w:val="24"/>
-          <w:szCs w:val="24"/>
-        </w:rPr>
-        <w:t xml:space="preserve">had multiple time series </w:t>
-      </w:r>
-      <w:r>
-        <w:rPr>
-          <w:rFonts w:ascii="Times New Roman" w:eastAsia="Times New Roman" w:hAnsi="Times New Roman" w:cs="Times New Roman"/>
-          <w:sz w:val="24"/>
-          <w:szCs w:val="24"/>
-        </w:rPr>
-        <w:t xml:space="preserve">with some evidence of a </w:t>
-      </w:r>
-      <w:r>
-        <w:rPr>
-          <w:rFonts w:ascii="Times New Roman" w:eastAsia="Times New Roman" w:hAnsi="Times New Roman" w:cs="Times New Roman"/>
-          <w:sz w:val="24"/>
-          <w:szCs w:val="24"/>
-        </w:rPr>
-        <w:t xml:space="preserve">boom-busts </w:t>
-      </w:r>
-      <w:r>
-        <w:rPr>
-          <w:rFonts w:ascii="Times New Roman" w:eastAsia="Times New Roman" w:hAnsi="Times New Roman" w:cs="Times New Roman"/>
-          <w:sz w:val="24"/>
-          <w:szCs w:val="24"/>
-        </w:rPr>
-        <w:t>were</w:t>
-      </w:r>
-      <w:r>
-        <w:rPr>
-          <w:rFonts w:ascii="Times New Roman" w:eastAsia="Times New Roman" w:hAnsi="Times New Roman" w:cs="Times New Roman"/>
-          <w:sz w:val="24"/>
-          <w:szCs w:val="24"/>
-        </w:rPr>
-        <w:t xml:space="preserve"> </w:t>
-      </w:r>
-      <w:r>
-        <w:rPr>
-          <w:rFonts w:ascii="Times New Roman" w:eastAsia="Times New Roman" w:hAnsi="Times New Roman" w:cs="Times New Roman"/>
-          <w:sz w:val="24"/>
-          <w:szCs w:val="24"/>
-        </w:rPr>
-        <w:t xml:space="preserve">round goby </w:t>
-      </w:r>
-      <w:r>
-        <w:rPr>
-          <w:rFonts w:ascii="Times New Roman" w:eastAsia="Times New Roman" w:hAnsi="Times New Roman" w:cs="Times New Roman"/>
-          <w:sz w:val="24"/>
-          <w:szCs w:val="24"/>
-        </w:rPr>
-        <w:t>(</w:t>
-      </w:r>
-      <w:proofErr w:type="spellStart"/>
+        <w:t>Mnemiopsis leidyi</w:t>
+      </w:r>
+      <w:r>
+        <w:rPr>
+          <w:rFonts w:ascii="Times New Roman" w:eastAsia="Times New Roman" w:hAnsi="Times New Roman" w:cs="Times New Roman"/>
+          <w:sz w:val="24"/>
+          <w:szCs w:val="24"/>
+        </w:rPr>
+        <w:t>)</w:t>
+      </w:r>
+      <w:r>
+        <w:rPr>
+          <w:rFonts w:ascii="Times New Roman" w:eastAsia="Times New Roman" w:hAnsi="Times New Roman" w:cs="Times New Roman"/>
+          <w:sz w:val="24"/>
+          <w:szCs w:val="24"/>
+        </w:rPr>
+        <w:t xml:space="preserve">, </w:t>
+      </w:r>
+      <w:r>
+        <w:rPr>
+          <w:rFonts w:ascii="Times New Roman" w:eastAsia="Times New Roman" w:hAnsi="Times New Roman" w:cs="Times New Roman"/>
+          <w:sz w:val="24"/>
+          <w:szCs w:val="24"/>
+        </w:rPr>
+        <w:t>rusty crayfish (</w:t>
+      </w:r>
       <w:r>
         <w:rPr>
           <w:rFonts w:ascii="Times New Roman" w:eastAsia="Times New Roman" w:hAnsi="Times New Roman" w:cs="Times New Roman"/>
@@ -8069,9 +7778,56 @@
           <w:sz w:val="24"/>
           <w:szCs w:val="24"/>
         </w:rPr>
-        <w:t>Neogobius</w:t>
-      </w:r>
-      <w:proofErr w:type="spellEnd"/>
+        <w:t>Faxonius rusticus</w:t>
+      </w:r>
+      <w:r>
+        <w:rPr>
+          <w:rFonts w:ascii="Times New Roman" w:eastAsia="Times New Roman" w:hAnsi="Times New Roman" w:cs="Times New Roman"/>
+          <w:sz w:val="24"/>
+          <w:szCs w:val="24"/>
+        </w:rPr>
+        <w:t>)</w:t>
+      </w:r>
+      <w:r>
+        <w:rPr>
+          <w:rFonts w:ascii="Times New Roman" w:eastAsia="Times New Roman" w:hAnsi="Times New Roman" w:cs="Times New Roman"/>
+          <w:sz w:val="24"/>
+          <w:szCs w:val="24"/>
+        </w:rPr>
+        <w:t xml:space="preserve">, </w:t>
+      </w:r>
+      <w:r>
+        <w:rPr>
+          <w:rFonts w:ascii="Times New Roman" w:eastAsia="Times New Roman" w:hAnsi="Times New Roman" w:cs="Times New Roman"/>
+          <w:sz w:val="24"/>
+          <w:szCs w:val="24"/>
+        </w:rPr>
+        <w:t>m</w:t>
+      </w:r>
+      <w:r>
+        <w:rPr>
+          <w:rFonts w:ascii="Times New Roman" w:eastAsia="Times New Roman" w:hAnsi="Times New Roman" w:cs="Times New Roman"/>
+          <w:sz w:val="24"/>
+          <w:szCs w:val="24"/>
+        </w:rPr>
+        <w:t xml:space="preserve">ayan </w:t>
+      </w:r>
+      <w:r>
+        <w:rPr>
+          <w:rFonts w:ascii="Times New Roman" w:eastAsia="Times New Roman" w:hAnsi="Times New Roman" w:cs="Times New Roman"/>
+          <w:sz w:val="24"/>
+          <w:szCs w:val="24"/>
+        </w:rPr>
+        <w:t>c</w:t>
+      </w:r>
+      <w:r>
+        <w:rPr>
+          <w:rFonts w:ascii="Times New Roman" w:eastAsia="Times New Roman" w:hAnsi="Times New Roman" w:cs="Times New Roman"/>
+          <w:sz w:val="24"/>
+          <w:szCs w:val="24"/>
+        </w:rPr>
+        <w:t>ichlids (</w:t>
+      </w:r>
       <w:r>
         <w:rPr>
           <w:rFonts w:ascii="Times New Roman" w:eastAsia="Times New Roman" w:hAnsi="Times New Roman" w:cs="Times New Roman"/>
@@ -8080,9 +7836,48 @@
           <w:sz w:val="24"/>
           <w:szCs w:val="24"/>
         </w:rPr>
+        <w:t>Mayaheros urophthalmus</w:t>
+      </w:r>
+      <w:r>
+        <w:rPr>
+          <w:rFonts w:ascii="Times New Roman" w:eastAsia="Times New Roman" w:hAnsi="Times New Roman" w:cs="Times New Roman"/>
+          <w:sz w:val="24"/>
+          <w:szCs w:val="24"/>
+        </w:rPr>
+        <w:t>),</w:t>
+      </w:r>
+      <w:r>
+        <w:rPr>
+          <w:rFonts w:ascii="Times New Roman" w:eastAsia="Times New Roman" w:hAnsi="Times New Roman" w:cs="Times New Roman"/>
+          <w:sz w:val="24"/>
+          <w:szCs w:val="24"/>
+        </w:rPr>
         <w:t xml:space="preserve"> </w:t>
       </w:r>
-      <w:proofErr w:type="spellStart"/>
+      <w:r>
+        <w:rPr>
+          <w:rFonts w:ascii="Times New Roman" w:eastAsia="Times New Roman" w:hAnsi="Times New Roman" w:cs="Times New Roman"/>
+          <w:sz w:val="24"/>
+          <w:szCs w:val="24"/>
+        </w:rPr>
+        <w:t>caribou</w:t>
+      </w:r>
+      <w:r>
+        <w:rPr>
+          <w:rFonts w:ascii="Times New Roman" w:eastAsia="Times New Roman" w:hAnsi="Times New Roman" w:cs="Times New Roman"/>
+          <w:sz w:val="24"/>
+          <w:szCs w:val="24"/>
+        </w:rPr>
+        <w:t xml:space="preserve"> </w:t>
+      </w:r>
+      <w:r>
+        <w:rPr>
+          <w:rFonts w:ascii="Times New Roman" w:eastAsia="Times New Roman" w:hAnsi="Times New Roman" w:cs="Times New Roman"/>
+          <w:sz w:val="24"/>
+          <w:szCs w:val="24"/>
+        </w:rPr>
+        <w:t>(</w:t>
+      </w:r>
       <w:r>
         <w:rPr>
           <w:rFonts w:ascii="Times New Roman" w:eastAsia="Times New Roman" w:hAnsi="Times New Roman" w:cs="Times New Roman"/>
@@ -8091,34 +7886,8 @@
           <w:sz w:val="24"/>
           <w:szCs w:val="24"/>
         </w:rPr>
-        <w:t>melanostomus</w:t>
-      </w:r>
-      <w:proofErr w:type="spellEnd"/>
-      <w:r>
-        <w:rPr>
-          <w:rFonts w:ascii="Times New Roman" w:eastAsia="Times New Roman" w:hAnsi="Times New Roman" w:cs="Times New Roman"/>
-          <w:sz w:val="24"/>
-          <w:szCs w:val="24"/>
-        </w:rPr>
-        <w:t>)</w:t>
-      </w:r>
-      <w:r>
-        <w:rPr>
-          <w:rFonts w:ascii="Times New Roman" w:eastAsia="Times New Roman" w:hAnsi="Times New Roman" w:cs="Times New Roman"/>
-          <w:sz w:val="24"/>
-          <w:szCs w:val="24"/>
-        </w:rPr>
-        <w:t xml:space="preserve">, </w:t>
-      </w:r>
-      <w:r>
-        <w:rPr>
-          <w:rFonts w:ascii="Times New Roman" w:eastAsia="Times New Roman" w:hAnsi="Times New Roman" w:cs="Times New Roman"/>
-          <w:sz w:val="24"/>
-          <w:szCs w:val="24"/>
-        </w:rPr>
-        <w:t>(</w:t>
-      </w:r>
-      <w:proofErr w:type="spellStart"/>
+        <w:t>Ran</w:t>
+      </w:r>
       <w:r>
         <w:rPr>
           <w:rFonts w:ascii="Times New Roman" w:eastAsia="Times New Roman" w:hAnsi="Times New Roman" w:cs="Times New Roman"/>
@@ -8127,9 +7896,8 @@
           <w:sz w:val="24"/>
           <w:szCs w:val="24"/>
         </w:rPr>
-        <w:t>Mnemiopsis</w:t>
-      </w:r>
-      <w:proofErr w:type="spellEnd"/>
+        <w:t>g</w:t>
+      </w:r>
       <w:r>
         <w:rPr>
           <w:rFonts w:ascii="Times New Roman" w:eastAsia="Times New Roman" w:hAnsi="Times New Roman" w:cs="Times New Roman"/>
@@ -8138,9 +7906,8 @@
           <w:sz w:val="24"/>
           <w:szCs w:val="24"/>
         </w:rPr>
-        <w:t xml:space="preserve"> </w:t>
-      </w:r>
-      <w:proofErr w:type="spellStart"/>
+        <w:t xml:space="preserve">ifer </w:t>
+      </w:r>
       <w:r>
         <w:rPr>
           <w:rFonts w:ascii="Times New Roman" w:eastAsia="Times New Roman" w:hAnsi="Times New Roman" w:cs="Times New Roman"/>
@@ -8149,34 +7916,8 @@
           <w:sz w:val="24"/>
           <w:szCs w:val="24"/>
         </w:rPr>
-        <w:t>leidyi</w:t>
-      </w:r>
-      <w:proofErr w:type="spellEnd"/>
-      <w:r>
-        <w:rPr>
-          <w:rFonts w:ascii="Times New Roman" w:eastAsia="Times New Roman" w:hAnsi="Times New Roman" w:cs="Times New Roman"/>
-          <w:sz w:val="24"/>
-          <w:szCs w:val="24"/>
-        </w:rPr>
-        <w:t>)</w:t>
-      </w:r>
-      <w:r>
-        <w:rPr>
-          <w:rFonts w:ascii="Times New Roman" w:eastAsia="Times New Roman" w:hAnsi="Times New Roman" w:cs="Times New Roman"/>
-          <w:sz w:val="24"/>
-          <w:szCs w:val="24"/>
-        </w:rPr>
-        <w:t xml:space="preserve">, </w:t>
-      </w:r>
-      <w:r>
-        <w:rPr>
-          <w:rFonts w:ascii="Times New Roman" w:eastAsia="Times New Roman" w:hAnsi="Times New Roman" w:cs="Times New Roman"/>
-          <w:sz w:val="24"/>
-          <w:szCs w:val="24"/>
-        </w:rPr>
-        <w:t>rusty crayfish (</w:t>
-      </w:r>
-      <w:proofErr w:type="spellStart"/>
+        <w:t>t</w:t>
+      </w:r>
       <w:r>
         <w:rPr>
           <w:rFonts w:ascii="Times New Roman" w:eastAsia="Times New Roman" w:hAnsi="Times New Roman" w:cs="Times New Roman"/>
@@ -8185,9 +7926,40 @@
           <w:sz w:val="24"/>
           <w:szCs w:val="24"/>
         </w:rPr>
-        <w:t>Faxonius</w:t>
-      </w:r>
-      <w:proofErr w:type="spellEnd"/>
+        <w:t>arandus</w:t>
+      </w:r>
+      <w:r>
+        <w:rPr>
+          <w:rFonts w:ascii="Times New Roman" w:eastAsia="Times New Roman" w:hAnsi="Times New Roman" w:cs="Times New Roman"/>
+          <w:sz w:val="24"/>
+          <w:szCs w:val="24"/>
+        </w:rPr>
+        <w:t>)</w:t>
+      </w:r>
+      <w:r>
+        <w:rPr>
+          <w:rFonts w:ascii="Times New Roman" w:eastAsia="Times New Roman" w:hAnsi="Times New Roman" w:cs="Times New Roman"/>
+          <w:sz w:val="24"/>
+          <w:szCs w:val="24"/>
+        </w:rPr>
+        <w:t xml:space="preserve">, </w:t>
+      </w:r>
+      <w:r>
+        <w:rPr>
+          <w:rFonts w:ascii="Times New Roman" w:eastAsia="Times New Roman" w:hAnsi="Times New Roman" w:cs="Times New Roman"/>
+          <w:sz w:val="24"/>
+          <w:szCs w:val="24"/>
+        </w:rPr>
+        <w:t xml:space="preserve">signal crayfish </w:t>
+      </w:r>
+      <w:r>
+        <w:rPr>
+          <w:rFonts w:ascii="Times New Roman" w:eastAsia="Times New Roman" w:hAnsi="Times New Roman" w:cs="Times New Roman"/>
+          <w:sz w:val="24"/>
+          <w:szCs w:val="24"/>
+        </w:rPr>
+        <w:t>(</w:t>
+      </w:r>
       <w:r>
         <w:rPr>
           <w:rFonts w:ascii="Times New Roman" w:eastAsia="Times New Roman" w:hAnsi="Times New Roman" w:cs="Times New Roman"/>
@@ -8195,10 +7967,42 @@
           <w:iCs/>
           <w:sz w:val="24"/>
           <w:szCs w:val="24"/>
-        </w:rPr>
-        <w:t xml:space="preserve"> </w:t>
-      </w:r>
-      <w:proofErr w:type="spellStart"/>
+          <w:lang w:val="en-US"/>
+        </w:rPr>
+        <w:t>Pacifastacus leniusculus</w:t>
+      </w:r>
+      <w:r>
+        <w:rPr>
+          <w:rFonts w:ascii="Times New Roman" w:eastAsia="Times New Roman" w:hAnsi="Times New Roman" w:cs="Times New Roman"/>
+          <w:sz w:val="24"/>
+          <w:szCs w:val="24"/>
+        </w:rPr>
+        <w:t>)</w:t>
+      </w:r>
+      <w:r>
+        <w:rPr>
+          <w:rFonts w:ascii="Times New Roman" w:eastAsia="Times New Roman" w:hAnsi="Times New Roman" w:cs="Times New Roman"/>
+          <w:sz w:val="24"/>
+          <w:szCs w:val="24"/>
+        </w:rPr>
+        <w:t xml:space="preserve">, </w:t>
+      </w:r>
+      <w:r>
+        <w:rPr>
+          <w:rFonts w:ascii="Times New Roman" w:eastAsia="Times New Roman" w:hAnsi="Times New Roman" w:cs="Times New Roman"/>
+          <w:sz w:val="24"/>
+          <w:szCs w:val="24"/>
+        </w:rPr>
+        <w:t xml:space="preserve">rainbow smelt </w:t>
+      </w:r>
+      <w:r>
+        <w:rPr>
+          <w:rFonts w:ascii="Times New Roman" w:eastAsia="Times New Roman" w:hAnsi="Times New Roman" w:cs="Times New Roman"/>
+          <w:sz w:val="24"/>
+          <w:szCs w:val="24"/>
+        </w:rPr>
+        <w:t>(</w:t>
+      </w:r>
       <w:r>
         <w:rPr>
           <w:rFonts w:ascii="Times New Roman" w:eastAsia="Times New Roman" w:hAnsi="Times New Roman" w:cs="Times New Roman"/>
@@ -8207,68 +8011,8 @@
           <w:sz w:val="24"/>
           <w:szCs w:val="24"/>
         </w:rPr>
-        <w:t>rusticus</w:t>
-      </w:r>
-      <w:proofErr w:type="spellEnd"/>
-      <w:r>
-        <w:rPr>
-          <w:rFonts w:ascii="Times New Roman" w:eastAsia="Times New Roman" w:hAnsi="Times New Roman" w:cs="Times New Roman"/>
-          <w:sz w:val="24"/>
-          <w:szCs w:val="24"/>
-        </w:rPr>
-        <w:t>)</w:t>
-      </w:r>
-      <w:r>
-        <w:rPr>
-          <w:rFonts w:ascii="Times New Roman" w:eastAsia="Times New Roman" w:hAnsi="Times New Roman" w:cs="Times New Roman"/>
-          <w:sz w:val="24"/>
-          <w:szCs w:val="24"/>
-        </w:rPr>
-        <w:t xml:space="preserve">, </w:t>
-      </w:r>
-      <w:proofErr w:type="spellStart"/>
-      <w:r>
-        <w:rPr>
-          <w:rFonts w:ascii="Times New Roman" w:eastAsia="Times New Roman" w:hAnsi="Times New Roman" w:cs="Times New Roman"/>
-          <w:sz w:val="24"/>
-          <w:szCs w:val="24"/>
-        </w:rPr>
-        <w:t>m</w:t>
-      </w:r>
-      <w:r>
-        <w:rPr>
-          <w:rFonts w:ascii="Times New Roman" w:eastAsia="Times New Roman" w:hAnsi="Times New Roman" w:cs="Times New Roman"/>
-          <w:sz w:val="24"/>
-          <w:szCs w:val="24"/>
-        </w:rPr>
-        <w:t>ayan</w:t>
-      </w:r>
-      <w:proofErr w:type="spellEnd"/>
-      <w:r>
-        <w:rPr>
-          <w:rFonts w:ascii="Times New Roman" w:eastAsia="Times New Roman" w:hAnsi="Times New Roman" w:cs="Times New Roman"/>
-          <w:sz w:val="24"/>
-          <w:szCs w:val="24"/>
-        </w:rPr>
-        <w:t xml:space="preserve"> </w:t>
-      </w:r>
-      <w:r>
-        <w:rPr>
-          <w:rFonts w:ascii="Times New Roman" w:eastAsia="Times New Roman" w:hAnsi="Times New Roman" w:cs="Times New Roman"/>
-          <w:sz w:val="24"/>
-          <w:szCs w:val="24"/>
-        </w:rPr>
-        <w:t>c</w:t>
-      </w:r>
-      <w:r>
-        <w:rPr>
-          <w:rFonts w:ascii="Times New Roman" w:eastAsia="Times New Roman" w:hAnsi="Times New Roman" w:cs="Times New Roman"/>
-          <w:sz w:val="24"/>
-          <w:szCs w:val="24"/>
-        </w:rPr>
-        <w:t>ichlids (</w:t>
-      </w:r>
-      <w:proofErr w:type="spellStart"/>
+        <w:t>Omerus mordax</w:t>
+      </w:r>
       <w:r>
         <w:rPr>
           <w:rFonts w:ascii="Times New Roman" w:eastAsia="Times New Roman" w:hAnsi="Times New Roman" w:cs="Times New Roman"/>
@@ -8277,9 +8021,8 @@
           <w:sz w:val="24"/>
           <w:szCs w:val="24"/>
         </w:rPr>
-        <w:t>Mayaheros</w:t>
-      </w:r>
-      <w:proofErr w:type="spellEnd"/>
+        <w:t>)</w:t>
+      </w:r>
       <w:r>
         <w:rPr>
           <w:rFonts w:ascii="Times New Roman" w:eastAsia="Times New Roman" w:hAnsi="Times New Roman" w:cs="Times New Roman"/>
@@ -8288,9 +8031,88 @@
           <w:sz w:val="24"/>
           <w:szCs w:val="24"/>
         </w:rPr>
+        <w:t>,</w:t>
+      </w:r>
+      <w:r>
+        <w:rPr>
+          <w:rFonts w:ascii="Times New Roman" w:eastAsia="Times New Roman" w:hAnsi="Times New Roman" w:cs="Times New Roman"/>
+          <w:sz w:val="24"/>
+          <w:szCs w:val="24"/>
+        </w:rPr>
         <w:t xml:space="preserve"> </w:t>
       </w:r>
-      <w:proofErr w:type="spellStart"/>
+      <w:r>
+        <w:rPr>
+          <w:rFonts w:ascii="Times New Roman" w:eastAsia="Times New Roman" w:hAnsi="Times New Roman" w:cs="Times New Roman"/>
+          <w:sz w:val="24"/>
+          <w:szCs w:val="24"/>
+        </w:rPr>
+        <w:t xml:space="preserve">nutmeg mannikin </w:t>
+      </w:r>
+      <w:r>
+        <w:rPr>
+          <w:rFonts w:ascii="Times New Roman" w:eastAsia="Times New Roman" w:hAnsi="Times New Roman" w:cs="Times New Roman"/>
+          <w:sz w:val="24"/>
+          <w:szCs w:val="24"/>
+        </w:rPr>
+        <w:t>(</w:t>
+      </w:r>
+      <w:r>
+        <w:rPr>
+          <w:rFonts w:ascii="Times New Roman" w:eastAsia="Times New Roman" w:hAnsi="Times New Roman" w:cs="Times New Roman"/>
+          <w:sz w:val="24"/>
+          <w:szCs w:val="24"/>
+        </w:rPr>
+        <w:t>Lonchura puctulata</w:t>
+      </w:r>
+      <w:r>
+        <w:rPr>
+          <w:rFonts w:ascii="Times New Roman" w:eastAsia="Times New Roman" w:hAnsi="Times New Roman" w:cs="Times New Roman"/>
+          <w:sz w:val="24"/>
+          <w:szCs w:val="24"/>
+        </w:rPr>
+        <w:t>)</w:t>
+      </w:r>
+      <w:r>
+        <w:rPr>
+          <w:rFonts w:ascii="Times New Roman" w:eastAsia="Times New Roman" w:hAnsi="Times New Roman" w:cs="Times New Roman"/>
+          <w:sz w:val="24"/>
+          <w:szCs w:val="24"/>
+        </w:rPr>
+        <w:t xml:space="preserve">, </w:t>
+      </w:r>
+      <w:r>
+        <w:rPr>
+          <w:rFonts w:ascii="Times New Roman" w:eastAsia="Times New Roman" w:hAnsi="Times New Roman" w:cs="Times New Roman"/>
+          <w:sz w:val="24"/>
+          <w:szCs w:val="24"/>
+        </w:rPr>
+        <w:t>a</w:t>
+      </w:r>
+      <w:r>
+        <w:rPr>
+          <w:rFonts w:ascii="Times New Roman" w:eastAsia="Times New Roman" w:hAnsi="Times New Roman" w:cs="Times New Roman"/>
+          <w:sz w:val="24"/>
+          <w:szCs w:val="24"/>
+        </w:rPr>
+        <w:t xml:space="preserve">frican </w:t>
+      </w:r>
+      <w:r>
+        <w:rPr>
+          <w:rFonts w:ascii="Times New Roman" w:eastAsia="Times New Roman" w:hAnsi="Times New Roman" w:cs="Times New Roman"/>
+          <w:sz w:val="24"/>
+          <w:szCs w:val="24"/>
+        </w:rPr>
+        <w:t>j</w:t>
+      </w:r>
+      <w:r>
+        <w:rPr>
+          <w:rFonts w:ascii="Times New Roman" w:eastAsia="Times New Roman" w:hAnsi="Times New Roman" w:cs="Times New Roman"/>
+          <w:sz w:val="24"/>
+          <w:szCs w:val="24"/>
+        </w:rPr>
+        <w:t>ewelfish (</w:t>
+      </w:r>
       <w:r>
         <w:rPr>
           <w:rFonts w:ascii="Times New Roman" w:eastAsia="Times New Roman" w:hAnsi="Times New Roman" w:cs="Times New Roman"/>
@@ -8299,40 +8121,23 @@
           <w:sz w:val="24"/>
           <w:szCs w:val="24"/>
         </w:rPr>
-        <w:t>urophthalmus</w:t>
-      </w:r>
-      <w:proofErr w:type="spellEnd"/>
-      <w:r>
-        <w:rPr>
-          <w:rFonts w:ascii="Times New Roman" w:eastAsia="Times New Roman" w:hAnsi="Times New Roman" w:cs="Times New Roman"/>
-          <w:sz w:val="24"/>
-          <w:szCs w:val="24"/>
-        </w:rPr>
-        <w:t>),</w:t>
-      </w:r>
-      <w:r>
-        <w:rPr>
-          <w:rFonts w:ascii="Times New Roman" w:eastAsia="Times New Roman" w:hAnsi="Times New Roman" w:cs="Times New Roman"/>
-          <w:sz w:val="24"/>
-          <w:szCs w:val="24"/>
-        </w:rPr>
-        <w:t xml:space="preserve"> </w:t>
-      </w:r>
-      <w:r>
-        <w:rPr>
-          <w:rFonts w:ascii="Times New Roman" w:eastAsia="Times New Roman" w:hAnsi="Times New Roman" w:cs="Times New Roman"/>
-          <w:sz w:val="24"/>
-          <w:szCs w:val="24"/>
-        </w:rPr>
-        <w:t>caribou</w:t>
-      </w:r>
-      <w:r>
-        <w:rPr>
-          <w:rFonts w:ascii="Times New Roman" w:eastAsia="Times New Roman" w:hAnsi="Times New Roman" w:cs="Times New Roman"/>
-          <w:sz w:val="24"/>
-          <w:szCs w:val="24"/>
-        </w:rPr>
-        <w:t xml:space="preserve"> </w:t>
+        <w:t>Hemichromis letoruneuxi</w:t>
+      </w:r>
+      <w:r>
+        <w:rPr>
+          <w:rFonts w:ascii="Times New Roman" w:eastAsia="Times New Roman" w:hAnsi="Times New Roman" w:cs="Times New Roman"/>
+          <w:sz w:val="24"/>
+          <w:szCs w:val="24"/>
+        </w:rPr>
+        <w:t xml:space="preserve">), </w:t>
+      </w:r>
+      <w:r>
+        <w:rPr>
+          <w:rFonts w:ascii="Times New Roman" w:eastAsia="Times New Roman" w:hAnsi="Times New Roman" w:cs="Times New Roman"/>
+          <w:sz w:val="24"/>
+          <w:szCs w:val="24"/>
+        </w:rPr>
+        <w:t xml:space="preserve">orange-cheeked waxbill </w:t>
       </w:r>
       <w:r>
         <w:rPr>
@@ -8350,7 +8155,39 @@
           <w:sz w:val="24"/>
           <w:szCs w:val="24"/>
         </w:rPr>
-        <w:t>Ran</w:t>
+        <w:t>Estrilda melpoda</w:t>
+      </w:r>
+      <w:r>
+        <w:rPr>
+          <w:rFonts w:ascii="Times New Roman" w:eastAsia="Times New Roman" w:hAnsi="Times New Roman" w:cs="Times New Roman"/>
+          <w:sz w:val="24"/>
+          <w:szCs w:val="24"/>
+        </w:rPr>
+        <w:t>)</w:t>
+      </w:r>
+      <w:r>
+        <w:rPr>
+          <w:rFonts w:ascii="Times New Roman" w:eastAsia="Times New Roman" w:hAnsi="Times New Roman" w:cs="Times New Roman"/>
+          <w:sz w:val="24"/>
+          <w:szCs w:val="24"/>
+        </w:rPr>
+        <w:t xml:space="preserve"> and </w:t>
+      </w:r>
+      <w:r>
+        <w:rPr>
+          <w:rFonts w:ascii="Times New Roman" w:eastAsia="Times New Roman" w:hAnsi="Times New Roman" w:cs="Times New Roman"/>
+          <w:sz w:val="24"/>
+          <w:szCs w:val="24"/>
+        </w:rPr>
+        <w:t xml:space="preserve">threadfin shad </w:t>
+      </w:r>
+      <w:r>
+        <w:rPr>
+          <w:rFonts w:ascii="Times New Roman" w:eastAsia="Times New Roman" w:hAnsi="Times New Roman" w:cs="Times New Roman"/>
+          <w:sz w:val="24"/>
+          <w:szCs w:val="24"/>
+        </w:rPr>
+        <w:t>(</w:t>
       </w:r>
       <w:r>
         <w:rPr>
@@ -8360,168 +8197,87 @@
           <w:sz w:val="24"/>
           <w:szCs w:val="24"/>
         </w:rPr>
-        <w:t>g</w:t>
-      </w:r>
-      <w:r>
-        <w:rPr>
-          <w:rFonts w:ascii="Times New Roman" w:eastAsia="Times New Roman" w:hAnsi="Times New Roman" w:cs="Times New Roman"/>
-          <w:i/>
-          <w:iCs/>
-          <w:sz w:val="24"/>
-          <w:szCs w:val="24"/>
-        </w:rPr>
-        <w:t xml:space="preserve">ifer </w:t>
-      </w:r>
-      <w:r>
-        <w:rPr>
-          <w:rFonts w:ascii="Times New Roman" w:eastAsia="Times New Roman" w:hAnsi="Times New Roman" w:cs="Times New Roman"/>
-          <w:i/>
-          <w:iCs/>
-          <w:sz w:val="24"/>
-          <w:szCs w:val="24"/>
-        </w:rPr>
-        <w:t>t</w:t>
-      </w:r>
-      <w:r>
-        <w:rPr>
-          <w:rFonts w:ascii="Times New Roman" w:eastAsia="Times New Roman" w:hAnsi="Times New Roman" w:cs="Times New Roman"/>
-          <w:i/>
-          <w:iCs/>
-          <w:sz w:val="24"/>
-          <w:szCs w:val="24"/>
-        </w:rPr>
-        <w:t>arandus</w:t>
-      </w:r>
-      <w:r>
-        <w:rPr>
-          <w:rFonts w:ascii="Times New Roman" w:eastAsia="Times New Roman" w:hAnsi="Times New Roman" w:cs="Times New Roman"/>
-          <w:sz w:val="24"/>
-          <w:szCs w:val="24"/>
-        </w:rPr>
-        <w:t>)</w:t>
-      </w:r>
-      <w:r>
-        <w:rPr>
-          <w:rFonts w:ascii="Times New Roman" w:eastAsia="Times New Roman" w:hAnsi="Times New Roman" w:cs="Times New Roman"/>
-          <w:sz w:val="24"/>
-          <w:szCs w:val="24"/>
-        </w:rPr>
-        <w:t xml:space="preserve">, </w:t>
-      </w:r>
-      <w:r>
-        <w:rPr>
-          <w:rFonts w:ascii="Times New Roman" w:eastAsia="Times New Roman" w:hAnsi="Times New Roman" w:cs="Times New Roman"/>
-          <w:sz w:val="24"/>
-          <w:szCs w:val="24"/>
-        </w:rPr>
-        <w:t xml:space="preserve">signal crayfish </w:t>
-      </w:r>
-      <w:r>
-        <w:rPr>
-          <w:rFonts w:ascii="Times New Roman" w:eastAsia="Times New Roman" w:hAnsi="Times New Roman" w:cs="Times New Roman"/>
-          <w:sz w:val="24"/>
-          <w:szCs w:val="24"/>
-        </w:rPr>
-        <w:t>(</w:t>
-      </w:r>
-      <w:proofErr w:type="spellStart"/>
-      <w:r>
-        <w:rPr>
-          <w:rFonts w:ascii="Times New Roman" w:eastAsia="Times New Roman" w:hAnsi="Times New Roman" w:cs="Times New Roman"/>
-          <w:i/>
-          <w:iCs/>
-          <w:sz w:val="24"/>
-          <w:szCs w:val="24"/>
-          <w:lang w:val="en-US"/>
-        </w:rPr>
-        <w:t>Pacifastacus</w:t>
-      </w:r>
-      <w:proofErr w:type="spellEnd"/>
-      <w:r>
-        <w:rPr>
-          <w:rFonts w:ascii="Times New Roman" w:eastAsia="Times New Roman" w:hAnsi="Times New Roman" w:cs="Times New Roman"/>
-          <w:i/>
-          <w:iCs/>
-          <w:sz w:val="24"/>
-          <w:szCs w:val="24"/>
-          <w:lang w:val="en-US"/>
+        <w:t>Dorosoma petenense</w:t>
+      </w:r>
+      <w:r>
+        <w:rPr>
+          <w:rFonts w:ascii="Times New Roman" w:eastAsia="Times New Roman" w:hAnsi="Times New Roman" w:cs="Times New Roman"/>
+          <w:sz w:val="24"/>
+          <w:szCs w:val="24"/>
+        </w:rPr>
+        <w:t>; Fig. 3B)</w:t>
+      </w:r>
+      <w:r>
+        <w:rPr>
+          <w:rFonts w:ascii="Times New Roman" w:eastAsia="Times New Roman" w:hAnsi="Times New Roman" w:cs="Times New Roman"/>
+          <w:sz w:val="24"/>
+          <w:szCs w:val="24"/>
+        </w:rPr>
+        <w:t>.</w:t>
+      </w:r>
+      <w:r>
+        <w:rPr>
+          <w:rFonts w:ascii="Times New Roman" w:eastAsia="Times New Roman" w:hAnsi="Times New Roman" w:cs="Times New Roman"/>
+          <w:sz w:val="24"/>
+          <w:szCs w:val="24"/>
+        </w:rPr>
+        <w:t xml:space="preserve">  </w:t>
+      </w:r>
+      <w:r>
+        <w:rPr>
+          <w:rFonts w:ascii="Times New Roman" w:eastAsia="Times New Roman" w:hAnsi="Times New Roman" w:cs="Times New Roman"/>
+          <w:sz w:val="24"/>
+          <w:szCs w:val="24"/>
+        </w:rPr>
+        <w:t>Most</w:t>
+      </w:r>
+      <w:r>
+        <w:rPr>
+          <w:rFonts w:ascii="Times New Roman" w:eastAsia="Times New Roman" w:hAnsi="Times New Roman" w:cs="Times New Roman"/>
+          <w:sz w:val="24"/>
+          <w:szCs w:val="24"/>
         </w:rPr>
         <w:t xml:space="preserve"> </w:t>
       </w:r>
-      <w:proofErr w:type="spellStart"/>
-      <w:r>
-        <w:rPr>
-          <w:rFonts w:ascii="Times New Roman" w:eastAsia="Times New Roman" w:hAnsi="Times New Roman" w:cs="Times New Roman"/>
-          <w:i/>
-          <w:iCs/>
-          <w:sz w:val="24"/>
-          <w:szCs w:val="24"/>
-          <w:lang w:val="en-US"/>
-        </w:rPr>
-        <w:t>leniusculus</w:t>
-      </w:r>
-      <w:proofErr w:type="spellEnd"/>
-      <w:r>
-        <w:rPr>
-          <w:rFonts w:ascii="Times New Roman" w:eastAsia="Times New Roman" w:hAnsi="Times New Roman" w:cs="Times New Roman"/>
-          <w:sz w:val="24"/>
-          <w:szCs w:val="24"/>
-        </w:rPr>
-        <w:t>)</w:t>
-      </w:r>
-      <w:r>
-        <w:rPr>
-          <w:rFonts w:ascii="Times New Roman" w:eastAsia="Times New Roman" w:hAnsi="Times New Roman" w:cs="Times New Roman"/>
-          <w:sz w:val="24"/>
-          <w:szCs w:val="24"/>
-        </w:rPr>
-        <w:t xml:space="preserve">, </w:t>
-      </w:r>
-      <w:r>
-        <w:rPr>
-          <w:rFonts w:ascii="Times New Roman" w:eastAsia="Times New Roman" w:hAnsi="Times New Roman" w:cs="Times New Roman"/>
-          <w:sz w:val="24"/>
-          <w:szCs w:val="24"/>
-        </w:rPr>
-        <w:t xml:space="preserve">rainbow smelt </w:t>
-      </w:r>
-      <w:r>
-        <w:rPr>
-          <w:rFonts w:ascii="Times New Roman" w:eastAsia="Times New Roman" w:hAnsi="Times New Roman" w:cs="Times New Roman"/>
-          <w:sz w:val="24"/>
-          <w:szCs w:val="24"/>
-        </w:rPr>
-        <w:t>(</w:t>
-      </w:r>
-      <w:r>
-        <w:rPr>
-          <w:rFonts w:ascii="Times New Roman" w:eastAsia="Times New Roman" w:hAnsi="Times New Roman" w:cs="Times New Roman"/>
-          <w:i/>
-          <w:iCs/>
-          <w:sz w:val="24"/>
-          <w:szCs w:val="24"/>
-        </w:rPr>
-        <w:t>Omerus mordax</w:t>
-      </w:r>
-      <w:r>
-        <w:rPr>
-          <w:rFonts w:ascii="Times New Roman" w:eastAsia="Times New Roman" w:hAnsi="Times New Roman" w:cs="Times New Roman"/>
-          <w:i/>
-          <w:iCs/>
-          <w:sz w:val="24"/>
-          <w:szCs w:val="24"/>
-        </w:rPr>
-        <w:t>)</w:t>
-      </w:r>
-      <w:r>
-        <w:rPr>
-          <w:rFonts w:ascii="Times New Roman" w:eastAsia="Times New Roman" w:hAnsi="Times New Roman" w:cs="Times New Roman"/>
-          <w:i/>
-          <w:iCs/>
-          <w:sz w:val="24"/>
-          <w:szCs w:val="24"/>
-        </w:rPr>
-        <w:t>,</w:t>
+      <w:r>
+        <w:rPr>
+          <w:rFonts w:ascii="Times New Roman" w:eastAsia="Times New Roman" w:hAnsi="Times New Roman" w:cs="Times New Roman"/>
+          <w:sz w:val="24"/>
+          <w:szCs w:val="24"/>
+        </w:rPr>
+        <w:t xml:space="preserve">time </w:t>
+      </w:r>
+      <w:r>
+        <w:rPr>
+          <w:rFonts w:ascii="Times New Roman" w:eastAsia="Times New Roman" w:hAnsi="Times New Roman" w:cs="Times New Roman"/>
+          <w:sz w:val="24"/>
+          <w:szCs w:val="24"/>
+        </w:rPr>
+        <w:t>series that had some evidence for boom-bust</w:t>
+      </w:r>
+      <w:r>
+        <w:rPr>
+          <w:rFonts w:ascii="Times New Roman" w:eastAsia="Times New Roman" w:hAnsi="Times New Roman" w:cs="Times New Roman"/>
+          <w:sz w:val="24"/>
+          <w:szCs w:val="24"/>
+        </w:rPr>
+        <w:t>s</w:t>
+      </w:r>
+      <w:r>
+        <w:rPr>
+          <w:rFonts w:ascii="Times New Roman" w:eastAsia="Times New Roman" w:hAnsi="Times New Roman" w:cs="Times New Roman"/>
+          <w:sz w:val="24"/>
+          <w:szCs w:val="24"/>
+        </w:rPr>
+        <w:t xml:space="preserve"> were from animals (Fig. 3C)</w:t>
+      </w:r>
+      <w:r>
+        <w:rPr>
+          <w:rFonts w:ascii="Times New Roman" w:eastAsia="Times New Roman" w:hAnsi="Times New Roman" w:cs="Times New Roman"/>
+          <w:sz w:val="24"/>
+          <w:szCs w:val="24"/>
+        </w:rPr>
+        <w:t xml:space="preserve">. </w:t>
       </w:r>
       <w:r>
         <w:rPr>
@@ -8537,354 +8293,6 @@
           <w:sz w:val="24"/>
           <w:szCs w:val="24"/>
         </w:rPr>
-        <w:t xml:space="preserve">nutmeg mannikin </w:t>
-      </w:r>
-      <w:r>
-        <w:rPr>
-          <w:rFonts w:ascii="Times New Roman" w:eastAsia="Times New Roman" w:hAnsi="Times New Roman" w:cs="Times New Roman"/>
-          <w:sz w:val="24"/>
-          <w:szCs w:val="24"/>
-        </w:rPr>
-        <w:t>(</w:t>
-      </w:r>
-      <w:proofErr w:type="spellStart"/>
-      <w:r>
-        <w:rPr>
-          <w:rFonts w:ascii="Times New Roman" w:eastAsia="Times New Roman" w:hAnsi="Times New Roman" w:cs="Times New Roman"/>
-          <w:sz w:val="24"/>
-          <w:szCs w:val="24"/>
-        </w:rPr>
-        <w:t>Lonchura</w:t>
-      </w:r>
-      <w:proofErr w:type="spellEnd"/>
-      <w:r>
-        <w:rPr>
-          <w:rFonts w:ascii="Times New Roman" w:eastAsia="Times New Roman" w:hAnsi="Times New Roman" w:cs="Times New Roman"/>
-          <w:sz w:val="24"/>
-          <w:szCs w:val="24"/>
-        </w:rPr>
-        <w:t xml:space="preserve"> </w:t>
-      </w:r>
-      <w:proofErr w:type="spellStart"/>
-      <w:r>
-        <w:rPr>
-          <w:rFonts w:ascii="Times New Roman" w:eastAsia="Times New Roman" w:hAnsi="Times New Roman" w:cs="Times New Roman"/>
-          <w:sz w:val="24"/>
-          <w:szCs w:val="24"/>
-        </w:rPr>
-        <w:t>puctulata</w:t>
-      </w:r>
-      <w:proofErr w:type="spellEnd"/>
-      <w:r>
-        <w:rPr>
-          <w:rFonts w:ascii="Times New Roman" w:eastAsia="Times New Roman" w:hAnsi="Times New Roman" w:cs="Times New Roman"/>
-          <w:sz w:val="24"/>
-          <w:szCs w:val="24"/>
-        </w:rPr>
-        <w:t>)</w:t>
-      </w:r>
-      <w:r>
-        <w:rPr>
-          <w:rFonts w:ascii="Times New Roman" w:eastAsia="Times New Roman" w:hAnsi="Times New Roman" w:cs="Times New Roman"/>
-          <w:sz w:val="24"/>
-          <w:szCs w:val="24"/>
-        </w:rPr>
-        <w:t xml:space="preserve">, </w:t>
-      </w:r>
-      <w:proofErr w:type="spellStart"/>
-      <w:r>
-        <w:rPr>
-          <w:rFonts w:ascii="Times New Roman" w:eastAsia="Times New Roman" w:hAnsi="Times New Roman" w:cs="Times New Roman"/>
-          <w:sz w:val="24"/>
-          <w:szCs w:val="24"/>
-        </w:rPr>
-        <w:t>a</w:t>
-      </w:r>
-      <w:r>
-        <w:rPr>
-          <w:rFonts w:ascii="Times New Roman" w:eastAsia="Times New Roman" w:hAnsi="Times New Roman" w:cs="Times New Roman"/>
-          <w:sz w:val="24"/>
-          <w:szCs w:val="24"/>
-        </w:rPr>
-        <w:t>frican</w:t>
-      </w:r>
-      <w:proofErr w:type="spellEnd"/>
-      <w:r>
-        <w:rPr>
-          <w:rFonts w:ascii="Times New Roman" w:eastAsia="Times New Roman" w:hAnsi="Times New Roman" w:cs="Times New Roman"/>
-          <w:sz w:val="24"/>
-          <w:szCs w:val="24"/>
-        </w:rPr>
-        <w:t xml:space="preserve"> </w:t>
-      </w:r>
-      <w:r>
-        <w:rPr>
-          <w:rFonts w:ascii="Times New Roman" w:eastAsia="Times New Roman" w:hAnsi="Times New Roman" w:cs="Times New Roman"/>
-          <w:sz w:val="24"/>
-          <w:szCs w:val="24"/>
-        </w:rPr>
-        <w:t>j</w:t>
-      </w:r>
-      <w:r>
-        <w:rPr>
-          <w:rFonts w:ascii="Times New Roman" w:eastAsia="Times New Roman" w:hAnsi="Times New Roman" w:cs="Times New Roman"/>
-          <w:sz w:val="24"/>
-          <w:szCs w:val="24"/>
-        </w:rPr>
-        <w:t>ewelfish (</w:t>
-      </w:r>
-      <w:proofErr w:type="spellStart"/>
-      <w:r>
-        <w:rPr>
-          <w:rFonts w:ascii="Times New Roman" w:eastAsia="Times New Roman" w:hAnsi="Times New Roman" w:cs="Times New Roman"/>
-          <w:i/>
-          <w:iCs/>
-          <w:sz w:val="24"/>
-          <w:szCs w:val="24"/>
-        </w:rPr>
-        <w:t>Hemichromis</w:t>
-      </w:r>
-      <w:proofErr w:type="spellEnd"/>
-      <w:r>
-        <w:rPr>
-          <w:rFonts w:ascii="Times New Roman" w:eastAsia="Times New Roman" w:hAnsi="Times New Roman" w:cs="Times New Roman"/>
-          <w:i/>
-          <w:iCs/>
-          <w:sz w:val="24"/>
-          <w:szCs w:val="24"/>
-        </w:rPr>
-        <w:t xml:space="preserve"> </w:t>
-      </w:r>
-      <w:proofErr w:type="spellStart"/>
-      <w:r>
-        <w:rPr>
-          <w:rFonts w:ascii="Times New Roman" w:eastAsia="Times New Roman" w:hAnsi="Times New Roman" w:cs="Times New Roman"/>
-          <w:i/>
-          <w:iCs/>
-          <w:sz w:val="24"/>
-          <w:szCs w:val="24"/>
-        </w:rPr>
-        <w:t>letoruneuxi</w:t>
-      </w:r>
-      <w:proofErr w:type="spellEnd"/>
-      <w:r>
-        <w:rPr>
-          <w:rFonts w:ascii="Times New Roman" w:eastAsia="Times New Roman" w:hAnsi="Times New Roman" w:cs="Times New Roman"/>
-          <w:sz w:val="24"/>
-          <w:szCs w:val="24"/>
-        </w:rPr>
-        <w:t xml:space="preserve">), </w:t>
-      </w:r>
-      <w:r>
-        <w:rPr>
-          <w:rFonts w:ascii="Times New Roman" w:eastAsia="Times New Roman" w:hAnsi="Times New Roman" w:cs="Times New Roman"/>
-          <w:sz w:val="24"/>
-          <w:szCs w:val="24"/>
-        </w:rPr>
-        <w:t xml:space="preserve">orange-cheeked waxbill </w:t>
-      </w:r>
-      <w:r>
-        <w:rPr>
-          <w:rFonts w:ascii="Times New Roman" w:eastAsia="Times New Roman" w:hAnsi="Times New Roman" w:cs="Times New Roman"/>
-          <w:sz w:val="24"/>
-          <w:szCs w:val="24"/>
-        </w:rPr>
-        <w:t>(</w:t>
-      </w:r>
-      <w:proofErr w:type="spellStart"/>
-      <w:r>
-        <w:rPr>
-          <w:rFonts w:ascii="Times New Roman" w:eastAsia="Times New Roman" w:hAnsi="Times New Roman" w:cs="Times New Roman"/>
-          <w:i/>
-          <w:iCs/>
-          <w:sz w:val="24"/>
-          <w:szCs w:val="24"/>
-        </w:rPr>
-        <w:t>Estrilda</w:t>
-      </w:r>
-      <w:proofErr w:type="spellEnd"/>
-      <w:r>
-        <w:rPr>
-          <w:rFonts w:ascii="Times New Roman" w:eastAsia="Times New Roman" w:hAnsi="Times New Roman" w:cs="Times New Roman"/>
-          <w:i/>
-          <w:iCs/>
-          <w:sz w:val="24"/>
-          <w:szCs w:val="24"/>
-        </w:rPr>
-        <w:t xml:space="preserve"> </w:t>
-      </w:r>
-      <w:proofErr w:type="spellStart"/>
-      <w:r>
-        <w:rPr>
-          <w:rFonts w:ascii="Times New Roman" w:eastAsia="Times New Roman" w:hAnsi="Times New Roman" w:cs="Times New Roman"/>
-          <w:i/>
-          <w:iCs/>
-          <w:sz w:val="24"/>
-          <w:szCs w:val="24"/>
-        </w:rPr>
-        <w:t>melpoda</w:t>
-      </w:r>
-      <w:proofErr w:type="spellEnd"/>
-      <w:r>
-        <w:rPr>
-          <w:rFonts w:ascii="Times New Roman" w:eastAsia="Times New Roman" w:hAnsi="Times New Roman" w:cs="Times New Roman"/>
-          <w:sz w:val="24"/>
-          <w:szCs w:val="24"/>
-        </w:rPr>
-        <w:t>)</w:t>
-      </w:r>
-      <w:r>
-        <w:rPr>
-          <w:rFonts w:ascii="Times New Roman" w:eastAsia="Times New Roman" w:hAnsi="Times New Roman" w:cs="Times New Roman"/>
-          <w:sz w:val="24"/>
-          <w:szCs w:val="24"/>
-        </w:rPr>
-        <w:t xml:space="preserve"> and </w:t>
-      </w:r>
-      <w:r>
-        <w:rPr>
-          <w:rFonts w:ascii="Times New Roman" w:eastAsia="Times New Roman" w:hAnsi="Times New Roman" w:cs="Times New Roman"/>
-          <w:sz w:val="24"/>
-          <w:szCs w:val="24"/>
-        </w:rPr>
-        <w:t xml:space="preserve">threadfin shad </w:t>
-      </w:r>
-      <w:r>
-        <w:rPr>
-          <w:rFonts w:ascii="Times New Roman" w:eastAsia="Times New Roman" w:hAnsi="Times New Roman" w:cs="Times New Roman"/>
-          <w:sz w:val="24"/>
-          <w:szCs w:val="24"/>
-        </w:rPr>
-        <w:t>(</w:t>
-      </w:r>
-      <w:proofErr w:type="spellStart"/>
-      <w:r>
-        <w:rPr>
-          <w:rFonts w:ascii="Times New Roman" w:eastAsia="Times New Roman" w:hAnsi="Times New Roman" w:cs="Times New Roman"/>
-          <w:i/>
-          <w:iCs/>
-          <w:sz w:val="24"/>
-          <w:szCs w:val="24"/>
-        </w:rPr>
-        <w:t>Dorosoma</w:t>
-      </w:r>
-      <w:proofErr w:type="spellEnd"/>
-      <w:r>
-        <w:rPr>
-          <w:rFonts w:ascii="Times New Roman" w:eastAsia="Times New Roman" w:hAnsi="Times New Roman" w:cs="Times New Roman"/>
-          <w:i/>
-          <w:iCs/>
-          <w:sz w:val="24"/>
-          <w:szCs w:val="24"/>
-        </w:rPr>
-        <w:t xml:space="preserve"> </w:t>
-      </w:r>
-      <w:proofErr w:type="spellStart"/>
-      <w:r>
-        <w:rPr>
-          <w:rFonts w:ascii="Times New Roman" w:eastAsia="Times New Roman" w:hAnsi="Times New Roman" w:cs="Times New Roman"/>
-          <w:i/>
-          <w:iCs/>
-          <w:sz w:val="24"/>
-          <w:szCs w:val="24"/>
-        </w:rPr>
-        <w:t>petenense</w:t>
-      </w:r>
-      <w:proofErr w:type="spellEnd"/>
-      <w:r>
-        <w:rPr>
-          <w:rFonts w:ascii="Times New Roman" w:eastAsia="Times New Roman" w:hAnsi="Times New Roman" w:cs="Times New Roman"/>
-          <w:sz w:val="24"/>
-          <w:szCs w:val="24"/>
-        </w:rPr>
-        <w:t>; Fig. 3B)</w:t>
-      </w:r>
-      <w:r>
-        <w:rPr>
-          <w:rFonts w:ascii="Times New Roman" w:eastAsia="Times New Roman" w:hAnsi="Times New Roman" w:cs="Times New Roman"/>
-          <w:sz w:val="24"/>
-          <w:szCs w:val="24"/>
-        </w:rPr>
-        <w:t>.</w:t>
-      </w:r>
-      <w:r>
-        <w:rPr>
-          <w:rFonts w:ascii="Times New Roman" w:eastAsia="Times New Roman" w:hAnsi="Times New Roman" w:cs="Times New Roman"/>
-          <w:sz w:val="24"/>
-          <w:szCs w:val="24"/>
-        </w:rPr>
-        <w:t xml:space="preserve">  </w:t>
-      </w:r>
-      <w:r>
-        <w:rPr>
-          <w:rFonts w:ascii="Times New Roman" w:eastAsia="Times New Roman" w:hAnsi="Times New Roman" w:cs="Times New Roman"/>
-          <w:sz w:val="24"/>
-          <w:szCs w:val="24"/>
-        </w:rPr>
-        <w:t>Most</w:t>
-      </w:r>
-      <w:r>
-        <w:rPr>
-          <w:rFonts w:ascii="Times New Roman" w:eastAsia="Times New Roman" w:hAnsi="Times New Roman" w:cs="Times New Roman"/>
-          <w:sz w:val="24"/>
-          <w:szCs w:val="24"/>
-        </w:rPr>
-        <w:t xml:space="preserve"> </w:t>
-      </w:r>
-      <w:r>
-        <w:rPr>
-          <w:rFonts w:ascii="Times New Roman" w:eastAsia="Times New Roman" w:hAnsi="Times New Roman" w:cs="Times New Roman"/>
-          <w:sz w:val="24"/>
-          <w:szCs w:val="24"/>
-        </w:rPr>
-        <w:t xml:space="preserve">time </w:t>
-      </w:r>
-      <w:r>
-        <w:rPr>
-          <w:rFonts w:ascii="Times New Roman" w:eastAsia="Times New Roman" w:hAnsi="Times New Roman" w:cs="Times New Roman"/>
-          <w:sz w:val="24"/>
-          <w:szCs w:val="24"/>
-        </w:rPr>
-        <w:t>series that had some evidence for boom-bust</w:t>
-      </w:r>
-      <w:r>
-        <w:rPr>
-          <w:rFonts w:ascii="Times New Roman" w:eastAsia="Times New Roman" w:hAnsi="Times New Roman" w:cs="Times New Roman"/>
-          <w:sz w:val="24"/>
-          <w:szCs w:val="24"/>
-        </w:rPr>
-        <w:t>s</w:t>
-      </w:r>
-      <w:r>
-        <w:rPr>
-          <w:rFonts w:ascii="Times New Roman" w:eastAsia="Times New Roman" w:hAnsi="Times New Roman" w:cs="Times New Roman"/>
-          <w:sz w:val="24"/>
-          <w:szCs w:val="24"/>
-        </w:rPr>
-        <w:t xml:space="preserve"> were from animals (Fig. 3C)</w:t>
-      </w:r>
-      <w:r>
-        <w:rPr>
-          <w:rFonts w:ascii="Times New Roman" w:eastAsia="Times New Roman" w:hAnsi="Times New Roman" w:cs="Times New Roman"/>
-          <w:sz w:val="24"/>
-          <w:szCs w:val="24"/>
-        </w:rPr>
-        <w:t xml:space="preserve">. </w:t>
-      </w:r>
-      <w:r>
-        <w:rPr>
-          <w:rFonts w:ascii="Times New Roman" w:eastAsia="Times New Roman" w:hAnsi="Times New Roman" w:cs="Times New Roman"/>
-          <w:sz w:val="24"/>
-          <w:szCs w:val="24"/>
-        </w:rPr>
-        <w:t xml:space="preserve"> </w:t>
-      </w:r>
-      <w:r>
-        <w:rPr>
-          <w:rFonts w:ascii="Times New Roman" w:eastAsia="Times New Roman" w:hAnsi="Times New Roman" w:cs="Times New Roman"/>
-          <w:sz w:val="24"/>
-          <w:szCs w:val="24"/>
-        </w:rPr>
         <w:t>S</w:t>
       </w:r>
       <w:r>
@@ -8893,25 +8301,7 @@
           <w:sz w:val="24"/>
           <w:szCs w:val="24"/>
         </w:rPr>
-        <w:t>nails (</w:t>
-      </w:r>
-      <w:proofErr w:type="spellStart"/>
-      <w:r>
-        <w:rPr>
-          <w:rFonts w:ascii="Times New Roman" w:eastAsia="Times New Roman" w:hAnsi="Times New Roman" w:cs="Times New Roman"/>
-          <w:sz w:val="24"/>
-          <w:szCs w:val="24"/>
-        </w:rPr>
-        <w:t>Gasropoda</w:t>
-      </w:r>
-      <w:proofErr w:type="spellEnd"/>
-      <w:r>
-        <w:rPr>
-          <w:rFonts w:ascii="Times New Roman" w:eastAsia="Times New Roman" w:hAnsi="Times New Roman" w:cs="Times New Roman"/>
-          <w:sz w:val="24"/>
-          <w:szCs w:val="24"/>
-        </w:rPr>
-        <w:t>), birds (Aves), and ray-finned fishes (Actinopterygii)</w:t>
+        <w:t>nails (Gasropoda), birds (Aves), and ray-finned fishes (Actinopterygii)</w:t>
       </w:r>
       <w:r>
         <w:rPr>
@@ -9557,25 +8947,7 @@
           <w:sz w:val="24"/>
           <w:szCs w:val="24"/>
         </w:rPr>
-        <w:t xml:space="preserve"> 2021). Then, in response to stochastic events of high abnormal rainfall, these small mammal populations irrupt to states of high abundances (</w:t>
-      </w:r>
-      <w:proofErr w:type="spellStart"/>
-      <w:r>
-        <w:rPr>
-          <w:rFonts w:ascii="Times New Roman" w:eastAsia="Times New Roman" w:hAnsi="Times New Roman" w:cs="Times New Roman"/>
-          <w:sz w:val="24"/>
-          <w:szCs w:val="24"/>
-        </w:rPr>
-        <w:t>Letnic</w:t>
-      </w:r>
-      <w:proofErr w:type="spellEnd"/>
-      <w:r>
-        <w:rPr>
-          <w:rFonts w:ascii="Times New Roman" w:eastAsia="Times New Roman" w:hAnsi="Times New Roman" w:cs="Times New Roman"/>
-          <w:sz w:val="24"/>
-          <w:szCs w:val="24"/>
-        </w:rPr>
-        <w:t xml:space="preserve"> &amp; Dickman 2006).  In reference to persistence (or sustained) low abundances and the rapid growth and declines exhibited in these dynamics (Andreassen </w:t>
+        <w:t xml:space="preserve"> 2021). Then, in response to stochastic events of high abnormal rainfall, these small mammal populations irrupt to states of high abundances (Letnic &amp; Dickman 2006).  In reference to persistence (or sustained) low abundances and the rapid growth and declines exhibited in these dynamics (Andreassen </w:t>
       </w:r>
       <w:r>
         <w:rPr>
@@ -9671,61 +9043,7 @@
           <w:szCs w:val="24"/>
         </w:rPr>
         <w:tab/>
-        <w:t xml:space="preserve">In contrast to irruptive population dynamics, I do not classify cyclic population dynamics in invasive species as repeated boom-bust cycles. Cyclic population dynamics undergo regular fluctuations of population size (Myers 2018). Although the rate of population </w:t>
-      </w:r>
-      <w:proofErr w:type="gramStart"/>
-      <w:r>
-        <w:rPr>
-          <w:rFonts w:ascii="Times New Roman" w:eastAsia="Times New Roman" w:hAnsi="Times New Roman" w:cs="Times New Roman"/>
-          <w:sz w:val="24"/>
-          <w:szCs w:val="24"/>
-        </w:rPr>
-        <w:t>increase</w:t>
-      </w:r>
-      <w:proofErr w:type="gramEnd"/>
-      <w:r>
-        <w:rPr>
-          <w:rFonts w:ascii="Times New Roman" w:eastAsia="Times New Roman" w:hAnsi="Times New Roman" w:cs="Times New Roman"/>
-          <w:sz w:val="24"/>
-          <w:szCs w:val="24"/>
-        </w:rPr>
-        <w:t xml:space="preserve"> and </w:t>
-      </w:r>
-      <w:proofErr w:type="gramStart"/>
-      <w:r>
-        <w:rPr>
-          <w:rFonts w:ascii="Times New Roman" w:eastAsia="Times New Roman" w:hAnsi="Times New Roman" w:cs="Times New Roman"/>
-          <w:sz w:val="24"/>
-          <w:szCs w:val="24"/>
-        </w:rPr>
-        <w:t>decline</w:t>
-      </w:r>
-      <w:proofErr w:type="gramEnd"/>
-      <w:r>
-        <w:rPr>
-          <w:rFonts w:ascii="Times New Roman" w:eastAsia="Times New Roman" w:hAnsi="Times New Roman" w:cs="Times New Roman"/>
-          <w:sz w:val="24"/>
-          <w:szCs w:val="24"/>
-        </w:rPr>
-        <w:t xml:space="preserve"> during the fluctuations in abundance might meet the criteria for boom-bust cycles, declines during fluctuations rarely are sustained and severe.  I interpret cyclic population dynamics in invasions as the natural variation in the established/boom phases of invasions (Figure 1). Fluctuations akin to cyclic dynamics have been reported in non-native populations during invasions (Strayer &amp; Malcom 2006; </w:t>
-      </w:r>
-      <w:proofErr w:type="spellStart"/>
-      <w:r>
-        <w:rPr>
-          <w:rFonts w:ascii="Times New Roman" w:eastAsia="Times New Roman" w:hAnsi="Times New Roman" w:cs="Times New Roman"/>
-          <w:sz w:val="24"/>
-          <w:szCs w:val="24"/>
-        </w:rPr>
-        <w:t>Kaeuffer</w:t>
-      </w:r>
-      <w:proofErr w:type="spellEnd"/>
-      <w:r>
-        <w:rPr>
-          <w:rFonts w:ascii="Times New Roman" w:eastAsia="Times New Roman" w:hAnsi="Times New Roman" w:cs="Times New Roman"/>
-          <w:sz w:val="24"/>
-          <w:szCs w:val="24"/>
-        </w:rPr>
-        <w:t xml:space="preserve"> </w:t>
+        <w:t xml:space="preserve">In contrast to irruptive population dynamics, I do not classify cyclic population dynamics in invasive species as repeated boom-bust cycles. Cyclic population dynamics undergo regular fluctuations of population size (Myers 2018). Although the rate of population increase and decline during the fluctuations in abundance might meet the criteria for boom-bust cycles, declines during fluctuations rarely are sustained and severe.  I interpret cyclic population dynamics in invasions as the natural variation in the established/boom phases of invasions (Figure 1). Fluctuations akin to cyclic dynamics have been reported in non-native populations during invasions (Strayer &amp; Malcom 2006; Kaeuffer </w:t>
       </w:r>
       <w:r>
         <w:rPr>
@@ -9918,25 +9236,7 @@
           <w:sz w:val="24"/>
           <w:szCs w:val="24"/>
         </w:rPr>
-        <w:t xml:space="preserve"> ≤ -0.99), severe (≥ 90%), and sustained (≥3 years; Figure 1). These criteria narrowed the definition of boom-bust cycles which potentially could help find mechanisms general to these phenomena. I also provide metrics that describe boom-</w:t>
-      </w:r>
-      <w:proofErr w:type="gramStart"/>
-      <w:r>
-        <w:rPr>
-          <w:rFonts w:ascii="Times New Roman" w:eastAsia="Gungsuh" w:hAnsi="Times New Roman" w:cs="Times New Roman"/>
-          <w:sz w:val="24"/>
-          <w:szCs w:val="24"/>
-        </w:rPr>
-        <w:t>busts</w:t>
-      </w:r>
-      <w:proofErr w:type="gramEnd"/>
-      <w:r>
-        <w:rPr>
-          <w:rFonts w:ascii="Times New Roman" w:eastAsia="Gungsuh" w:hAnsi="Times New Roman" w:cs="Times New Roman"/>
-          <w:sz w:val="24"/>
-          <w:szCs w:val="24"/>
-        </w:rPr>
-        <w:t xml:space="preserve"> cycles that could facilitate comparison across species and locations.  Using </w:t>
+        <w:t xml:space="preserve"> ≤ -0.99), severe (≥ 90%), and sustained (≥3 years; Figure 1). These criteria narrowed the definition of boom-bust cycles which potentially could help find mechanisms general to these phenomena. I also provide metrics that describe boom-busts cycles that could facilitate comparison across species and locations.  Using </w:t>
       </w:r>
       <w:r>
         <w:rPr>
@@ -11459,7 +10759,6 @@
           <w:pgSz w:w="12240" w:h="15840"/>
           <w:pgMar w:top="1440" w:right="1440" w:bottom="1440" w:left="1440" w:header="720" w:footer="720" w:gutter="0"/>
           <w:lnNumType w:countBy="1" w:restart="continuous"/>
-          <w:pgNumType w:start="1"/>
           <w:cols w:space="720"/>
           <w:docGrid w:linePitch="299"/>
         </w:sectPr>
@@ -11917,7 +11216,6 @@
           <w:pgSz w:w="12240" w:h="15840"/>
           <w:pgMar w:top="1440" w:right="1440" w:bottom="1440" w:left="1440" w:header="720" w:footer="720" w:gutter="0"/>
           <w:lnNumType w:countBy="1" w:restart="continuous"/>
-          <w:pgNumType w:start="1"/>
           <w:cols w:space="720"/>
           <w:docGrid w:linePitch="299"/>
         </w:sectPr>
@@ -11936,7 +11234,6 @@
           <w:pgSz w:w="12240" w:h="15840"/>
           <w:pgMar w:top="1440" w:right="1440" w:bottom="1440" w:left="1440" w:header="720" w:footer="720" w:gutter="0"/>
           <w:lnNumType w:countBy="1" w:restart="continuous"/>
-          <w:pgNumType w:start="1"/>
           <w:cols w:space="720"/>
           <w:docGrid w:linePitch="299"/>
         </w:sectPr>
@@ -12006,7 +11303,6 @@
           <w:pgSz w:w="12240" w:h="15840"/>
           <w:pgMar w:top="1440" w:right="1440" w:bottom="1440" w:left="1440" w:header="720" w:footer="720" w:gutter="0"/>
           <w:lnNumType w:countBy="1" w:restart="continuous"/>
-          <w:pgNumType w:start="1"/>
           <w:cols w:space="720"/>
           <w:docGrid w:linePitch="299"/>
         </w:sectPr>
@@ -12233,7 +11529,6 @@
           <w:pgSz w:w="12240" w:h="15840"/>
           <w:pgMar w:top="1440" w:right="1440" w:bottom="1440" w:left="1440" w:header="720" w:footer="720" w:gutter="0"/>
           <w:lnNumType w:countBy="1" w:restart="continuous"/>
-          <w:pgNumType w:start="1"/>
           <w:cols w:space="720"/>
           <w:docGrid w:linePitch="299"/>
         </w:sectPr>
@@ -15017,7 +14312,6 @@
       <w:pgSz w:w="12240" w:h="15840"/>
       <w:pgMar w:top="1440" w:right="1440" w:bottom="1440" w:left="1440" w:header="720" w:footer="720" w:gutter="0"/>
       <w:lnNumType w:countBy="1" w:restart="continuous"/>
-      <w:pgNumType w:start="1"/>
       <w:cols w:space="720"/>
       <w:docGrid w:linePitch="299"/>
     </w:sectPr>
@@ -15167,6 +14461,50 @@
 
 <file path=word/footer1.xml><?xml version="1.0" encoding="utf-8"?>
 <w:ftr xmlns:wpc="http://schemas.microsoft.com/office/word/2010/wordprocessingCanvas" xmlns:cx="http://schemas.microsoft.com/office/drawing/2014/chartex" xmlns:cx1="http://schemas.microsoft.com/office/drawing/2015/9/8/chartex" xmlns:cx2="http://schemas.microsoft.com/office/drawing/2015/10/21/chartex" xmlns:cx3="http://schemas.microsoft.com/office/drawing/2016/5/9/chartex" xmlns:cx4="http://schemas.microsoft.com/office/drawing/2016/5/10/chartex" xmlns:cx5="http://schemas.microsoft.com/office/drawing/2016/5/11/chartex" xmlns:cx6="http://schemas.microsoft.com/office/drawing/2016/5/12/chartex" xmlns:cx7="http://schemas.microsoft.com/office/drawing/2016/5/13/chartex" xmlns:cx8="http://schemas.microsoft.com/office/drawing/2016/5/14/chartex" xmlns:mc="http://schemas.openxmlformats.org/markup-compatibility/2006" xmlns:aink="http://schemas.microsoft.com/office/drawing/2016/ink" xmlns:am3d="http://schemas.microsoft.com/office/drawing/2017/model3d" xmlns:o="urn:schemas-microsoft-com:office:office" xmlns:oel="http://schemas.microsoft.com/office/2019/extlst" xmlns:r="http://schemas.openxmlformats.org/officeDocument/2006/relationships" xmlns:m="http://schemas.openxmlformats.org/officeDocument/2006/math" xmlns:v="urn:schemas-microsoft-com:vml" xmlns:wp14="http://schemas.microsoft.com/office/word/2010/wordprocessingDrawing" xmlns:wp="http://schemas.openxmlformats.org/drawingml/2006/wordprocessingDrawing" xmlns:w10="urn:schemas-microsoft-com:office:word" xmlns:w="http://schemas.openxmlformats.org/wordprocessingml/2006/main" xmlns:w14="http://schemas.microsoft.com/office/word/2010/wordml" xmlns:w15="http://schemas.microsoft.com/office/word/2012/wordml" xmlns:w16cex="http://schemas.microsoft.com/office/word/2018/wordml/cex" xmlns:w16cid="http://schemas.microsoft.com/office/word/2016/wordml/cid" xmlns:w16="http://schemas.microsoft.com/office/word/2018/wordml" xmlns:w16du="http://schemas.microsoft.com/office/word/2023/wordml/word16du" xmlns:w16sdtdh="http://schemas.microsoft.com/office/word/2020/wordml/sdtdatahash" xmlns:w16sdtfl="http://schemas.microsoft.com/office/word/2024/wordml/sdtformatlock" xmlns:w16se="http://schemas.microsoft.com/office/word/2015/wordml/symex" xmlns:wpg="http://schemas.microsoft.com/office/word/2010/wordprocessingGroup" xmlns:wpi="http://schemas.microsoft.com/office/word/2010/wordprocessingInk" xmlns:wne="http://schemas.microsoft.com/office/word/2006/wordml" xmlns:wps="http://schemas.microsoft.com/office/word/2010/wordprocessingShape" mc:Ignorable="w14 w15 w16se w16cid w16 w16cex w16sdtdh w16sdtfl w16du wp14">
+  <w:sdt>
+    <w:sdtPr>
+      <w:id w:val="5573853"/>
+      <w:docPartObj>
+        <w:docPartGallery w:val="Page Numbers (Bottom of Page)"/>
+        <w:docPartUnique/>
+      </w:docPartObj>
+    </w:sdtPr>
+    <w:sdtEndPr>
+      <w:rPr>
+        <w:noProof/>
+      </w:rPr>
+    </w:sdtEndPr>
+    <w:sdtContent>
+      <w:p>
+        <w:pPr>
+          <w:pStyle w:val="Footer"/>
+          <w:jc w:val="center"/>
+        </w:pPr>
+        <w:r>
+          <w:fldChar w:fldCharType="begin"/>
+        </w:r>
+        <w:r>
+          <w:instrText xml:space="preserve"> PAGE   \* MERGEFORMAT </w:instrText>
+        </w:r>
+        <w:r>
+          <w:fldChar w:fldCharType="separate"/>
+        </w:r>
+        <w:r>
+          <w:rPr>
+            <w:noProof/>
+          </w:rPr>
+          <w:t>2</w:t>
+        </w:r>
+        <w:r>
+          <w:rPr>
+            <w:noProof/>
+          </w:rPr>
+          <w:fldChar w:fldCharType="end"/>
+        </w:r>
+      </w:p>
+    </w:sdtContent>
+  </w:sdt>
+  <w:p/>
   <w:p/>
 </w:ftr>
 </file>
@@ -16138,6 +15476,50 @@
       <w:contextualSpacing/>
     </w:pPr>
   </w:style>
+  <w:style w:type="paragraph" w:styleId="Header">
+    <w:name w:val="header"/>
+    <w:basedOn w:val="Normal"/>
+    <w:link w:val="HeaderChar"/>
+    <w:uiPriority w:val="99"/>
+    <w:unhideWhenUsed/>
+    <w:rsid w:val="008B3316"/>
+    <w:pPr>
+      <w:tabs>
+        <w:tab w:val="center" w:pos="4680"/>
+        <w:tab w:val="right" w:pos="9360"/>
+      </w:tabs>
+      <w:spacing w:line="240" w:lineRule="auto"/>
+    </w:pPr>
+  </w:style>
+  <w:style w:type="character" w:customStyle="1" w:styleId="HeaderChar">
+    <w:name w:val="Header Char"/>
+    <w:basedOn w:val="DefaultParagraphFont"/>
+    <w:link w:val="Header"/>
+    <w:uiPriority w:val="99"/>
+    <w:rsid w:val="008B3316"/>
+  </w:style>
+  <w:style w:type="paragraph" w:styleId="Footer">
+    <w:name w:val="footer"/>
+    <w:basedOn w:val="Normal"/>
+    <w:link w:val="FooterChar"/>
+    <w:uiPriority w:val="99"/>
+    <w:unhideWhenUsed/>
+    <w:rsid w:val="008B3316"/>
+    <w:pPr>
+      <w:tabs>
+        <w:tab w:val="center" w:pos="4680"/>
+        <w:tab w:val="right" w:pos="9360"/>
+      </w:tabs>
+      <w:spacing w:line="240" w:lineRule="auto"/>
+    </w:pPr>
+  </w:style>
+  <w:style w:type="character" w:customStyle="1" w:styleId="FooterChar">
+    <w:name w:val="Footer Char"/>
+    <w:basedOn w:val="DefaultParagraphFont"/>
+    <w:link w:val="Footer"/>
+    <w:uiPriority w:val="99"/>
+    <w:rsid w:val="008B3316"/>
+  </w:style>
 </w:styles>
 </file>
 

</xml_diff>